<commit_message>
V 143 Progression System part 2
</commit_message>
<xml_diff>
--- a/chess setups.DOCX
+++ b/chess setups.DOCX
@@ -10368,23 +10368,12 @@
           <w:sz w:val="28"/>
           <w:szCs w:val="28"/>
         </w:rPr>
-        <w:t xml:space="preserve"> as </w:t>
-      </w:r>
-      <w:proofErr w:type="spellStart"/>
-      <w:r>
-        <w:rPr>
-          <w:rFonts w:eastAsiaTheme="majorEastAsia" w:cstheme="majorBidi"/>
-          <w:color w:val="0F4761" w:themeColor="accent1" w:themeShade="BF"/>
-          <w:sz w:val="28"/>
-          <w:szCs w:val="28"/>
-        </w:rPr>
-        <w:t>white</w:t>
-      </w:r>
-      <w:proofErr w:type="spellEnd"/>
+        <w:t xml:space="preserve"> as white</w:t>
+      </w:r>
     </w:p>
     <w:p>
       <w:r>
-        <w:t xml:space="preserve">               //inicializace hráčů</w:t>
+        <w:t xml:space="preserve">              //inicializace hráčů</w:t>
       </w:r>
       <w:r>
         <w:br/>
@@ -12771,7 +12760,7 @@
       </w:r>
       <w:proofErr w:type="spellEnd"/>
       <w:r>
-        <w:t xml:space="preserve"> .",0,3));</w:t>
+        <w:t xml:space="preserve"> .",1,0));</w:t>
       </w:r>
       <w:r>
         <w:br/>
@@ -12855,7 +12844,7 @@
       </w:r>
       <w:proofErr w:type="spellEnd"/>
       <w:r>
-        <w:t xml:space="preserve"> .",5,6));</w:t>
+        <w:t xml:space="preserve"> .",3,6));</w:t>
       </w:r>
       <w:r>
         <w:br/>
@@ -12955,7 +12944,7 @@
       </w:r>
       <w:proofErr w:type="spellEnd"/>
       <w:r>
-        <w:t xml:space="preserve"> fire",3,4));</w:t>
+        <w:t xml:space="preserve"> fire",4,0));</w:t>
       </w:r>
       <w:r>
         <w:br/>
@@ -13079,7 +13068,7 @@
       </w:r>
       <w:proofErr w:type="spellEnd"/>
       <w:r>
-        <w:t xml:space="preserve"> .",6,6));</w:t>
+        <w:t xml:space="preserve"> .",9,1));</w:t>
       </w:r>
       <w:r>
         <w:br/>
@@ -13180,7 +13169,7 @@
       </w:r>
       <w:proofErr w:type="spellEnd"/>
       <w:r>
-        <w:t xml:space="preserve"> .",9,3));</w:t>
+        <w:t xml:space="preserve"> .",9,2));</w:t>
       </w:r>
       <w:r>
         <w:br/>
@@ -13238,7 +13227,7 @@
       </w:r>
       <w:proofErr w:type="spellEnd"/>
       <w:r>
-        <w:t xml:space="preserve"> King("w king", 2, 4, </w:t>
+        <w:t xml:space="preserve"> King("w king", 6, 6, </w:t>
       </w:r>
       <w:proofErr w:type="spellStart"/>
       <w:r>
@@ -13254,25 +13243,6 @@
       <w:proofErr w:type="spellEnd"/>
       <w:r>
         <w:t>, 0));</w:t>
-      </w:r>
-      <w:r>
-        <w:br/>
-        <w:t>//konec inicializace šachovnice</w:t>
-      </w:r>
-      <w:r>
-        <w:br/>
-      </w:r>
-      <w:r>
-        <w:br/>
-      </w:r>
-      <w:r>
-        <w:br/>
-      </w:r>
-      <w:r>
-        <w:br/>
-      </w:r>
-      <w:r>
-        <w:br/>
       </w:r>
       <w:r>
         <w:br/>

</xml_diff>

<commit_message>
V 145 New Maps
</commit_message>
<xml_diff>
--- a/chess setups.DOCX
+++ b/chess setups.DOCX
@@ -6,7 +6,7 @@
       <w:pPr>
         <w:pStyle w:val="Nadpis3"/>
       </w:pPr>
-      <w:bookmarkStart w:id="0" w:name="_Toc239881626"/>
+      <w:bookmarkStart w:id="0" w:name="_Toc241172253"/>
       <w:r>
         <w:t>Standard</w:t>
       </w:r>
@@ -30,17 +30,12 @@
         <w:t xml:space="preserve"> </w:t>
       </w:r>
       <w:proofErr w:type="spellStart"/>
-      <w:proofErr w:type="gramStart"/>
       <w:r>
         <w:t>Player</w:t>
       </w:r>
       <w:proofErr w:type="spellEnd"/>
       <w:r>
-        <w:t>(</w:t>
-      </w:r>
-      <w:proofErr w:type="gramEnd"/>
-      <w:r>
-        <w:t xml:space="preserve">"Bílý", </w:t>
+        <w:t xml:space="preserve">("Bílý", </w:t>
       </w:r>
       <w:proofErr w:type="spellStart"/>
       <w:r>
@@ -77,17 +72,12 @@
         <w:t xml:space="preserve"> </w:t>
       </w:r>
       <w:proofErr w:type="spellStart"/>
-      <w:proofErr w:type="gramStart"/>
       <w:r>
         <w:t>Player</w:t>
       </w:r>
       <w:proofErr w:type="spellEnd"/>
       <w:r>
-        <w:t>(</w:t>
-      </w:r>
-      <w:proofErr w:type="gramEnd"/>
-      <w:r>
-        <w:t xml:space="preserve">"Černý", </w:t>
+        <w:t xml:space="preserve">("Černý", </w:t>
       </w:r>
       <w:proofErr w:type="spellStart"/>
       <w:r>
@@ -2344,17 +2334,9 @@
       <w:pPr>
         <w:pStyle w:val="Nadpis3"/>
       </w:pPr>
-      <w:bookmarkStart w:id="1" w:name="_Toc239881627"/>
-      <w:r>
-        <w:t xml:space="preserve">fighter </w:t>
-      </w:r>
-      <w:proofErr w:type="gramStart"/>
-      <w:r>
-        <w:t>defense - map</w:t>
-      </w:r>
-      <w:proofErr w:type="gramEnd"/>
-      <w:r>
-        <w:t xml:space="preserve"> 1</w:t>
+      <w:bookmarkStart w:id="1" w:name="_Toc241172254"/>
+      <w:r>
+        <w:t>fighter defense - map 1</w:t>
       </w:r>
       <w:bookmarkEnd w:id="1"/>
     </w:p>
@@ -5175,7 +5157,7 @@
       <w:pPr>
         <w:pStyle w:val="Nadpis3"/>
       </w:pPr>
-      <w:bookmarkStart w:id="2" w:name="_Toc239881628"/>
+      <w:bookmarkStart w:id="2" w:name="_Toc241172255"/>
       <w:proofErr w:type="spellStart"/>
       <w:r>
         <w:lastRenderedPageBreak/>
@@ -6803,7 +6785,7 @@
       <w:pPr>
         <w:pStyle w:val="Nadpis3"/>
       </w:pPr>
-      <w:bookmarkStart w:id="3" w:name="_Toc239881629"/>
+      <w:bookmarkStart w:id="3" w:name="_Toc241172256"/>
       <w:r>
         <w:t>Test</w:t>
       </w:r>
@@ -9396,55 +9378,13 @@
           <w:lang w:val="en-GB"/>
         </w:rPr>
         <w:br/>
-        <w:t xml:space="preserve">        </w:t>
-      </w:r>
-      <w:proofErr w:type="spellStart"/>
-      <w:r>
-        <w:rPr>
-          <w:lang w:val="en-GB"/>
-        </w:rPr>
-        <w:t>chessBoard.printBoard</w:t>
-      </w:r>
-      <w:proofErr w:type="spellEnd"/>
-      <w:r>
-        <w:rPr>
-          <w:lang w:val="en-GB"/>
-        </w:rPr>
-        <w:t>();</w:t>
-      </w:r>
-      <w:r>
-        <w:rPr>
-          <w:lang w:val="en-GB"/>
-        </w:rPr>
-        <w:br/>
-      </w:r>
-      <w:r>
-        <w:rPr>
-          <w:lang w:val="en-GB"/>
-        </w:rPr>
-        <w:br/>
-        <w:t xml:space="preserve">        </w:t>
-      </w:r>
-      <w:proofErr w:type="spellStart"/>
-      <w:r>
-        <w:rPr>
-          <w:lang w:val="en-GB"/>
-        </w:rPr>
-        <w:t>chessBoard.savePosition</w:t>
-      </w:r>
-      <w:proofErr w:type="spellEnd"/>
-      <w:r>
-        <w:rPr>
-          <w:lang w:val="en-GB"/>
-        </w:rPr>
-        <w:t>("test",player1);</w:t>
       </w:r>
     </w:p>
     <w:p>
       <w:pPr>
         <w:pStyle w:val="Nadpis3"/>
       </w:pPr>
-      <w:bookmarkStart w:id="4" w:name="_Toc239881630"/>
+      <w:bookmarkStart w:id="4" w:name="_Toc241172257"/>
       <w:r>
         <w:t xml:space="preserve">XXL </w:t>
       </w:r>
@@ -10049,12 +9989,6 @@
           <w:lang w:val="en-GB"/>
         </w:rPr>
         <w:br/>
-      </w:r>
-      <w:r>
-        <w:rPr>
-          <w:lang w:val="en-GB"/>
-        </w:rPr>
-        <w:lastRenderedPageBreak/>
         <w:t xml:space="preserve">            </w:t>
       </w:r>
       <w:proofErr w:type="spellStart"/>
@@ -10125,6 +10059,12 @@
           <w:lang w:val="en-GB"/>
         </w:rPr>
         <w:br/>
+      </w:r>
+      <w:r>
+        <w:rPr>
+          <w:lang w:val="en-GB"/>
+        </w:rPr>
+        <w:lastRenderedPageBreak/>
         <w:t xml:space="preserve">        }</w:t>
       </w:r>
       <w:r>
@@ -10289,7 +10229,6 @@
         </w:rPr>
       </w:pPr>
       <w:proofErr w:type="spellStart"/>
-      <w:proofErr w:type="gramStart"/>
       <w:r>
         <w:rPr>
           <w:rFonts w:eastAsiaTheme="majorEastAsia" w:cstheme="majorBidi"/>
@@ -10320,7 +10259,6 @@
         <w:t>Kill</w:t>
       </w:r>
       <w:proofErr w:type="spellEnd"/>
-      <w:proofErr w:type="gramEnd"/>
       <w:r>
         <w:rPr>
           <w:rFonts w:eastAsiaTheme="majorEastAsia" w:cstheme="majorBidi"/>
@@ -10829,9 +10767,6 @@
       </w:r>
       <w:r>
         <w:br/>
-      </w:r>
-      <w:r>
-        <w:lastRenderedPageBreak/>
         <w:t xml:space="preserve">                King king4 = </w:t>
       </w:r>
       <w:proofErr w:type="spellStart"/>
@@ -10897,6 +10832,9 @@
       </w:r>
       <w:r>
         <w:br/>
+      </w:r>
+      <w:r>
+        <w:lastRenderedPageBreak/>
         <w:t xml:space="preserve">                </w:t>
       </w:r>
       <w:proofErr w:type="spellStart"/>
@@ -11570,6 +11508,30 @@
       </w:r>
       <w:r>
         <w:br/>
+        <w:t xml:space="preserve">                </w:t>
+      </w:r>
+      <w:proofErr w:type="spellStart"/>
+      <w:r>
+        <w:t>chessBoard.addPiece</w:t>
+      </w:r>
+      <w:proofErr w:type="spellEnd"/>
+      <w:r>
+        <w:t>(pawn4);</w:t>
+      </w:r>
+      <w:r>
+        <w:br/>
+        <w:t xml:space="preserve">                </w:t>
+      </w:r>
+      <w:proofErr w:type="spellStart"/>
+      <w:r>
+        <w:t>chessBoard.addPiece</w:t>
+      </w:r>
+      <w:proofErr w:type="spellEnd"/>
+      <w:r>
+        <w:t>(pawn5);</w:t>
+      </w:r>
+      <w:r>
+        <w:br/>
       </w:r>
       <w:r>
         <w:lastRenderedPageBreak/>
@@ -11581,7 +11543,18 @@
       </w:r>
       <w:proofErr w:type="spellEnd"/>
       <w:r>
-        <w:t>(pawn4);</w:t>
+        <w:t>(</w:t>
+      </w:r>
+      <w:proofErr w:type="spellStart"/>
+      <w:r>
+        <w:t>torpedo</w:t>
+      </w:r>
+      <w:proofErr w:type="spellEnd"/>
+      <w:r>
+        <w:t>);</w:t>
+      </w:r>
+      <w:r>
+        <w:br/>
       </w:r>
       <w:r>
         <w:br/>
@@ -11593,7 +11566,22 @@
       </w:r>
       <w:proofErr w:type="spellEnd"/>
       <w:r>
-        <w:t>(pawn5);</w:t>
+        <w:t>(king5);</w:t>
+      </w:r>
+      <w:r>
+        <w:br/>
+        <w:t xml:space="preserve">                //</w:t>
+      </w:r>
+      <w:proofErr w:type="spellStart"/>
+      <w:r>
+        <w:t>Tutorial</w:t>
+      </w:r>
+      <w:proofErr w:type="spellEnd"/>
+      <w:r>
+        <w:t xml:space="preserve"> 3</w:t>
+      </w:r>
+      <w:r>
+        <w:br/>
       </w:r>
       <w:r>
         <w:br/>
@@ -11605,11 +11593,77 @@
       </w:r>
       <w:proofErr w:type="spellEnd"/>
       <w:r>
+        <w:t>(pawn1);</w:t>
+      </w:r>
+      <w:r>
+        <w:br/>
+        <w:t xml:space="preserve">                </w:t>
+      </w:r>
+      <w:proofErr w:type="spellStart"/>
+      <w:r>
+        <w:t>chessBoard.addPiece</w:t>
+      </w:r>
+      <w:proofErr w:type="spellEnd"/>
+      <w:r>
+        <w:t>(pawn2);</w:t>
+      </w:r>
+      <w:r>
+        <w:br/>
+        <w:t xml:space="preserve">                </w:t>
+      </w:r>
+      <w:proofErr w:type="spellStart"/>
+      <w:r>
+        <w:t>chessBoard.addPiece</w:t>
+      </w:r>
+      <w:proofErr w:type="spellEnd"/>
+      <w:r>
+        <w:t>(landCarrier2);</w:t>
+      </w:r>
+      <w:r>
+        <w:br/>
+      </w:r>
+      <w:r>
+        <w:br/>
+        <w:t xml:space="preserve">                </w:t>
+      </w:r>
+      <w:proofErr w:type="spellStart"/>
+      <w:r>
+        <w:t>chessBoard.addPiece</w:t>
+      </w:r>
+      <w:proofErr w:type="spellEnd"/>
+      <w:r>
+        <w:t>(king4);</w:t>
+      </w:r>
+      <w:r>
+        <w:br/>
+      </w:r>
+      <w:r>
+        <w:br/>
+        <w:t xml:space="preserve">                </w:t>
+      </w:r>
+      <w:proofErr w:type="spellStart"/>
+      <w:r>
+        <w:t>chessBoard.addPiece</w:t>
+      </w:r>
+      <w:proofErr w:type="spellEnd"/>
+      <w:r>
+        <w:t>(pawn3);</w:t>
+      </w:r>
+      <w:r>
+        <w:br/>
+        <w:t xml:space="preserve">                </w:t>
+      </w:r>
+      <w:proofErr w:type="spellStart"/>
+      <w:r>
+        <w:t>chessBoard.addPiece</w:t>
+      </w:r>
+      <w:proofErr w:type="spellEnd"/>
+      <w:r>
         <w:t>(</w:t>
       </w:r>
       <w:proofErr w:type="spellStart"/>
       <w:r>
-        <w:t>torpedo</w:t>
+        <w:t>linebreakerRook</w:t>
       </w:r>
       <w:proofErr w:type="spellEnd"/>
       <w:r>
@@ -11624,11 +11678,346 @@
       </w:r>
       <w:proofErr w:type="spellStart"/>
       <w:r>
-        <w:t>chessBoard.addPiece</w:t>
-      </w:r>
-      <w:proofErr w:type="spellEnd"/>
-      <w:r>
-        <w:t>(king5);</w:t>
+        <w:t>for</w:t>
+      </w:r>
+      <w:proofErr w:type="spellEnd"/>
+      <w:r>
+        <w:t xml:space="preserve"> (</w:t>
+      </w:r>
+      <w:proofErr w:type="spellStart"/>
+      <w:r>
+        <w:t>int</w:t>
+      </w:r>
+      <w:proofErr w:type="spellEnd"/>
+      <w:r>
+        <w:t xml:space="preserve"> j = 0; j &lt; 5; j++) {</w:t>
+      </w:r>
+      <w:r>
+        <w:br/>
+        <w:t xml:space="preserve">                    </w:t>
+      </w:r>
+      <w:proofErr w:type="spellStart"/>
+      <w:r>
+        <w:t>chessBoard.addPiece</w:t>
+      </w:r>
+      <w:proofErr w:type="spellEnd"/>
+      <w:r>
+        <w:t>(</w:t>
+      </w:r>
+      <w:proofErr w:type="spellStart"/>
+      <w:r>
+        <w:t>new</w:t>
+      </w:r>
+      <w:proofErr w:type="spellEnd"/>
+      <w:r>
+        <w:t xml:space="preserve"> </w:t>
+      </w:r>
+      <w:proofErr w:type="spellStart"/>
+      <w:r>
+        <w:t>Blocade</w:t>
+      </w:r>
+      <w:proofErr w:type="spellEnd"/>
+      <w:r>
+        <w:t>("</w:t>
+      </w:r>
+      <w:proofErr w:type="spellStart"/>
+      <w:r>
+        <w:t>blocade</w:t>
+      </w:r>
+      <w:proofErr w:type="spellEnd"/>
+      <w:r>
+        <w:t>", 6, j));</w:t>
+      </w:r>
+      <w:r>
+        <w:br/>
+        <w:t xml:space="preserve">                }</w:t>
+      </w:r>
+      <w:r>
+        <w:br/>
+      </w:r>
+      <w:r>
+        <w:br/>
+        <w:t xml:space="preserve">                </w:t>
+      </w:r>
+      <w:proofErr w:type="spellStart"/>
+      <w:r>
+        <w:t>for</w:t>
+      </w:r>
+      <w:proofErr w:type="spellEnd"/>
+      <w:r>
+        <w:t xml:space="preserve"> (</w:t>
+      </w:r>
+      <w:proofErr w:type="spellStart"/>
+      <w:r>
+        <w:t>int</w:t>
+      </w:r>
+      <w:proofErr w:type="spellEnd"/>
+      <w:r>
+        <w:t xml:space="preserve"> i = 1; i &lt; 8; i++) {</w:t>
+      </w:r>
+      <w:r>
+        <w:br/>
+        <w:t xml:space="preserve">                    </w:t>
+      </w:r>
+      <w:proofErr w:type="spellStart"/>
+      <w:r>
+        <w:t>chessBoard.addPiece</w:t>
+      </w:r>
+      <w:proofErr w:type="spellEnd"/>
+      <w:r>
+        <w:t>(</w:t>
+      </w:r>
+      <w:proofErr w:type="spellStart"/>
+      <w:r>
+        <w:t>new</w:t>
+      </w:r>
+      <w:proofErr w:type="spellEnd"/>
+      <w:r>
+        <w:t xml:space="preserve"> </w:t>
+      </w:r>
+      <w:proofErr w:type="spellStart"/>
+      <w:r>
+        <w:t>Blocade</w:t>
+      </w:r>
+      <w:proofErr w:type="spellEnd"/>
+      <w:r>
+        <w:t>("</w:t>
+      </w:r>
+      <w:proofErr w:type="spellStart"/>
+      <w:r>
+        <w:t>blocade</w:t>
+      </w:r>
+      <w:proofErr w:type="spellEnd"/>
+      <w:r>
+        <w:t>", 7, i));</w:t>
+      </w:r>
+      <w:r>
+        <w:br/>
+        <w:t xml:space="preserve">                    </w:t>
+      </w:r>
+      <w:proofErr w:type="spellStart"/>
+      <w:r>
+        <w:t>chessBoard.addPiece</w:t>
+      </w:r>
+      <w:proofErr w:type="spellEnd"/>
+      <w:r>
+        <w:t>(</w:t>
+      </w:r>
+      <w:proofErr w:type="spellStart"/>
+      <w:r>
+        <w:t>new</w:t>
+      </w:r>
+      <w:proofErr w:type="spellEnd"/>
+      <w:r>
+        <w:t xml:space="preserve"> </w:t>
+      </w:r>
+      <w:proofErr w:type="spellStart"/>
+      <w:r>
+        <w:t>Blocade</w:t>
+      </w:r>
+      <w:proofErr w:type="spellEnd"/>
+      <w:r>
+        <w:t>("</w:t>
+      </w:r>
+      <w:proofErr w:type="spellStart"/>
+      <w:r>
+        <w:t>blocade</w:t>
+      </w:r>
+      <w:proofErr w:type="spellEnd"/>
+      <w:r>
+        <w:t>", 9, i));</w:t>
+      </w:r>
+      <w:r>
+        <w:br/>
+      </w:r>
+      <w:r>
+        <w:br/>
+        <w:t xml:space="preserve">                    </w:t>
+      </w:r>
+      <w:proofErr w:type="spellStart"/>
+      <w:r>
+        <w:t>chessBoard.addPiece</w:t>
+      </w:r>
+      <w:proofErr w:type="spellEnd"/>
+      <w:r>
+        <w:t>(</w:t>
+      </w:r>
+      <w:proofErr w:type="spellStart"/>
+      <w:r>
+        <w:t>new</w:t>
+      </w:r>
+      <w:proofErr w:type="spellEnd"/>
+      <w:r>
+        <w:t xml:space="preserve"> </w:t>
+      </w:r>
+      <w:proofErr w:type="spellStart"/>
+      <w:r>
+        <w:t>Blocade</w:t>
+      </w:r>
+      <w:proofErr w:type="spellEnd"/>
+      <w:r>
+        <w:t>("</w:t>
+      </w:r>
+      <w:proofErr w:type="spellStart"/>
+      <w:r>
+        <w:t>blocade</w:t>
+      </w:r>
+      <w:proofErr w:type="spellEnd"/>
+      <w:r>
+        <w:t>", 7, i));</w:t>
+      </w:r>
+      <w:r>
+        <w:br/>
+        <w:t xml:space="preserve">                    </w:t>
+      </w:r>
+      <w:proofErr w:type="spellStart"/>
+      <w:r>
+        <w:t>chessBoard.addPiece</w:t>
+      </w:r>
+      <w:proofErr w:type="spellEnd"/>
+      <w:r>
+        <w:t>(</w:t>
+      </w:r>
+      <w:proofErr w:type="spellStart"/>
+      <w:r>
+        <w:t>new</w:t>
+      </w:r>
+      <w:proofErr w:type="spellEnd"/>
+      <w:r>
+        <w:t xml:space="preserve"> </w:t>
+      </w:r>
+      <w:proofErr w:type="spellStart"/>
+      <w:r>
+        <w:t>Blocade</w:t>
+      </w:r>
+      <w:proofErr w:type="spellEnd"/>
+      <w:r>
+        <w:t>("</w:t>
+      </w:r>
+      <w:proofErr w:type="spellStart"/>
+      <w:r>
+        <w:t>blocade</w:t>
+      </w:r>
+      <w:proofErr w:type="spellEnd"/>
+      <w:r>
+        <w:t>", 9, i));</w:t>
+      </w:r>
+      <w:r>
+        <w:br/>
+        <w:t xml:space="preserve">                }</w:t>
+      </w:r>
+      <w:r>
+        <w:br/>
+        <w:t xml:space="preserve">                </w:t>
+      </w:r>
+      <w:proofErr w:type="spellStart"/>
+      <w:r>
+        <w:t>chessBoard.addPiece</w:t>
+      </w:r>
+      <w:proofErr w:type="spellEnd"/>
+      <w:r>
+        <w:t>(</w:t>
+      </w:r>
+      <w:proofErr w:type="spellStart"/>
+      <w:r>
+        <w:t>new</w:t>
+      </w:r>
+      <w:proofErr w:type="spellEnd"/>
+      <w:r>
+        <w:t xml:space="preserve"> </w:t>
+      </w:r>
+      <w:proofErr w:type="spellStart"/>
+      <w:r>
+        <w:t>Blocade</w:t>
+      </w:r>
+      <w:proofErr w:type="spellEnd"/>
+      <w:r>
+        <w:t>("</w:t>
+      </w:r>
+      <w:proofErr w:type="spellStart"/>
+      <w:r>
+        <w:t>blocade</w:t>
+      </w:r>
+      <w:proofErr w:type="spellEnd"/>
+      <w:r>
+        <w:t>", 8,7));</w:t>
+      </w:r>
+      <w:r>
+        <w:br/>
+      </w:r>
+      <w:r>
+        <w:br/>
+        <w:t xml:space="preserve">                </w:t>
+      </w:r>
+      <w:proofErr w:type="spellStart"/>
+      <w:r>
+        <w:t>for</w:t>
+      </w:r>
+      <w:proofErr w:type="spellEnd"/>
+      <w:r>
+        <w:t xml:space="preserve"> (</w:t>
+      </w:r>
+      <w:proofErr w:type="spellStart"/>
+      <w:r>
+        <w:t>int</w:t>
+      </w:r>
+      <w:proofErr w:type="spellEnd"/>
+      <w:r>
+        <w:t xml:space="preserve"> i = 7; i &lt; 10; i++){</w:t>
+      </w:r>
+      <w:r>
+        <w:br/>
+        <w:t xml:space="preserve">                    </w:t>
+      </w:r>
+      <w:proofErr w:type="spellStart"/>
+      <w:r>
+        <w:t>for</w:t>
+      </w:r>
+      <w:proofErr w:type="spellEnd"/>
+      <w:r>
+        <w:t xml:space="preserve"> (</w:t>
+      </w:r>
+      <w:proofErr w:type="spellStart"/>
+      <w:r>
+        <w:t>int</w:t>
+      </w:r>
+      <w:proofErr w:type="spellEnd"/>
+      <w:r>
+        <w:t xml:space="preserve"> j = 0; j &lt; 5; j++) {</w:t>
+      </w:r>
+      <w:r>
+        <w:br/>
+      </w:r>
+      <w:r>
+        <w:br/>
+        <w:t xml:space="preserve">                        </w:t>
+      </w:r>
+      <w:proofErr w:type="spellStart"/>
+      <w:r>
+        <w:t>chessBoard.addWaterSquares</w:t>
+      </w:r>
+      <w:proofErr w:type="spellEnd"/>
+      <w:r>
+        <w:t>(</w:t>
+      </w:r>
+      <w:proofErr w:type="spellStart"/>
+      <w:r>
+        <w:t>i,j</w:t>
+      </w:r>
+      <w:proofErr w:type="spellEnd"/>
+      <w:r>
+        <w:t>);</w:t>
+      </w:r>
+      <w:r>
+        <w:br/>
+        <w:t xml:space="preserve">                    }</w:t>
+      </w:r>
+      <w:r>
+        <w:br/>
+        <w:t xml:space="preserve">                }</w:t>
+      </w:r>
+      <w:r>
+        <w:br/>
       </w:r>
       <w:r>
         <w:br/>
@@ -11640,10 +12029,7 @@
       </w:r>
       <w:proofErr w:type="spellEnd"/>
       <w:r>
-        <w:t xml:space="preserve"> 3</w:t>
-      </w:r>
-      <w:r>
-        <w:br/>
+        <w:t xml:space="preserve"> 2</w:t>
       </w:r>
       <w:r>
         <w:br/>
@@ -11651,69 +12037,46 @@
       </w:r>
       <w:proofErr w:type="spellStart"/>
       <w:r>
-        <w:t>chessBoard.addPiece</w:t>
-      </w:r>
-      <w:proofErr w:type="spellEnd"/>
-      <w:r>
-        <w:t>(pawn1);</w:t>
-      </w:r>
-      <w:r>
-        <w:br/>
-        <w:t xml:space="preserve">                </w:t>
-      </w:r>
-      <w:proofErr w:type="spellStart"/>
-      <w:r>
-        <w:t>chessBoard.addPiece</w:t>
-      </w:r>
-      <w:proofErr w:type="spellEnd"/>
-      <w:r>
-        <w:t>(pawn2);</w:t>
-      </w:r>
-      <w:r>
-        <w:br/>
-        <w:t xml:space="preserve">                </w:t>
-      </w:r>
-      <w:proofErr w:type="spellStart"/>
-      <w:r>
-        <w:t>chessBoard.addPiece</w:t>
-      </w:r>
-      <w:proofErr w:type="spellEnd"/>
-      <w:r>
-        <w:t>(landCarrier2);</w:t>
-      </w:r>
-      <w:r>
-        <w:br/>
-      </w:r>
-      <w:r>
-        <w:br/>
-        <w:t xml:space="preserve">                </w:t>
-      </w:r>
-      <w:proofErr w:type="spellStart"/>
-      <w:r>
-        <w:t>chessBoard.addPiece</w:t>
-      </w:r>
-      <w:proofErr w:type="spellEnd"/>
-      <w:r>
-        <w:t>(king4);</w:t>
-      </w:r>
-      <w:r>
-        <w:br/>
-      </w:r>
-      <w:r>
-        <w:br/>
-        <w:t xml:space="preserve">                </w:t>
-      </w:r>
-      <w:proofErr w:type="spellStart"/>
-      <w:r>
-        <w:t>chessBoard.addPiece</w:t>
-      </w:r>
-      <w:proofErr w:type="spellEnd"/>
-      <w:r>
-        <w:t>(pawn3);</w:t>
-      </w:r>
-      <w:r>
-        <w:br/>
-        <w:t xml:space="preserve">                </w:t>
+        <w:t>for</w:t>
+      </w:r>
+      <w:proofErr w:type="spellEnd"/>
+      <w:r>
+        <w:t xml:space="preserve"> (</w:t>
+      </w:r>
+      <w:proofErr w:type="spellStart"/>
+      <w:r>
+        <w:t>int</w:t>
+      </w:r>
+      <w:proofErr w:type="spellEnd"/>
+      <w:r>
+        <w:t xml:space="preserve"> i = 0; i &lt; 5; i++){</w:t>
+      </w:r>
+      <w:r>
+        <w:br/>
+        <w:t xml:space="preserve">                    </w:t>
+      </w:r>
+      <w:proofErr w:type="spellStart"/>
+      <w:r>
+        <w:t>for</w:t>
+      </w:r>
+      <w:proofErr w:type="spellEnd"/>
+      <w:r>
+        <w:t xml:space="preserve"> (</w:t>
+      </w:r>
+      <w:proofErr w:type="spellStart"/>
+      <w:r>
+        <w:t>int</w:t>
+      </w:r>
+      <w:proofErr w:type="spellEnd"/>
+      <w:r>
+        <w:t xml:space="preserve"> j = 0; j &lt; 5; j++) {</w:t>
+      </w:r>
+      <w:r>
+        <w:br/>
+      </w:r>
+      <w:r>
+        <w:br/>
+        <w:t xml:space="preserve">                        </w:t>
       </w:r>
       <w:proofErr w:type="spellStart"/>
       <w:r>
@@ -11725,49 +12088,6 @@
       </w:r>
       <w:proofErr w:type="spellStart"/>
       <w:r>
-        <w:t>linebreakerRook</w:t>
-      </w:r>
-      <w:proofErr w:type="spellEnd"/>
-      <w:r>
-        <w:t>);</w:t>
-      </w:r>
-      <w:r>
-        <w:br/>
-      </w:r>
-      <w:r>
-        <w:br/>
-        <w:t xml:space="preserve">                </w:t>
-      </w:r>
-      <w:proofErr w:type="spellStart"/>
-      <w:r>
-        <w:t>for</w:t>
-      </w:r>
-      <w:proofErr w:type="spellEnd"/>
-      <w:r>
-        <w:t xml:space="preserve"> (</w:t>
-      </w:r>
-      <w:proofErr w:type="spellStart"/>
-      <w:r>
-        <w:t>int</w:t>
-      </w:r>
-      <w:proofErr w:type="spellEnd"/>
-      <w:r>
-        <w:t xml:space="preserve"> j = 0; j &lt; 5; j++) {</w:t>
-      </w:r>
-      <w:r>
-        <w:br/>
-        <w:t xml:space="preserve">                    </w:t>
-      </w:r>
-      <w:proofErr w:type="spellStart"/>
-      <w:r>
-        <w:t>chessBoard.addPiece</w:t>
-      </w:r>
-      <w:proofErr w:type="spellEnd"/>
-      <w:r>
-        <w:t>(</w:t>
-      </w:r>
-      <w:proofErr w:type="spellStart"/>
-      <w:r>
         <w:t>new</w:t>
       </w:r>
       <w:proofErr w:type="spellEnd"/>
@@ -11788,7 +12108,11 @@
       </w:r>
       <w:proofErr w:type="spellEnd"/>
       <w:r>
-        <w:t>", 6, j));</w:t>
+        <w:t>", i, j));</w:t>
+      </w:r>
+      <w:r>
+        <w:br/>
+        <w:t xml:space="preserve">                    }</w:t>
       </w:r>
       <w:r>
         <w:br/>
@@ -11798,395 +12122,7 @@
         <w:br/>
       </w:r>
       <w:r>
-        <w:br/>
-        <w:t xml:space="preserve">                </w:t>
-      </w:r>
-      <w:proofErr w:type="spellStart"/>
-      <w:r>
-        <w:t>for</w:t>
-      </w:r>
-      <w:proofErr w:type="spellEnd"/>
-      <w:r>
-        <w:t xml:space="preserve"> (</w:t>
-      </w:r>
-      <w:proofErr w:type="spellStart"/>
-      <w:r>
-        <w:t>int</w:t>
-      </w:r>
-      <w:proofErr w:type="spellEnd"/>
-      <w:r>
-        <w:t xml:space="preserve"> i = 1; i &lt; 8; i++) {</w:t>
-      </w:r>
-      <w:r>
-        <w:br/>
-        <w:t xml:space="preserve">                    </w:t>
-      </w:r>
-      <w:proofErr w:type="spellStart"/>
-      <w:r>
-        <w:t>chessBoard.addPiece</w:t>
-      </w:r>
-      <w:proofErr w:type="spellEnd"/>
-      <w:r>
-        <w:t>(</w:t>
-      </w:r>
-      <w:proofErr w:type="spellStart"/>
-      <w:r>
-        <w:t>new</w:t>
-      </w:r>
-      <w:proofErr w:type="spellEnd"/>
-      <w:r>
-        <w:t xml:space="preserve"> </w:t>
-      </w:r>
-      <w:proofErr w:type="spellStart"/>
-      <w:r>
-        <w:t>Blocade</w:t>
-      </w:r>
-      <w:proofErr w:type="spellEnd"/>
-      <w:r>
-        <w:t>("</w:t>
-      </w:r>
-      <w:proofErr w:type="spellStart"/>
-      <w:r>
-        <w:t>blocade</w:t>
-      </w:r>
-      <w:proofErr w:type="spellEnd"/>
-      <w:r>
-        <w:t>", 7, i));</w:t>
-      </w:r>
-      <w:r>
-        <w:br/>
-        <w:t xml:space="preserve">                    </w:t>
-      </w:r>
-      <w:proofErr w:type="spellStart"/>
-      <w:r>
-        <w:t>chessBoard.addPiece</w:t>
-      </w:r>
-      <w:proofErr w:type="spellEnd"/>
-      <w:r>
-        <w:t>(</w:t>
-      </w:r>
-      <w:proofErr w:type="spellStart"/>
-      <w:r>
-        <w:t>new</w:t>
-      </w:r>
-      <w:proofErr w:type="spellEnd"/>
-      <w:r>
-        <w:t xml:space="preserve"> </w:t>
-      </w:r>
-      <w:proofErr w:type="spellStart"/>
-      <w:r>
-        <w:t>Blocade</w:t>
-      </w:r>
-      <w:proofErr w:type="spellEnd"/>
-      <w:r>
-        <w:t>("</w:t>
-      </w:r>
-      <w:proofErr w:type="spellStart"/>
-      <w:r>
-        <w:t>blocade</w:t>
-      </w:r>
-      <w:proofErr w:type="spellEnd"/>
-      <w:r>
-        <w:t>", 9, i));</w:t>
-      </w:r>
-      <w:r>
-        <w:br/>
-      </w:r>
-      <w:r>
-        <w:br/>
-        <w:t xml:space="preserve">                    </w:t>
-      </w:r>
-      <w:proofErr w:type="spellStart"/>
-      <w:r>
-        <w:t>chessBoard.addPiece</w:t>
-      </w:r>
-      <w:proofErr w:type="spellEnd"/>
-      <w:r>
-        <w:t>(</w:t>
-      </w:r>
-      <w:proofErr w:type="spellStart"/>
-      <w:r>
-        <w:t>new</w:t>
-      </w:r>
-      <w:proofErr w:type="spellEnd"/>
-      <w:r>
-        <w:t xml:space="preserve"> </w:t>
-      </w:r>
-      <w:proofErr w:type="spellStart"/>
-      <w:r>
-        <w:t>Blocade</w:t>
-      </w:r>
-      <w:proofErr w:type="spellEnd"/>
-      <w:r>
-        <w:t>("</w:t>
-      </w:r>
-      <w:proofErr w:type="spellStart"/>
-      <w:r>
-        <w:t>blocade</w:t>
-      </w:r>
-      <w:proofErr w:type="spellEnd"/>
-      <w:r>
-        <w:t>", 7, i));</w:t>
-      </w:r>
-      <w:r>
-        <w:br/>
-        <w:t xml:space="preserve">                    </w:t>
-      </w:r>
-      <w:proofErr w:type="spellStart"/>
-      <w:r>
-        <w:t>chessBoard.addPiece</w:t>
-      </w:r>
-      <w:proofErr w:type="spellEnd"/>
-      <w:r>
-        <w:t>(</w:t>
-      </w:r>
-      <w:proofErr w:type="spellStart"/>
-      <w:r>
-        <w:t>new</w:t>
-      </w:r>
-      <w:proofErr w:type="spellEnd"/>
-      <w:r>
-        <w:t xml:space="preserve"> </w:t>
-      </w:r>
-      <w:proofErr w:type="spellStart"/>
-      <w:r>
-        <w:t>Blocade</w:t>
-      </w:r>
-      <w:proofErr w:type="spellEnd"/>
-      <w:r>
-        <w:t>("</w:t>
-      </w:r>
-      <w:proofErr w:type="spellStart"/>
-      <w:r>
-        <w:t>blocade</w:t>
-      </w:r>
-      <w:proofErr w:type="spellEnd"/>
-      <w:r>
-        <w:t>", 9, i));</w:t>
-      </w:r>
-      <w:r>
-        <w:br/>
-        <w:t xml:space="preserve">                }</w:t>
-      </w:r>
-      <w:r>
-        <w:br/>
-        <w:t xml:space="preserve">                </w:t>
-      </w:r>
-      <w:proofErr w:type="spellStart"/>
-      <w:r>
-        <w:t>chessBoard.addPiece</w:t>
-      </w:r>
-      <w:proofErr w:type="spellEnd"/>
-      <w:r>
-        <w:t>(</w:t>
-      </w:r>
-      <w:proofErr w:type="spellStart"/>
-      <w:r>
-        <w:t>new</w:t>
-      </w:r>
-      <w:proofErr w:type="spellEnd"/>
-      <w:r>
-        <w:t xml:space="preserve"> </w:t>
-      </w:r>
-      <w:proofErr w:type="spellStart"/>
-      <w:r>
-        <w:t>Blocade</w:t>
-      </w:r>
-      <w:proofErr w:type="spellEnd"/>
-      <w:r>
-        <w:t>("</w:t>
-      </w:r>
-      <w:proofErr w:type="spellStart"/>
-      <w:r>
-        <w:t>blocade</w:t>
-      </w:r>
-      <w:proofErr w:type="spellEnd"/>
-      <w:r>
-        <w:t>", 8,7));</w:t>
-      </w:r>
-      <w:r>
-        <w:br/>
-      </w:r>
-      <w:r>
-        <w:br/>
-        <w:t xml:space="preserve">                </w:t>
-      </w:r>
-      <w:proofErr w:type="spellStart"/>
-      <w:r>
-        <w:t>for</w:t>
-      </w:r>
-      <w:proofErr w:type="spellEnd"/>
-      <w:r>
-        <w:t xml:space="preserve"> (</w:t>
-      </w:r>
-      <w:proofErr w:type="spellStart"/>
-      <w:r>
-        <w:t>int</w:t>
-      </w:r>
-      <w:proofErr w:type="spellEnd"/>
-      <w:r>
-        <w:t xml:space="preserve"> i = 7; i &lt; 10; i++){</w:t>
-      </w:r>
-      <w:r>
-        <w:br/>
-        <w:t xml:space="preserve">                    </w:t>
-      </w:r>
-      <w:proofErr w:type="spellStart"/>
-      <w:r>
-        <w:t>for</w:t>
-      </w:r>
-      <w:proofErr w:type="spellEnd"/>
-      <w:r>
-        <w:t xml:space="preserve"> (</w:t>
-      </w:r>
-      <w:proofErr w:type="spellStart"/>
-      <w:r>
-        <w:t>int</w:t>
-      </w:r>
-      <w:proofErr w:type="spellEnd"/>
-      <w:r>
-        <w:t xml:space="preserve"> j = 0; j &lt; 5; j++) {</w:t>
-      </w:r>
-      <w:r>
-        <w:br/>
-      </w:r>
-      <w:r>
-        <w:br/>
-        <w:t xml:space="preserve">                        </w:t>
-      </w:r>
-      <w:proofErr w:type="spellStart"/>
-      <w:r>
-        <w:t>chessBoard.addWaterSquares</w:t>
-      </w:r>
-      <w:proofErr w:type="spellEnd"/>
-      <w:r>
-        <w:t>(</w:t>
-      </w:r>
-      <w:proofErr w:type="spellStart"/>
-      <w:r>
-        <w:t>i,j</w:t>
-      </w:r>
-      <w:proofErr w:type="spellEnd"/>
-      <w:r>
-        <w:t>);</w:t>
-      </w:r>
-      <w:r>
-        <w:br/>
-        <w:t xml:space="preserve">                    }</w:t>
-      </w:r>
-      <w:r>
-        <w:br/>
-        <w:t xml:space="preserve">                }</w:t>
-      </w:r>
-      <w:r>
-        <w:br/>
-      </w:r>
-      <w:r>
-        <w:br/>
-        <w:t xml:space="preserve">                //</w:t>
-      </w:r>
-      <w:proofErr w:type="spellStart"/>
-      <w:r>
-        <w:t>Tutorial</w:t>
-      </w:r>
-      <w:proofErr w:type="spellEnd"/>
-      <w:r>
-        <w:t xml:space="preserve"> 2</w:t>
-      </w:r>
-      <w:r>
-        <w:br/>
-        <w:t xml:space="preserve">                </w:t>
-      </w:r>
-      <w:proofErr w:type="spellStart"/>
-      <w:r>
-        <w:t>for</w:t>
-      </w:r>
-      <w:proofErr w:type="spellEnd"/>
-      <w:r>
-        <w:t xml:space="preserve"> (</w:t>
-      </w:r>
-      <w:proofErr w:type="spellStart"/>
-      <w:r>
-        <w:t>int</w:t>
-      </w:r>
-      <w:proofErr w:type="spellEnd"/>
-      <w:r>
-        <w:t xml:space="preserve"> i = 0; i &lt; 5; i++){</w:t>
-      </w:r>
-      <w:r>
-        <w:br/>
-        <w:t xml:space="preserve">                    </w:t>
-      </w:r>
-      <w:proofErr w:type="spellStart"/>
-      <w:r>
-        <w:t>for</w:t>
-      </w:r>
-      <w:proofErr w:type="spellEnd"/>
-      <w:r>
-        <w:t xml:space="preserve"> (</w:t>
-      </w:r>
-      <w:proofErr w:type="spellStart"/>
-      <w:r>
-        <w:t>int</w:t>
-      </w:r>
-      <w:proofErr w:type="spellEnd"/>
-      <w:r>
-        <w:t xml:space="preserve"> j = 0; j &lt; 5; j++) {</w:t>
-      </w:r>
-      <w:r>
-        <w:br/>
-      </w:r>
-      <w:r>
-        <w:br/>
-        <w:t xml:space="preserve">                        </w:t>
-      </w:r>
-      <w:proofErr w:type="spellStart"/>
-      <w:r>
-        <w:t>chessBoard.addPiece</w:t>
-      </w:r>
-      <w:proofErr w:type="spellEnd"/>
-      <w:r>
-        <w:t>(</w:t>
-      </w:r>
-      <w:proofErr w:type="spellStart"/>
-      <w:r>
-        <w:t>new</w:t>
-      </w:r>
-      <w:proofErr w:type="spellEnd"/>
-      <w:r>
-        <w:t xml:space="preserve"> </w:t>
-      </w:r>
-      <w:proofErr w:type="spellStart"/>
-      <w:r>
-        <w:t>Blocade</w:t>
-      </w:r>
-      <w:proofErr w:type="spellEnd"/>
-      <w:r>
-        <w:t>("</w:t>
-      </w:r>
-      <w:proofErr w:type="spellStart"/>
-      <w:r>
-        <w:t>blocade</w:t>
-      </w:r>
-      <w:proofErr w:type="spellEnd"/>
-      <w:r>
-        <w:t>", i, j));</w:t>
-      </w:r>
-      <w:r>
-        <w:br/>
-      </w:r>
-      <w:r>
         <w:lastRenderedPageBreak/>
-        <w:t xml:space="preserve">                    }</w:t>
-      </w:r>
-      <w:r>
-        <w:br/>
-        <w:t xml:space="preserve">                }</w:t>
-      </w:r>
-      <w:r>
-        <w:br/>
-      </w:r>
-      <w:r>
         <w:br/>
         <w:t xml:space="preserve">                </w:t>
       </w:r>
@@ -13124,7 +13060,6 @@
       </w:r>
       <w:proofErr w:type="spellStart"/>
       <w:r>
-        <w:lastRenderedPageBreak/>
         <w:t>squares</w:t>
       </w:r>
       <w:proofErr w:type="spellEnd"/>
@@ -13211,6 +13146,9 @@
       </w:r>
       <w:r>
         <w:br/>
+      </w:r>
+      <w:r>
+        <w:lastRenderedPageBreak/>
         <w:t xml:space="preserve">               </w:t>
       </w:r>
       <w:proofErr w:type="spellStart"/>
@@ -13243,6 +13181,1340 @@
       <w:proofErr w:type="spellEnd"/>
       <w:r>
         <w:t>, 0));</w:t>
+      </w:r>
+      <w:r>
+        <w:br/>
+        <w:t>//konec inicializace šachovnice</w:t>
+      </w:r>
+    </w:p>
+    <w:p>
+      <w:pPr>
+        <w:pStyle w:val="Nadpis3"/>
+      </w:pPr>
+      <w:bookmarkStart w:id="5" w:name="_Toc241172258"/>
+      <w:proofErr w:type="spellStart"/>
+      <w:r>
+        <w:t>The</w:t>
+      </w:r>
+      <w:proofErr w:type="spellEnd"/>
+      <w:r>
+        <w:t xml:space="preserve"> </w:t>
+      </w:r>
+      <w:proofErr w:type="spellStart"/>
+      <w:r>
+        <w:t>discovery</w:t>
+      </w:r>
+      <w:proofErr w:type="spellEnd"/>
+      <w:r>
+        <w:t xml:space="preserve"> </w:t>
+      </w:r>
+      <w:proofErr w:type="spellStart"/>
+      <w:r>
+        <w:t>of</w:t>
+      </w:r>
+      <w:proofErr w:type="spellEnd"/>
+      <w:r>
+        <w:t xml:space="preserve"> America</w:t>
+      </w:r>
+      <w:bookmarkEnd w:id="5"/>
+    </w:p>
+    <w:p>
+      <w:r>
+        <w:t xml:space="preserve">                //inicializace hráčů</w:t>
+      </w:r>
+      <w:r>
+        <w:br/>
+      </w:r>
+      <w:r>
+        <w:br/>
+        <w:t xml:space="preserve">                </w:t>
+      </w:r>
+      <w:proofErr w:type="spellStart"/>
+      <w:r>
+        <w:t>Player</w:t>
+      </w:r>
+      <w:proofErr w:type="spellEnd"/>
+      <w:r>
+        <w:t xml:space="preserve"> player1 = </w:t>
+      </w:r>
+      <w:proofErr w:type="spellStart"/>
+      <w:r>
+        <w:t>new</w:t>
+      </w:r>
+      <w:proofErr w:type="spellEnd"/>
+      <w:r>
+        <w:t xml:space="preserve"> </w:t>
+      </w:r>
+      <w:proofErr w:type="spellStart"/>
+      <w:r>
+        <w:t>Player</w:t>
+      </w:r>
+      <w:proofErr w:type="spellEnd"/>
+      <w:r>
+        <w:t>("Bílý",Colour.</w:t>
+      </w:r>
+      <w:r>
+        <w:rPr>
+          <w:i/>
+          <w:iCs/>
+        </w:rPr>
+        <w:t>White</w:t>
+      </w:r>
+      <w:r>
+        <w:t>,600);</w:t>
+      </w:r>
+      <w:r>
+        <w:br/>
+        <w:t xml:space="preserve">                </w:t>
+      </w:r>
+      <w:proofErr w:type="spellStart"/>
+      <w:r>
+        <w:t>Player</w:t>
+      </w:r>
+      <w:proofErr w:type="spellEnd"/>
+      <w:r>
+        <w:t xml:space="preserve"> player2 = </w:t>
+      </w:r>
+      <w:proofErr w:type="spellStart"/>
+      <w:r>
+        <w:t>new</w:t>
+      </w:r>
+      <w:proofErr w:type="spellEnd"/>
+      <w:r>
+        <w:t xml:space="preserve"> </w:t>
+      </w:r>
+      <w:proofErr w:type="spellStart"/>
+      <w:r>
+        <w:t>Player</w:t>
+      </w:r>
+      <w:proofErr w:type="spellEnd"/>
+      <w:r>
+        <w:t>("Černý",Colour.</w:t>
+      </w:r>
+      <w:r>
+        <w:rPr>
+          <w:i/>
+          <w:iCs/>
+        </w:rPr>
+        <w:t>Black</w:t>
+      </w:r>
+      <w:r>
+        <w:t>,600);</w:t>
+      </w:r>
+      <w:r>
+        <w:br/>
+      </w:r>
+      <w:r>
+        <w:br/>
+      </w:r>
+      <w:r>
+        <w:br/>
+        <w:t>//konec inicializace hráčů</w:t>
+      </w:r>
+      <w:r>
+        <w:br/>
+      </w:r>
+      <w:r>
+        <w:br/>
+        <w:t>//inicializace figur</w:t>
+      </w:r>
+      <w:r>
+        <w:br/>
+      </w:r>
+      <w:r>
+        <w:br/>
+      </w:r>
+      <w:r>
+        <w:br/>
+        <w:t xml:space="preserve">                //</w:t>
+      </w:r>
+      <w:proofErr w:type="spellStart"/>
+      <w:r>
+        <w:t>white</w:t>
+      </w:r>
+      <w:proofErr w:type="spellEnd"/>
+      <w:r>
+        <w:br/>
+        <w:t xml:space="preserve">                </w:t>
+      </w:r>
+      <w:proofErr w:type="spellStart"/>
+      <w:r>
+        <w:t>Pawn</w:t>
+      </w:r>
+      <w:proofErr w:type="spellEnd"/>
+      <w:r>
+        <w:t xml:space="preserve"> wp1 = </w:t>
+      </w:r>
+      <w:proofErr w:type="spellStart"/>
+      <w:r>
+        <w:t>new</w:t>
+      </w:r>
+      <w:proofErr w:type="spellEnd"/>
+      <w:r>
+        <w:t xml:space="preserve"> </w:t>
+      </w:r>
+      <w:proofErr w:type="spellStart"/>
+      <w:r>
+        <w:t>Pawn</w:t>
+      </w:r>
+      <w:proofErr w:type="spellEnd"/>
+      <w:r>
+        <w:t>("p",2,7,Colour.</w:t>
+      </w:r>
+      <w:r>
+        <w:rPr>
+          <w:i/>
+          <w:iCs/>
+        </w:rPr>
+        <w:t>White</w:t>
+      </w:r>
+      <w:r>
+        <w:t>,0);</w:t>
+      </w:r>
+      <w:r>
+        <w:br/>
+        <w:t xml:space="preserve">                </w:t>
+      </w:r>
+      <w:proofErr w:type="spellStart"/>
+      <w:r>
+        <w:t>Pawn</w:t>
+      </w:r>
+      <w:proofErr w:type="spellEnd"/>
+      <w:r>
+        <w:t xml:space="preserve"> wp2 = </w:t>
+      </w:r>
+      <w:proofErr w:type="spellStart"/>
+      <w:r>
+        <w:t>new</w:t>
+      </w:r>
+      <w:proofErr w:type="spellEnd"/>
+      <w:r>
+        <w:t xml:space="preserve"> </w:t>
+      </w:r>
+      <w:proofErr w:type="spellStart"/>
+      <w:r>
+        <w:t>Pawn</w:t>
+      </w:r>
+      <w:proofErr w:type="spellEnd"/>
+      <w:r>
+        <w:t>("p",3,7,Colour.</w:t>
+      </w:r>
+      <w:r>
+        <w:rPr>
+          <w:i/>
+          <w:iCs/>
+        </w:rPr>
+        <w:t>White</w:t>
+      </w:r>
+      <w:r>
+        <w:t>,0);</w:t>
+      </w:r>
+      <w:r>
+        <w:br/>
+        <w:t xml:space="preserve">                </w:t>
+      </w:r>
+      <w:proofErr w:type="spellStart"/>
+      <w:r>
+        <w:t>Pawn</w:t>
+      </w:r>
+      <w:proofErr w:type="spellEnd"/>
+      <w:r>
+        <w:t xml:space="preserve"> wp3 = </w:t>
+      </w:r>
+      <w:proofErr w:type="spellStart"/>
+      <w:r>
+        <w:t>new</w:t>
+      </w:r>
+      <w:proofErr w:type="spellEnd"/>
+      <w:r>
+        <w:t xml:space="preserve"> </w:t>
+      </w:r>
+      <w:proofErr w:type="spellStart"/>
+      <w:r>
+        <w:t>Pawn</w:t>
+      </w:r>
+      <w:proofErr w:type="spellEnd"/>
+      <w:r>
+        <w:t>("p",4,7,Colour.</w:t>
+      </w:r>
+      <w:r>
+        <w:rPr>
+          <w:i/>
+          <w:iCs/>
+        </w:rPr>
+        <w:t>White</w:t>
+      </w:r>
+      <w:r>
+        <w:t>,0);</w:t>
+      </w:r>
+      <w:r>
+        <w:br/>
+      </w:r>
+      <w:r>
+        <w:br/>
+        <w:t xml:space="preserve">                Guardian g1 = </w:t>
+      </w:r>
+      <w:proofErr w:type="spellStart"/>
+      <w:r>
+        <w:t>new</w:t>
+      </w:r>
+      <w:proofErr w:type="spellEnd"/>
+      <w:r>
+        <w:t xml:space="preserve"> Guardian("g",4,8,Colour.</w:t>
+      </w:r>
+      <w:r>
+        <w:rPr>
+          <w:i/>
+          <w:iCs/>
+        </w:rPr>
+        <w:t>White</w:t>
+      </w:r>
+      <w:r>
+        <w:t>);</w:t>
+      </w:r>
+      <w:r>
+        <w:br/>
+        <w:t xml:space="preserve">                Guardian g2 = </w:t>
+      </w:r>
+      <w:proofErr w:type="spellStart"/>
+      <w:r>
+        <w:t>new</w:t>
+      </w:r>
+      <w:proofErr w:type="spellEnd"/>
+      <w:r>
+        <w:t xml:space="preserve"> Guardian("g",2,8,Colour.</w:t>
+      </w:r>
+      <w:r>
+        <w:rPr>
+          <w:i/>
+          <w:iCs/>
+        </w:rPr>
+        <w:t>White</w:t>
+      </w:r>
+      <w:r>
+        <w:t>);</w:t>
+      </w:r>
+      <w:r>
+        <w:br/>
+        <w:t xml:space="preserve">                </w:t>
+      </w:r>
+      <w:proofErr w:type="spellStart"/>
+      <w:r>
+        <w:t>LandCarrier</w:t>
+      </w:r>
+      <w:proofErr w:type="spellEnd"/>
+      <w:r>
+        <w:t xml:space="preserve"> c = </w:t>
+      </w:r>
+      <w:proofErr w:type="spellStart"/>
+      <w:r>
+        <w:t>new</w:t>
+      </w:r>
+      <w:proofErr w:type="spellEnd"/>
+      <w:r>
+        <w:t xml:space="preserve"> </w:t>
+      </w:r>
+      <w:proofErr w:type="spellStart"/>
+      <w:r>
+        <w:t>LandCarrier</w:t>
+      </w:r>
+      <w:proofErr w:type="spellEnd"/>
+      <w:r>
+        <w:t>("c",3,8,Colour.</w:t>
+      </w:r>
+      <w:r>
+        <w:rPr>
+          <w:i/>
+          <w:iCs/>
+        </w:rPr>
+        <w:t>White</w:t>
+      </w:r>
+      <w:r>
+        <w:t>);</w:t>
+      </w:r>
+      <w:r>
+        <w:br/>
+        <w:t xml:space="preserve">                King </w:t>
+      </w:r>
+      <w:proofErr w:type="spellStart"/>
+      <w:r>
+        <w:t>wk</w:t>
+      </w:r>
+      <w:proofErr w:type="spellEnd"/>
+      <w:r>
+        <w:t xml:space="preserve"> = </w:t>
+      </w:r>
+      <w:proofErr w:type="spellStart"/>
+      <w:r>
+        <w:t>new</w:t>
+      </w:r>
+      <w:proofErr w:type="spellEnd"/>
+      <w:r>
+        <w:t xml:space="preserve"> King ("k",3,9,Colour.</w:t>
+      </w:r>
+      <w:r>
+        <w:rPr>
+          <w:i/>
+          <w:iCs/>
+        </w:rPr>
+        <w:t>White</w:t>
+      </w:r>
+      <w:r>
+        <w:t>,0);</w:t>
+      </w:r>
+      <w:r>
+        <w:br/>
+        <w:t xml:space="preserve">                //</w:t>
+      </w:r>
+      <w:proofErr w:type="spellStart"/>
+      <w:r>
+        <w:t>black</w:t>
+      </w:r>
+      <w:proofErr w:type="spellEnd"/>
+      <w:r>
+        <w:br/>
+        <w:t xml:space="preserve">                </w:t>
+      </w:r>
+      <w:proofErr w:type="spellStart"/>
+      <w:r>
+        <w:t>Emperor</w:t>
+      </w:r>
+      <w:proofErr w:type="spellEnd"/>
+      <w:r>
+        <w:t xml:space="preserve"> </w:t>
+      </w:r>
+      <w:proofErr w:type="spellStart"/>
+      <w:r>
+        <w:t>bk</w:t>
+      </w:r>
+      <w:proofErr w:type="spellEnd"/>
+      <w:r>
+        <w:t xml:space="preserve"> = </w:t>
+      </w:r>
+      <w:proofErr w:type="spellStart"/>
+      <w:r>
+        <w:t>new</w:t>
+      </w:r>
+      <w:proofErr w:type="spellEnd"/>
+      <w:r>
+        <w:t xml:space="preserve"> </w:t>
+      </w:r>
+      <w:proofErr w:type="spellStart"/>
+      <w:r>
+        <w:t>Emperor</w:t>
+      </w:r>
+      <w:proofErr w:type="spellEnd"/>
+      <w:r>
+        <w:t xml:space="preserve"> ("k",1,0,Colour.</w:t>
+      </w:r>
+      <w:r>
+        <w:rPr>
+          <w:i/>
+          <w:iCs/>
+        </w:rPr>
+        <w:t>Black</w:t>
+      </w:r>
+      <w:r>
+        <w:t>);</w:t>
+      </w:r>
+      <w:r>
+        <w:br/>
+        <w:t xml:space="preserve">                </w:t>
+      </w:r>
+      <w:proofErr w:type="spellStart"/>
+      <w:r>
+        <w:t>Bishop</w:t>
+      </w:r>
+      <w:proofErr w:type="spellEnd"/>
+      <w:r>
+        <w:t xml:space="preserve"> b1 = </w:t>
+      </w:r>
+      <w:proofErr w:type="spellStart"/>
+      <w:r>
+        <w:t>new</w:t>
+      </w:r>
+      <w:proofErr w:type="spellEnd"/>
+      <w:r>
+        <w:t xml:space="preserve"> </w:t>
+      </w:r>
+      <w:proofErr w:type="spellStart"/>
+      <w:r>
+        <w:t>Bishop</w:t>
+      </w:r>
+      <w:proofErr w:type="spellEnd"/>
+      <w:r>
+        <w:t>("b",1,1,Colour.</w:t>
+      </w:r>
+      <w:r>
+        <w:rPr>
+          <w:i/>
+          <w:iCs/>
+        </w:rPr>
+        <w:t>Black</w:t>
+      </w:r>
+      <w:r>
+        <w:t>);</w:t>
+      </w:r>
+      <w:r>
+        <w:br/>
+        <w:t xml:space="preserve">                </w:t>
+      </w:r>
+      <w:proofErr w:type="spellStart"/>
+      <w:r>
+        <w:t>Bishop</w:t>
+      </w:r>
+      <w:proofErr w:type="spellEnd"/>
+      <w:r>
+        <w:t xml:space="preserve"> b2 = </w:t>
+      </w:r>
+      <w:proofErr w:type="spellStart"/>
+      <w:r>
+        <w:t>new</w:t>
+      </w:r>
+      <w:proofErr w:type="spellEnd"/>
+      <w:r>
+        <w:t xml:space="preserve"> </w:t>
+      </w:r>
+      <w:proofErr w:type="spellStart"/>
+      <w:r>
+        <w:t>Bishop</w:t>
+      </w:r>
+      <w:proofErr w:type="spellEnd"/>
+      <w:r>
+        <w:t>("b",6,1,Colour.</w:t>
+      </w:r>
+      <w:r>
+        <w:rPr>
+          <w:i/>
+          <w:iCs/>
+        </w:rPr>
+        <w:t>Black</w:t>
+      </w:r>
+      <w:r>
+        <w:t>);</w:t>
+      </w:r>
+      <w:r>
+        <w:br/>
+      </w:r>
+      <w:r>
+        <w:br/>
+        <w:t xml:space="preserve">                </w:t>
+      </w:r>
+      <w:proofErr w:type="spellStart"/>
+      <w:r>
+        <w:t>Pawn</w:t>
+      </w:r>
+      <w:proofErr w:type="spellEnd"/>
+      <w:r>
+        <w:t xml:space="preserve"> bp1 = </w:t>
+      </w:r>
+      <w:proofErr w:type="spellStart"/>
+      <w:r>
+        <w:t>new</w:t>
+      </w:r>
+      <w:proofErr w:type="spellEnd"/>
+      <w:r>
+        <w:t xml:space="preserve"> </w:t>
+      </w:r>
+      <w:proofErr w:type="spellStart"/>
+      <w:r>
+        <w:t>Pawn</w:t>
+      </w:r>
+      <w:proofErr w:type="spellEnd"/>
+      <w:r>
+        <w:t>("p",5,1,Colour.</w:t>
+      </w:r>
+      <w:r>
+        <w:rPr>
+          <w:i/>
+          <w:iCs/>
+        </w:rPr>
+        <w:t>Black</w:t>
+      </w:r>
+      <w:r>
+        <w:t>,2);</w:t>
+      </w:r>
+      <w:r>
+        <w:br/>
+        <w:t xml:space="preserve">                </w:t>
+      </w:r>
+      <w:proofErr w:type="spellStart"/>
+      <w:r>
+        <w:t>Pawn</w:t>
+      </w:r>
+      <w:proofErr w:type="spellEnd"/>
+      <w:r>
+        <w:t xml:space="preserve"> bp2 = </w:t>
+      </w:r>
+      <w:proofErr w:type="spellStart"/>
+      <w:r>
+        <w:t>new</w:t>
+      </w:r>
+      <w:proofErr w:type="spellEnd"/>
+      <w:r>
+        <w:t xml:space="preserve"> </w:t>
+      </w:r>
+      <w:proofErr w:type="spellStart"/>
+      <w:r>
+        <w:t>Pawn</w:t>
+      </w:r>
+      <w:proofErr w:type="spellEnd"/>
+      <w:r>
+        <w:t>("p",3,1,Colour.</w:t>
+      </w:r>
+      <w:r>
+        <w:rPr>
+          <w:i/>
+          <w:iCs/>
+        </w:rPr>
+        <w:t>Black</w:t>
+      </w:r>
+      <w:r>
+        <w:t>,2);</w:t>
+      </w:r>
+      <w:r>
+        <w:br/>
+      </w:r>
+      <w:r>
+        <w:br/>
+      </w:r>
+      <w:r>
+        <w:br/>
+        <w:t xml:space="preserve">                //</w:t>
+      </w:r>
+      <w:proofErr w:type="spellStart"/>
+      <w:r>
+        <w:t>other</w:t>
+      </w:r>
+      <w:proofErr w:type="spellEnd"/>
+      <w:r>
+        <w:br/>
+        <w:t xml:space="preserve">                </w:t>
+      </w:r>
+      <w:proofErr w:type="spellStart"/>
+      <w:r>
+        <w:t>RestartPiece</w:t>
+      </w:r>
+      <w:proofErr w:type="spellEnd"/>
+      <w:r>
+        <w:t xml:space="preserve"> </w:t>
+      </w:r>
+      <w:proofErr w:type="spellStart"/>
+      <w:r>
+        <w:t>restartPiece</w:t>
+      </w:r>
+      <w:proofErr w:type="spellEnd"/>
+      <w:r>
+        <w:t xml:space="preserve"> = </w:t>
+      </w:r>
+      <w:proofErr w:type="spellStart"/>
+      <w:r>
+        <w:t>new</w:t>
+      </w:r>
+      <w:proofErr w:type="spellEnd"/>
+      <w:r>
+        <w:t xml:space="preserve"> </w:t>
+      </w:r>
+      <w:proofErr w:type="spellStart"/>
+      <w:r>
+        <w:t>RestartPiece</w:t>
+      </w:r>
+      <w:proofErr w:type="spellEnd"/>
+      <w:r>
+        <w:t>("restart",9,9,Colour.</w:t>
+      </w:r>
+      <w:r>
+        <w:rPr>
+          <w:i/>
+          <w:iCs/>
+        </w:rPr>
+        <w:t>White</w:t>
+      </w:r>
+      <w:r>
+        <w:t>);</w:t>
+      </w:r>
+      <w:r>
+        <w:br/>
+        <w:t xml:space="preserve">                </w:t>
+      </w:r>
+      <w:proofErr w:type="spellStart"/>
+      <w:r>
+        <w:t>TutorialPiece</w:t>
+      </w:r>
+      <w:proofErr w:type="spellEnd"/>
+      <w:r>
+        <w:t xml:space="preserve"> </w:t>
+      </w:r>
+      <w:proofErr w:type="spellStart"/>
+      <w:r>
+        <w:t>tutorialPiece</w:t>
+      </w:r>
+      <w:proofErr w:type="spellEnd"/>
+      <w:r>
+        <w:t xml:space="preserve"> = </w:t>
+      </w:r>
+      <w:proofErr w:type="spellStart"/>
+      <w:r>
+        <w:t>new</w:t>
+      </w:r>
+      <w:proofErr w:type="spellEnd"/>
+      <w:r>
+        <w:t xml:space="preserve"> </w:t>
+      </w:r>
+      <w:proofErr w:type="spellStart"/>
+      <w:r>
+        <w:t>TutorialPiece</w:t>
+      </w:r>
+      <w:proofErr w:type="spellEnd"/>
+      <w:r>
+        <w:t>("</w:t>
+      </w:r>
+      <w:proofErr w:type="spellStart"/>
+      <w:r>
+        <w:t>Push</w:t>
+      </w:r>
+      <w:proofErr w:type="spellEnd"/>
+      <w:r>
+        <w:t xml:space="preserve"> Land </w:t>
+      </w:r>
+      <w:proofErr w:type="spellStart"/>
+      <w:r>
+        <w:t>carrier</w:t>
+      </w:r>
+      <w:proofErr w:type="spellEnd"/>
+      <w:r>
+        <w:t xml:space="preserve"> \\n and </w:t>
+      </w:r>
+      <w:proofErr w:type="spellStart"/>
+      <w:r>
+        <w:t>promote</w:t>
+      </w:r>
+      <w:proofErr w:type="spellEnd"/>
+      <w:r>
+        <w:t xml:space="preserve"> </w:t>
+      </w:r>
+      <w:proofErr w:type="spellStart"/>
+      <w:r>
+        <w:t>pawns</w:t>
+      </w:r>
+      <w:proofErr w:type="spellEnd"/>
+      <w:r>
+        <w:t xml:space="preserve"> \\n to </w:t>
+      </w:r>
+      <w:proofErr w:type="spellStart"/>
+      <w:r>
+        <w:t>checkmate</w:t>
+      </w:r>
+      <w:proofErr w:type="spellEnd"/>
+      <w:r>
+        <w:t xml:space="preserve"> emperor.",9,7);</w:t>
+      </w:r>
+      <w:r>
+        <w:br/>
+      </w:r>
+      <w:r>
+        <w:br/>
+      </w:r>
+      <w:r>
+        <w:br/>
+      </w:r>
+      <w:r>
+        <w:br/>
+      </w:r>
+      <w:r>
+        <w:br/>
+      </w:r>
+      <w:r>
+        <w:lastRenderedPageBreak/>
+        <w:t>//konec inicializace figur</w:t>
+      </w:r>
+      <w:r>
+        <w:br/>
+      </w:r>
+      <w:r>
+        <w:br/>
+      </w:r>
+      <w:r>
+        <w:br/>
+        <w:t>//inicializace šachovnice</w:t>
+      </w:r>
+      <w:r>
+        <w:br/>
+      </w:r>
+      <w:r>
+        <w:br/>
+        <w:t xml:space="preserve">                </w:t>
+      </w:r>
+      <w:proofErr w:type="spellStart"/>
+      <w:r>
+        <w:t>ChessBoard</w:t>
+      </w:r>
+      <w:proofErr w:type="spellEnd"/>
+      <w:r>
+        <w:t xml:space="preserve"> </w:t>
+      </w:r>
+      <w:proofErr w:type="spellStart"/>
+      <w:r>
+        <w:t>chessBoard</w:t>
+      </w:r>
+      <w:proofErr w:type="spellEnd"/>
+      <w:r>
+        <w:t xml:space="preserve"> = </w:t>
+      </w:r>
+      <w:proofErr w:type="spellStart"/>
+      <w:r>
+        <w:t>new</w:t>
+      </w:r>
+      <w:proofErr w:type="spellEnd"/>
+      <w:r>
+        <w:t xml:space="preserve"> </w:t>
+      </w:r>
+      <w:proofErr w:type="spellStart"/>
+      <w:r>
+        <w:t>ChessBoard</w:t>
+      </w:r>
+      <w:proofErr w:type="spellEnd"/>
+      <w:r>
+        <w:t>(10,10);</w:t>
+      </w:r>
+      <w:r>
+        <w:br/>
+      </w:r>
+      <w:r>
+        <w:br/>
+        <w:t xml:space="preserve">                </w:t>
+      </w:r>
+      <w:proofErr w:type="spellStart"/>
+      <w:r>
+        <w:t>for</w:t>
+      </w:r>
+      <w:proofErr w:type="spellEnd"/>
+      <w:r>
+        <w:t>(</w:t>
+      </w:r>
+      <w:proofErr w:type="spellStart"/>
+      <w:r>
+        <w:t>int</w:t>
+      </w:r>
+      <w:proofErr w:type="spellEnd"/>
+      <w:r>
+        <w:t xml:space="preserve"> i =0;i&lt;7;i++) {</w:t>
+      </w:r>
+      <w:r>
+        <w:br/>
+        <w:t xml:space="preserve">                    </w:t>
+      </w:r>
+      <w:proofErr w:type="spellStart"/>
+      <w:r>
+        <w:t>chessBoard.addPromotionSquares</w:t>
+      </w:r>
+      <w:proofErr w:type="spellEnd"/>
+      <w:r>
+        <w:t xml:space="preserve">(i, 0, </w:t>
+      </w:r>
+      <w:proofErr w:type="spellStart"/>
+      <w:r>
+        <w:t>Colour.</w:t>
+      </w:r>
+      <w:r>
+        <w:rPr>
+          <w:i/>
+          <w:iCs/>
+        </w:rPr>
+        <w:t>White</w:t>
+      </w:r>
+      <w:proofErr w:type="spellEnd"/>
+      <w:r>
+        <w:t>);</w:t>
+      </w:r>
+      <w:r>
+        <w:br/>
+        <w:t xml:space="preserve">                    </w:t>
+      </w:r>
+      <w:proofErr w:type="spellStart"/>
+      <w:r>
+        <w:t>chessBoard.addPromotionSquares</w:t>
+      </w:r>
+      <w:proofErr w:type="spellEnd"/>
+      <w:r>
+        <w:t xml:space="preserve">(i, 9, </w:t>
+      </w:r>
+      <w:proofErr w:type="spellStart"/>
+      <w:r>
+        <w:t>Colour.</w:t>
+      </w:r>
+      <w:r>
+        <w:rPr>
+          <w:i/>
+          <w:iCs/>
+        </w:rPr>
+        <w:t>Black</w:t>
+      </w:r>
+      <w:proofErr w:type="spellEnd"/>
+      <w:r>
+        <w:t>);</w:t>
+      </w:r>
+      <w:r>
+        <w:br/>
+        <w:t xml:space="preserve">                }</w:t>
+      </w:r>
+      <w:r>
+        <w:br/>
+      </w:r>
+      <w:r>
+        <w:br/>
+        <w:t xml:space="preserve">                </w:t>
+      </w:r>
+      <w:proofErr w:type="spellStart"/>
+      <w:r>
+        <w:t>for</w:t>
+      </w:r>
+      <w:proofErr w:type="spellEnd"/>
+      <w:r>
+        <w:t>(</w:t>
+      </w:r>
+      <w:proofErr w:type="spellStart"/>
+      <w:r>
+        <w:t>int</w:t>
+      </w:r>
+      <w:proofErr w:type="spellEnd"/>
+      <w:r>
+        <w:t xml:space="preserve"> i =0;i&lt;7;i++) {</w:t>
+      </w:r>
+      <w:r>
+        <w:br/>
+        <w:t xml:space="preserve">                    </w:t>
+      </w:r>
+      <w:proofErr w:type="spellStart"/>
+      <w:r>
+        <w:t>for</w:t>
+      </w:r>
+      <w:proofErr w:type="spellEnd"/>
+      <w:r>
+        <w:t xml:space="preserve"> (</w:t>
+      </w:r>
+      <w:proofErr w:type="spellStart"/>
+      <w:r>
+        <w:t>int</w:t>
+      </w:r>
+      <w:proofErr w:type="spellEnd"/>
+      <w:r>
+        <w:t xml:space="preserve"> j = 2; j &lt; 8; j++) {</w:t>
+      </w:r>
+      <w:r>
+        <w:br/>
+        <w:t xml:space="preserve">                    </w:t>
+      </w:r>
+      <w:proofErr w:type="spellStart"/>
+      <w:r>
+        <w:t>chessBoard.addWaterSquares</w:t>
+      </w:r>
+      <w:proofErr w:type="spellEnd"/>
+      <w:r>
+        <w:t>(i, j);</w:t>
+      </w:r>
+      <w:r>
+        <w:br/>
+        <w:t xml:space="preserve">                }</w:t>
+      </w:r>
+      <w:r>
+        <w:br/>
+        <w:t xml:space="preserve">                }</w:t>
+      </w:r>
+      <w:r>
+        <w:br/>
+      </w:r>
+      <w:r>
+        <w:br/>
+        <w:t xml:space="preserve">                </w:t>
+      </w:r>
+      <w:proofErr w:type="spellStart"/>
+      <w:r>
+        <w:t>for</w:t>
+      </w:r>
+      <w:proofErr w:type="spellEnd"/>
+      <w:r>
+        <w:t>(</w:t>
+      </w:r>
+      <w:proofErr w:type="spellStart"/>
+      <w:r>
+        <w:t>int</w:t>
+      </w:r>
+      <w:proofErr w:type="spellEnd"/>
+      <w:r>
+        <w:t xml:space="preserve"> i =0;i&lt;10;i++) {</w:t>
+      </w:r>
+      <w:r>
+        <w:br/>
+        <w:t xml:space="preserve">                    </w:t>
+      </w:r>
+      <w:proofErr w:type="spellStart"/>
+      <w:r>
+        <w:t>chessBoard.addPiece</w:t>
+      </w:r>
+      <w:proofErr w:type="spellEnd"/>
+      <w:r>
+        <w:t>(</w:t>
+      </w:r>
+      <w:proofErr w:type="spellStart"/>
+      <w:r>
+        <w:t>new</w:t>
+      </w:r>
+      <w:proofErr w:type="spellEnd"/>
+      <w:r>
+        <w:t xml:space="preserve"> </w:t>
+      </w:r>
+      <w:proofErr w:type="spellStart"/>
+      <w:r>
+        <w:t>Blocade</w:t>
+      </w:r>
+      <w:proofErr w:type="spellEnd"/>
+      <w:r>
+        <w:t>("blocade",7, i ));</w:t>
+      </w:r>
+      <w:r>
+        <w:br/>
+        <w:t xml:space="preserve">                    </w:t>
+      </w:r>
+      <w:proofErr w:type="spellStart"/>
+      <w:r>
+        <w:t>chessBoard.addPiece</w:t>
+      </w:r>
+      <w:proofErr w:type="spellEnd"/>
+      <w:r>
+        <w:t>(</w:t>
+      </w:r>
+      <w:proofErr w:type="spellStart"/>
+      <w:r>
+        <w:t>new</w:t>
+      </w:r>
+      <w:proofErr w:type="spellEnd"/>
+      <w:r>
+        <w:t xml:space="preserve"> </w:t>
+      </w:r>
+      <w:proofErr w:type="spellStart"/>
+      <w:r>
+        <w:t>Blocade</w:t>
+      </w:r>
+      <w:proofErr w:type="spellEnd"/>
+      <w:r>
+        <w:t>("blocade",8, i ));</w:t>
+      </w:r>
+      <w:r>
+        <w:br/>
+        <w:t xml:space="preserve">                }</w:t>
+      </w:r>
+      <w:r>
+        <w:br/>
+        <w:t xml:space="preserve">                </w:t>
+      </w:r>
+      <w:proofErr w:type="spellStart"/>
+      <w:r>
+        <w:t>for</w:t>
+      </w:r>
+      <w:proofErr w:type="spellEnd"/>
+      <w:r>
+        <w:t>(</w:t>
+      </w:r>
+      <w:proofErr w:type="spellStart"/>
+      <w:r>
+        <w:t>int</w:t>
+      </w:r>
+      <w:proofErr w:type="spellEnd"/>
+      <w:r>
+        <w:t xml:space="preserve"> i =0;i&lt;7;i++) {</w:t>
+      </w:r>
+      <w:r>
+        <w:br/>
+        <w:t xml:space="preserve">                    </w:t>
+      </w:r>
+      <w:proofErr w:type="spellStart"/>
+      <w:r>
+        <w:t>chessBoard.addPiece</w:t>
+      </w:r>
+      <w:proofErr w:type="spellEnd"/>
+      <w:r>
+        <w:t>(</w:t>
+      </w:r>
+      <w:proofErr w:type="spellStart"/>
+      <w:r>
+        <w:t>new</w:t>
+      </w:r>
+      <w:proofErr w:type="spellEnd"/>
+      <w:r>
+        <w:t xml:space="preserve"> </w:t>
+      </w:r>
+      <w:proofErr w:type="spellStart"/>
+      <w:r>
+        <w:t>Blocade</w:t>
+      </w:r>
+      <w:proofErr w:type="spellEnd"/>
+      <w:r>
+        <w:t>("blocade",9, i ));</w:t>
+      </w:r>
+      <w:r>
+        <w:br/>
+        <w:t xml:space="preserve">                }</w:t>
+      </w:r>
+      <w:r>
+        <w:br/>
+      </w:r>
+      <w:r>
+        <w:br/>
+      </w:r>
+      <w:r>
+        <w:br/>
+        <w:t xml:space="preserve">                </w:t>
+      </w:r>
+      <w:proofErr w:type="spellStart"/>
+      <w:r>
+        <w:t>chessBoard.addPiece</w:t>
+      </w:r>
+      <w:proofErr w:type="spellEnd"/>
+      <w:r>
+        <w:t>(wp1);</w:t>
+      </w:r>
+      <w:r>
+        <w:br/>
+        <w:t xml:space="preserve">                </w:t>
+      </w:r>
+      <w:proofErr w:type="spellStart"/>
+      <w:r>
+        <w:t>chessBoard.addPiece</w:t>
+      </w:r>
+      <w:proofErr w:type="spellEnd"/>
+      <w:r>
+        <w:t>(wp2);</w:t>
+      </w:r>
+      <w:r>
+        <w:br/>
+        <w:t xml:space="preserve">                </w:t>
+      </w:r>
+      <w:proofErr w:type="spellStart"/>
+      <w:r>
+        <w:t>chessBoard.addPiece</w:t>
+      </w:r>
+      <w:proofErr w:type="spellEnd"/>
+      <w:r>
+        <w:t>(wp3);</w:t>
+      </w:r>
+      <w:r>
+        <w:br/>
+      </w:r>
+      <w:r>
+        <w:br/>
+        <w:t xml:space="preserve">                </w:t>
+      </w:r>
+      <w:proofErr w:type="spellStart"/>
+      <w:r>
+        <w:t>chessBoard.addPiece</w:t>
+      </w:r>
+      <w:proofErr w:type="spellEnd"/>
+      <w:r>
+        <w:t>(g1);</w:t>
+      </w:r>
+      <w:r>
+        <w:br/>
+        <w:t xml:space="preserve">                </w:t>
+      </w:r>
+      <w:proofErr w:type="spellStart"/>
+      <w:r>
+        <w:t>chessBoard.addPiece</w:t>
+      </w:r>
+      <w:proofErr w:type="spellEnd"/>
+      <w:r>
+        <w:t>(g2);</w:t>
+      </w:r>
+      <w:r>
+        <w:br/>
+        <w:t xml:space="preserve">                </w:t>
+      </w:r>
+      <w:proofErr w:type="spellStart"/>
+      <w:r>
+        <w:t>chessBoard.addPiece</w:t>
+      </w:r>
+      <w:proofErr w:type="spellEnd"/>
+      <w:r>
+        <w:t>(c);</w:t>
+      </w:r>
+      <w:r>
+        <w:br/>
+        <w:t xml:space="preserve">                </w:t>
+      </w:r>
+      <w:proofErr w:type="spellStart"/>
+      <w:r>
+        <w:t>chessBoard.addPiece</w:t>
+      </w:r>
+      <w:proofErr w:type="spellEnd"/>
+      <w:r>
+        <w:t>(</w:t>
+      </w:r>
+      <w:proofErr w:type="spellStart"/>
+      <w:r>
+        <w:t>wk</w:t>
+      </w:r>
+      <w:proofErr w:type="spellEnd"/>
+      <w:r>
+        <w:t>);</w:t>
+      </w:r>
+      <w:r>
+        <w:br/>
+      </w:r>
+      <w:r>
+        <w:br/>
+        <w:t xml:space="preserve">                </w:t>
+      </w:r>
+      <w:proofErr w:type="spellStart"/>
+      <w:r>
+        <w:t>chessBoard.addPiece</w:t>
+      </w:r>
+      <w:proofErr w:type="spellEnd"/>
+      <w:r>
+        <w:t>(</w:t>
+      </w:r>
+      <w:proofErr w:type="spellStart"/>
+      <w:r>
+        <w:t>bk</w:t>
+      </w:r>
+      <w:proofErr w:type="spellEnd"/>
+      <w:r>
+        <w:t>);</w:t>
+      </w:r>
+      <w:r>
+        <w:br/>
+        <w:t xml:space="preserve">                </w:t>
+      </w:r>
+      <w:proofErr w:type="spellStart"/>
+      <w:r>
+        <w:t>chessBoard.addPiece</w:t>
+      </w:r>
+      <w:proofErr w:type="spellEnd"/>
+      <w:r>
+        <w:t>(b1);</w:t>
+      </w:r>
+      <w:r>
+        <w:br/>
+        <w:t xml:space="preserve">                </w:t>
+      </w:r>
+      <w:proofErr w:type="spellStart"/>
+      <w:r>
+        <w:t>chessBoard.addPiece</w:t>
+      </w:r>
+      <w:proofErr w:type="spellEnd"/>
+      <w:r>
+        <w:t>(b2);</w:t>
+      </w:r>
+      <w:r>
+        <w:br/>
+      </w:r>
+      <w:r>
+        <w:br/>
+        <w:t xml:space="preserve">                </w:t>
+      </w:r>
+      <w:proofErr w:type="spellStart"/>
+      <w:r>
+        <w:t>chessBoard.addPiece</w:t>
+      </w:r>
+      <w:proofErr w:type="spellEnd"/>
+      <w:r>
+        <w:t>(bp1);</w:t>
+      </w:r>
+      <w:r>
+        <w:br/>
+      </w:r>
+      <w:r>
+        <w:lastRenderedPageBreak/>
+        <w:t xml:space="preserve">                </w:t>
+      </w:r>
+      <w:proofErr w:type="spellStart"/>
+      <w:r>
+        <w:t>chessBoard.addPiece</w:t>
+      </w:r>
+      <w:proofErr w:type="spellEnd"/>
+      <w:r>
+        <w:t>(bp2);</w:t>
+      </w:r>
+      <w:r>
+        <w:br/>
+      </w:r>
+      <w:r>
+        <w:br/>
+      </w:r>
+      <w:r>
+        <w:br/>
+        <w:t xml:space="preserve">                </w:t>
+      </w:r>
+      <w:proofErr w:type="spellStart"/>
+      <w:r>
+        <w:t>chessBoard.addPlayer</w:t>
+      </w:r>
+      <w:proofErr w:type="spellEnd"/>
+      <w:r>
+        <w:t>(player1);</w:t>
+      </w:r>
+      <w:r>
+        <w:br/>
+        <w:t xml:space="preserve">                </w:t>
+      </w:r>
+      <w:proofErr w:type="spellStart"/>
+      <w:r>
+        <w:t>chessBoard.addPlayer</w:t>
+      </w:r>
+      <w:proofErr w:type="spellEnd"/>
+      <w:r>
+        <w:t>(player2);</w:t>
+      </w:r>
+      <w:r>
+        <w:br/>
+      </w:r>
+      <w:r>
+        <w:br/>
+        <w:t xml:space="preserve">                </w:t>
+      </w:r>
+      <w:proofErr w:type="spellStart"/>
+      <w:r>
+        <w:t>chessBoard.addPiece</w:t>
+      </w:r>
+      <w:proofErr w:type="spellEnd"/>
+      <w:r>
+        <w:t>(</w:t>
+      </w:r>
+      <w:proofErr w:type="spellStart"/>
+      <w:r>
+        <w:t>restartPiece</w:t>
+      </w:r>
+      <w:proofErr w:type="spellEnd"/>
+      <w:r>
+        <w:t>);</w:t>
+      </w:r>
+      <w:r>
+        <w:br/>
+        <w:t xml:space="preserve">                </w:t>
+      </w:r>
+      <w:proofErr w:type="spellStart"/>
+      <w:r>
+        <w:t>chessBoard.addPiece</w:t>
+      </w:r>
+      <w:proofErr w:type="spellEnd"/>
+      <w:r>
+        <w:t>(</w:t>
+      </w:r>
+      <w:proofErr w:type="spellStart"/>
+      <w:r>
+        <w:t>tutorialPiece</w:t>
+      </w:r>
+      <w:proofErr w:type="spellEnd"/>
+      <w:r>
+        <w:t>);</w:t>
+      </w:r>
+      <w:r>
+        <w:br/>
+      </w:r>
+      <w:r>
+        <w:br/>
+      </w:r>
+      <w:r>
+        <w:br/>
       </w:r>
       <w:r>
         <w:br/>
@@ -13318,7 +14590,7 @@
             <w:rPr>
               <w:rFonts w:eastAsiaTheme="minorEastAsia"/>
               <w:noProof/>
-              <w:lang w:val="en-GB" w:eastAsia="en-GB"/>
+              <w:lang w:eastAsia="cs-CZ"/>
             </w:rPr>
           </w:pPr>
           <w:r>
@@ -13330,7 +14602,7 @@
           <w:r>
             <w:fldChar w:fldCharType="separate"/>
           </w:r>
-          <w:hyperlink w:anchor="_Toc239881626" w:history="1">
+          <w:hyperlink w:anchor="_Toc241172253" w:history="1">
             <w:r>
               <w:rPr>
                 <w:rStyle w:val="Hypertextovodkaz"/>
@@ -13357,7 +14629,7 @@
                 <w:noProof/>
                 <w:webHidden/>
               </w:rPr>
-              <w:instrText xml:space="preserve"> PAGEREF _Toc239881626 \h </w:instrText>
+              <w:instrText xml:space="preserve"> PAGEREF _Toc241172253 \h </w:instrText>
             </w:r>
             <w:r>
               <w:rPr>
@@ -13397,10 +14669,10 @@
             <w:rPr>
               <w:rFonts w:eastAsiaTheme="minorEastAsia"/>
               <w:noProof/>
-              <w:lang w:val="en-GB" w:eastAsia="en-GB"/>
+              <w:lang w:eastAsia="cs-CZ"/>
             </w:rPr>
           </w:pPr>
-          <w:hyperlink w:anchor="_Toc239881627" w:history="1">
+          <w:hyperlink w:anchor="_Toc241172254" w:history="1">
             <w:r>
               <w:rPr>
                 <w:rStyle w:val="Hypertextovodkaz"/>
@@ -13427,7 +14699,7 @@
                 <w:noProof/>
                 <w:webHidden/>
               </w:rPr>
-              <w:instrText xml:space="preserve"> PAGEREF _Toc239881627 \h </w:instrText>
+              <w:instrText xml:space="preserve"> PAGEREF _Toc241172254 \h </w:instrText>
             </w:r>
             <w:r>
               <w:rPr>
@@ -13467,10 +14739,10 @@
             <w:rPr>
               <w:rFonts w:eastAsiaTheme="minorEastAsia"/>
               <w:noProof/>
-              <w:lang w:val="en-GB" w:eastAsia="en-GB"/>
+              <w:lang w:eastAsia="cs-CZ"/>
             </w:rPr>
           </w:pPr>
-          <w:hyperlink w:anchor="_Toc239881628" w:history="1">
+          <w:hyperlink w:anchor="_Toc241172255" w:history="1">
             <w:r>
               <w:rPr>
                 <w:rStyle w:val="Hypertextovodkaz"/>
@@ -13497,7 +14769,7 @@
                 <w:noProof/>
                 <w:webHidden/>
               </w:rPr>
-              <w:instrText xml:space="preserve"> PAGEREF _Toc239881628 \h </w:instrText>
+              <w:instrText xml:space="preserve"> PAGEREF _Toc241172255 \h </w:instrText>
             </w:r>
             <w:r>
               <w:rPr>
@@ -13537,10 +14809,10 @@
             <w:rPr>
               <w:rFonts w:eastAsiaTheme="minorEastAsia"/>
               <w:noProof/>
-              <w:lang w:val="en-GB" w:eastAsia="en-GB"/>
+              <w:lang w:eastAsia="cs-CZ"/>
             </w:rPr>
           </w:pPr>
-          <w:hyperlink w:anchor="_Toc239881629" w:history="1">
+          <w:hyperlink w:anchor="_Toc241172256" w:history="1">
             <w:r>
               <w:rPr>
                 <w:rStyle w:val="Hypertextovodkaz"/>
@@ -13567,7 +14839,7 @@
                 <w:noProof/>
                 <w:webHidden/>
               </w:rPr>
-              <w:instrText xml:space="preserve"> PAGEREF _Toc239881629 \h </w:instrText>
+              <w:instrText xml:space="preserve"> PAGEREF _Toc241172256 \h </w:instrText>
             </w:r>
             <w:r>
               <w:rPr>
@@ -13607,10 +14879,10 @@
             <w:rPr>
               <w:rFonts w:eastAsiaTheme="minorEastAsia"/>
               <w:noProof/>
-              <w:lang w:val="en-GB" w:eastAsia="en-GB"/>
+              <w:lang w:eastAsia="cs-CZ"/>
             </w:rPr>
           </w:pPr>
-          <w:hyperlink w:anchor="_Toc239881630" w:history="1">
+          <w:hyperlink w:anchor="_Toc241172257" w:history="1">
             <w:r>
               <w:rPr>
                 <w:rStyle w:val="Hypertextovodkaz"/>
@@ -13637,7 +14909,7 @@
                 <w:noProof/>
                 <w:webHidden/>
               </w:rPr>
-              <w:instrText xml:space="preserve"> PAGEREF _Toc239881630 \h </w:instrText>
+              <w:instrText xml:space="preserve"> PAGEREF _Toc241172257 \h </w:instrText>
             </w:r>
             <w:r>
               <w:rPr>
@@ -13677,16 +14949,16 @@
             <w:rPr>
               <w:rFonts w:eastAsiaTheme="minorEastAsia"/>
               <w:noProof/>
-              <w:lang w:val="en-GB" w:eastAsia="en-GB"/>
+              <w:lang w:eastAsia="cs-CZ"/>
             </w:rPr>
           </w:pPr>
-          <w:hyperlink w:anchor="_Toc239881631" w:history="1">
+          <w:hyperlink w:anchor="_Toc241172258" w:history="1">
             <w:r>
               <w:rPr>
                 <w:rStyle w:val="Hypertextovodkaz"/>
                 <w:noProof/>
               </w:rPr>
-              <w:t>tutorial - Kill all kings as white - Map 0</w:t>
+              <w:t>The discovery of America</w:t>
             </w:r>
             <w:r>
               <w:rPr>
@@ -13707,7 +14979,7 @@
                 <w:noProof/>
                 <w:webHidden/>
               </w:rPr>
-              <w:instrText xml:space="preserve"> PAGEREF _Toc239881631 \h </w:instrText>
+              <w:instrText xml:space="preserve"> PAGEREF _Toc241172258 \h </w:instrText>
             </w:r>
             <w:r>
               <w:rPr>
@@ -13727,7 +14999,7 @@
                 <w:noProof/>
                 <w:webHidden/>
               </w:rPr>
-              <w:t>15</w:t>
+              <w:t>19</w:t>
             </w:r>
             <w:r>
               <w:rPr>

</xml_diff>

<commit_message>
V 146 Repaired Counting heads and colours .,
</commit_message>
<xml_diff>
--- a/chess setups.DOCX
+++ b/chess setups.DOCX
@@ -30,12 +30,17 @@
         <w:t xml:space="preserve"> </w:t>
       </w:r>
       <w:proofErr w:type="spellStart"/>
+      <w:proofErr w:type="gramStart"/>
       <w:r>
         <w:t>Player</w:t>
       </w:r>
       <w:proofErr w:type="spellEnd"/>
       <w:r>
-        <w:t xml:space="preserve">("Bílý", </w:t>
+        <w:t>(</w:t>
+      </w:r>
+      <w:proofErr w:type="gramEnd"/>
+      <w:r>
+        <w:t xml:space="preserve">"Bílý", </w:t>
       </w:r>
       <w:proofErr w:type="spellStart"/>
       <w:r>
@@ -72,12 +77,17 @@
         <w:t xml:space="preserve"> </w:t>
       </w:r>
       <w:proofErr w:type="spellStart"/>
+      <w:proofErr w:type="gramStart"/>
       <w:r>
         <w:t>Player</w:t>
       </w:r>
       <w:proofErr w:type="spellEnd"/>
       <w:r>
-        <w:t xml:space="preserve">("Černý", </w:t>
+        <w:t>(</w:t>
+      </w:r>
+      <w:proofErr w:type="gramEnd"/>
+      <w:r>
+        <w:t xml:space="preserve">"Černý", </w:t>
       </w:r>
       <w:proofErr w:type="spellStart"/>
       <w:r>
@@ -2336,7 +2346,15 @@
       </w:pPr>
       <w:bookmarkStart w:id="1" w:name="_Toc241172254"/>
       <w:r>
-        <w:t>fighter defense - map 1</w:t>
+        <w:t xml:space="preserve">fighter </w:t>
+      </w:r>
+      <w:proofErr w:type="gramStart"/>
+      <w:r>
+        <w:t>defense - map</w:t>
+      </w:r>
+      <w:proofErr w:type="gramEnd"/>
+      <w:r>
+        <w:t xml:space="preserve"> 1</w:t>
       </w:r>
       <w:bookmarkEnd w:id="1"/>
     </w:p>
@@ -10229,6 +10247,7 @@
         </w:rPr>
       </w:pPr>
       <w:proofErr w:type="spellStart"/>
+      <w:proofErr w:type="gramStart"/>
       <w:r>
         <w:rPr>
           <w:rFonts w:eastAsiaTheme="majorEastAsia" w:cstheme="majorBidi"/>
@@ -10259,6 +10278,7 @@
         <w:t>Kill</w:t>
       </w:r>
       <w:proofErr w:type="spellEnd"/>
+      <w:proofErr w:type="gramEnd"/>
       <w:r>
         <w:rPr>
           <w:rFonts w:eastAsiaTheme="majorEastAsia" w:cstheme="majorBidi"/>
@@ -14519,6 +14539,1001 @@
       <w:r>
         <w:br/>
         <w:t>//konec inicializace šachovnice</w:t>
+      </w:r>
+    </w:p>
+    <w:p>
+      <w:pPr>
+        <w:pStyle w:val="Nadpis3"/>
+      </w:pPr>
+      <w:proofErr w:type="spellStart"/>
+      <w:r>
+        <w:t>first</w:t>
+      </w:r>
+      <w:proofErr w:type="spellEnd"/>
+      <w:r>
+        <w:t xml:space="preserve"> </w:t>
+      </w:r>
+      <w:proofErr w:type="spellStart"/>
+      <w:r>
+        <w:t>flight</w:t>
+      </w:r>
+      <w:proofErr w:type="spellEnd"/>
+    </w:p>
+    <w:p>
+      <w:r>
+        <w:t xml:space="preserve">                </w:t>
+      </w:r>
+      <w:proofErr w:type="spellStart"/>
+      <w:r>
+        <w:t>Player</w:t>
+      </w:r>
+      <w:proofErr w:type="spellEnd"/>
+      <w:r>
+        <w:t xml:space="preserve"> player1 = </w:t>
+      </w:r>
+      <w:proofErr w:type="spellStart"/>
+      <w:r>
+        <w:t>new</w:t>
+      </w:r>
+      <w:proofErr w:type="spellEnd"/>
+      <w:r>
+        <w:t xml:space="preserve"> </w:t>
+      </w:r>
+      <w:proofErr w:type="spellStart"/>
+      <w:r>
+        <w:t>Player</w:t>
+      </w:r>
+      <w:proofErr w:type="spellEnd"/>
+      <w:r>
+        <w:t xml:space="preserve">("Bílý", </w:t>
+      </w:r>
+      <w:proofErr w:type="spellStart"/>
+      <w:r>
+        <w:t>Colour.</w:t>
+      </w:r>
+      <w:r>
+        <w:rPr>
+          <w:i/>
+          <w:iCs/>
+        </w:rPr>
+        <w:t>White</w:t>
+      </w:r>
+      <w:proofErr w:type="spellEnd"/>
+      <w:r>
+        <w:t>, 600);</w:t>
+      </w:r>
+      <w:r>
+        <w:br/>
+        <w:t xml:space="preserve">                </w:t>
+      </w:r>
+      <w:proofErr w:type="spellStart"/>
+      <w:r>
+        <w:t>Player</w:t>
+      </w:r>
+      <w:proofErr w:type="spellEnd"/>
+      <w:r>
+        <w:t xml:space="preserve"> player2 = </w:t>
+      </w:r>
+      <w:proofErr w:type="spellStart"/>
+      <w:r>
+        <w:t>new</w:t>
+      </w:r>
+      <w:proofErr w:type="spellEnd"/>
+      <w:r>
+        <w:t xml:space="preserve"> </w:t>
+      </w:r>
+      <w:proofErr w:type="spellStart"/>
+      <w:r>
+        <w:t>Player</w:t>
+      </w:r>
+      <w:proofErr w:type="spellEnd"/>
+      <w:r>
+        <w:t xml:space="preserve">("Černý", </w:t>
+      </w:r>
+      <w:proofErr w:type="spellStart"/>
+      <w:r>
+        <w:t>Colour.</w:t>
+      </w:r>
+      <w:r>
+        <w:rPr>
+          <w:i/>
+          <w:iCs/>
+        </w:rPr>
+        <w:t>Black</w:t>
+      </w:r>
+      <w:proofErr w:type="spellEnd"/>
+      <w:r>
+        <w:t>, 600);</w:t>
+      </w:r>
+      <w:r>
+        <w:br/>
+      </w:r>
+      <w:r>
+        <w:br/>
+      </w:r>
+      <w:r>
+        <w:br/>
+        <w:t>//inicializace figur</w:t>
+      </w:r>
+      <w:r>
+        <w:br/>
+      </w:r>
+      <w:r>
+        <w:br/>
+        <w:t>//</w:t>
+      </w:r>
+      <w:proofErr w:type="spellStart"/>
+      <w:r>
+        <w:t>white</w:t>
+      </w:r>
+      <w:proofErr w:type="spellEnd"/>
+      <w:r>
+        <w:br/>
+        <w:t xml:space="preserve">                King </w:t>
+      </w:r>
+      <w:proofErr w:type="spellStart"/>
+      <w:r>
+        <w:t>wk</w:t>
+      </w:r>
+      <w:proofErr w:type="spellEnd"/>
+      <w:r>
+        <w:t xml:space="preserve"> = </w:t>
+      </w:r>
+      <w:proofErr w:type="spellStart"/>
+      <w:r>
+        <w:t>new</w:t>
+      </w:r>
+      <w:proofErr w:type="spellEnd"/>
+      <w:r>
+        <w:t xml:space="preserve"> King("k", 3, 6, </w:t>
+      </w:r>
+      <w:proofErr w:type="spellStart"/>
+      <w:r>
+        <w:t>Colour.</w:t>
+      </w:r>
+      <w:r>
+        <w:rPr>
+          <w:i/>
+          <w:iCs/>
+        </w:rPr>
+        <w:t>White</w:t>
+      </w:r>
+      <w:proofErr w:type="spellEnd"/>
+      <w:r>
+        <w:t>, 0);</w:t>
+      </w:r>
+      <w:r>
+        <w:br/>
+        <w:t xml:space="preserve">                </w:t>
+      </w:r>
+      <w:proofErr w:type="spellStart"/>
+      <w:r>
+        <w:t>Airplane</w:t>
+      </w:r>
+      <w:proofErr w:type="spellEnd"/>
+      <w:r>
+        <w:t xml:space="preserve"> a1 = </w:t>
+      </w:r>
+      <w:proofErr w:type="spellStart"/>
+      <w:r>
+        <w:t>new</w:t>
+      </w:r>
+      <w:proofErr w:type="spellEnd"/>
+      <w:r>
+        <w:t xml:space="preserve"> </w:t>
+      </w:r>
+      <w:proofErr w:type="spellStart"/>
+      <w:r>
+        <w:t>Airplane</w:t>
+      </w:r>
+      <w:proofErr w:type="spellEnd"/>
+      <w:r>
+        <w:t xml:space="preserve">("a", 3, 5, </w:t>
+      </w:r>
+      <w:proofErr w:type="spellStart"/>
+      <w:r>
+        <w:t>Colour.</w:t>
+      </w:r>
+      <w:r>
+        <w:rPr>
+          <w:i/>
+          <w:iCs/>
+        </w:rPr>
+        <w:t>White</w:t>
+      </w:r>
+      <w:proofErr w:type="spellEnd"/>
+      <w:r>
+        <w:t>, 2);</w:t>
+      </w:r>
+      <w:r>
+        <w:br/>
+        <w:t xml:space="preserve">                </w:t>
+      </w:r>
+      <w:proofErr w:type="spellStart"/>
+      <w:r>
+        <w:t>Airplane</w:t>
+      </w:r>
+      <w:proofErr w:type="spellEnd"/>
+      <w:r>
+        <w:t xml:space="preserve"> a2 = </w:t>
+      </w:r>
+      <w:proofErr w:type="spellStart"/>
+      <w:r>
+        <w:t>new</w:t>
+      </w:r>
+      <w:proofErr w:type="spellEnd"/>
+      <w:r>
+        <w:t xml:space="preserve"> </w:t>
+      </w:r>
+      <w:proofErr w:type="spellStart"/>
+      <w:r>
+        <w:t>Airplane</w:t>
+      </w:r>
+      <w:proofErr w:type="spellEnd"/>
+      <w:r>
+        <w:t xml:space="preserve">("a", 1, 6, </w:t>
+      </w:r>
+      <w:proofErr w:type="spellStart"/>
+      <w:r>
+        <w:t>Colour.</w:t>
+      </w:r>
+      <w:r>
+        <w:rPr>
+          <w:i/>
+          <w:iCs/>
+        </w:rPr>
+        <w:t>White</w:t>
+      </w:r>
+      <w:proofErr w:type="spellEnd"/>
+      <w:r>
+        <w:t>, 0);</w:t>
+      </w:r>
+      <w:r>
+        <w:br/>
+        <w:t xml:space="preserve">                </w:t>
+      </w:r>
+      <w:proofErr w:type="spellStart"/>
+      <w:r>
+        <w:t>Airplane</w:t>
+      </w:r>
+      <w:proofErr w:type="spellEnd"/>
+      <w:r>
+        <w:t xml:space="preserve"> a3 = </w:t>
+      </w:r>
+      <w:proofErr w:type="spellStart"/>
+      <w:r>
+        <w:t>new</w:t>
+      </w:r>
+      <w:proofErr w:type="spellEnd"/>
+      <w:r>
+        <w:t xml:space="preserve"> </w:t>
+      </w:r>
+      <w:proofErr w:type="spellStart"/>
+      <w:r>
+        <w:t>Airplane</w:t>
+      </w:r>
+      <w:proofErr w:type="spellEnd"/>
+      <w:r>
+        <w:t xml:space="preserve">("a", 5, 6, </w:t>
+      </w:r>
+      <w:proofErr w:type="spellStart"/>
+      <w:r>
+        <w:t>Colour.</w:t>
+      </w:r>
+      <w:r>
+        <w:rPr>
+          <w:i/>
+          <w:iCs/>
+        </w:rPr>
+        <w:t>White</w:t>
+      </w:r>
+      <w:proofErr w:type="spellEnd"/>
+      <w:r>
+        <w:t>, 0);</w:t>
+      </w:r>
+      <w:r>
+        <w:br/>
+      </w:r>
+      <w:r>
+        <w:br/>
+        <w:t>//</w:t>
+      </w:r>
+      <w:proofErr w:type="spellStart"/>
+      <w:r>
+        <w:t>black</w:t>
+      </w:r>
+      <w:proofErr w:type="spellEnd"/>
+      <w:r>
+        <w:br/>
+        <w:t xml:space="preserve">                King </w:t>
+      </w:r>
+      <w:proofErr w:type="spellStart"/>
+      <w:r>
+        <w:t>bk</w:t>
+      </w:r>
+      <w:proofErr w:type="spellEnd"/>
+      <w:r>
+        <w:t xml:space="preserve"> = </w:t>
+      </w:r>
+      <w:proofErr w:type="spellStart"/>
+      <w:r>
+        <w:t>new</w:t>
+      </w:r>
+      <w:proofErr w:type="spellEnd"/>
+      <w:r>
+        <w:t xml:space="preserve"> King("k", 3, 0, </w:t>
+      </w:r>
+      <w:proofErr w:type="spellStart"/>
+      <w:r>
+        <w:t>Colour.</w:t>
+      </w:r>
+      <w:r>
+        <w:rPr>
+          <w:i/>
+          <w:iCs/>
+        </w:rPr>
+        <w:t>Black</w:t>
+      </w:r>
+      <w:proofErr w:type="spellEnd"/>
+      <w:r>
+        <w:t>, 2);</w:t>
+      </w:r>
+      <w:r>
+        <w:br/>
+        <w:t xml:space="preserve">                </w:t>
+      </w:r>
+      <w:proofErr w:type="spellStart"/>
+      <w:r>
+        <w:t>Rook</w:t>
+      </w:r>
+      <w:proofErr w:type="spellEnd"/>
+      <w:r>
+        <w:t xml:space="preserve"> br = </w:t>
+      </w:r>
+      <w:proofErr w:type="spellStart"/>
+      <w:r>
+        <w:t>new</w:t>
+      </w:r>
+      <w:proofErr w:type="spellEnd"/>
+      <w:r>
+        <w:t xml:space="preserve"> </w:t>
+      </w:r>
+      <w:proofErr w:type="spellStart"/>
+      <w:r>
+        <w:t>Rook</w:t>
+      </w:r>
+      <w:proofErr w:type="spellEnd"/>
+      <w:r>
+        <w:t xml:space="preserve">("r", 4, 0, </w:t>
+      </w:r>
+      <w:proofErr w:type="spellStart"/>
+      <w:r>
+        <w:t>Colour.</w:t>
+      </w:r>
+      <w:r>
+        <w:rPr>
+          <w:i/>
+          <w:iCs/>
+        </w:rPr>
+        <w:t>Black</w:t>
+      </w:r>
+      <w:proofErr w:type="spellEnd"/>
+      <w:r>
+        <w:t>);</w:t>
+      </w:r>
+      <w:r>
+        <w:br/>
+      </w:r>
+      <w:r>
+        <w:br/>
+        <w:t>//</w:t>
+      </w:r>
+      <w:proofErr w:type="spellStart"/>
+      <w:r>
+        <w:t>other</w:t>
+      </w:r>
+      <w:proofErr w:type="spellEnd"/>
+      <w:r>
+        <w:br/>
+        <w:t xml:space="preserve">                </w:t>
+      </w:r>
+      <w:proofErr w:type="spellStart"/>
+      <w:r>
+        <w:t>RestartPiece</w:t>
+      </w:r>
+      <w:proofErr w:type="spellEnd"/>
+      <w:r>
+        <w:t xml:space="preserve"> </w:t>
+      </w:r>
+      <w:proofErr w:type="spellStart"/>
+      <w:r>
+        <w:t>restartPiece</w:t>
+      </w:r>
+      <w:proofErr w:type="spellEnd"/>
+      <w:r>
+        <w:t xml:space="preserve"> = </w:t>
+      </w:r>
+      <w:proofErr w:type="spellStart"/>
+      <w:r>
+        <w:t>new</w:t>
+      </w:r>
+      <w:proofErr w:type="spellEnd"/>
+      <w:r>
+        <w:t xml:space="preserve"> </w:t>
+      </w:r>
+      <w:proofErr w:type="spellStart"/>
+      <w:r>
+        <w:t>RestartPiece</w:t>
+      </w:r>
+      <w:proofErr w:type="spellEnd"/>
+      <w:r>
+        <w:t xml:space="preserve">("restart", 9, 7, </w:t>
+      </w:r>
+      <w:proofErr w:type="spellStart"/>
+      <w:r>
+        <w:t>Colour.</w:t>
+      </w:r>
+      <w:r>
+        <w:rPr>
+          <w:i/>
+          <w:iCs/>
+        </w:rPr>
+        <w:t>White</w:t>
+      </w:r>
+      <w:proofErr w:type="spellEnd"/>
+      <w:r>
+        <w:t>);</w:t>
+      </w:r>
+      <w:r>
+        <w:br/>
+        <w:t xml:space="preserve">                </w:t>
+      </w:r>
+      <w:proofErr w:type="spellStart"/>
+      <w:r>
+        <w:t>TutorialPiece</w:t>
+      </w:r>
+      <w:proofErr w:type="spellEnd"/>
+      <w:r>
+        <w:t xml:space="preserve"> </w:t>
+      </w:r>
+      <w:proofErr w:type="spellStart"/>
+      <w:r>
+        <w:t>tutorialPiece</w:t>
+      </w:r>
+      <w:proofErr w:type="spellEnd"/>
+      <w:r>
+        <w:t xml:space="preserve"> = </w:t>
+      </w:r>
+      <w:proofErr w:type="spellStart"/>
+      <w:r>
+        <w:t>new</w:t>
+      </w:r>
+      <w:proofErr w:type="spellEnd"/>
+      <w:r>
+        <w:t xml:space="preserve"> </w:t>
+      </w:r>
+      <w:proofErr w:type="spellStart"/>
+      <w:r>
+        <w:t>TutorialPiece</w:t>
+      </w:r>
+      <w:proofErr w:type="spellEnd"/>
+      <w:r>
+        <w:t>("</w:t>
+      </w:r>
+      <w:proofErr w:type="spellStart"/>
+      <w:r>
+        <w:t>Promote</w:t>
+      </w:r>
+      <w:proofErr w:type="spellEnd"/>
+      <w:r>
+        <w:t xml:space="preserve"> </w:t>
+      </w:r>
+      <w:proofErr w:type="spellStart"/>
+      <w:r>
+        <w:t>airplanes</w:t>
+      </w:r>
+      <w:proofErr w:type="spellEnd"/>
+      <w:r>
+        <w:t xml:space="preserve"> \\nfighter and </w:t>
+      </w:r>
+      <w:proofErr w:type="spellStart"/>
+      <w:r>
+        <w:t>checkmate</w:t>
+      </w:r>
+      <w:proofErr w:type="spellEnd"/>
+      <w:r>
+        <w:t xml:space="preserve"> .\\n </w:t>
+      </w:r>
+      <w:proofErr w:type="spellStart"/>
+      <w:r>
+        <w:t>You</w:t>
+      </w:r>
+      <w:proofErr w:type="spellEnd"/>
+      <w:r>
+        <w:t xml:space="preserve"> </w:t>
+      </w:r>
+      <w:proofErr w:type="spellStart"/>
+      <w:r>
+        <w:t>can</w:t>
+      </w:r>
+      <w:proofErr w:type="spellEnd"/>
+      <w:r>
+        <w:t xml:space="preserve"> use </w:t>
+      </w:r>
+      <w:proofErr w:type="spellStart"/>
+      <w:r>
+        <w:t>rotation</w:t>
+      </w:r>
+      <w:proofErr w:type="spellEnd"/>
+      <w:r>
+        <w:t xml:space="preserve"> .",9,5 );</w:t>
+      </w:r>
+      <w:r>
+        <w:br/>
+      </w:r>
+      <w:r>
+        <w:br/>
+      </w:r>
+      <w:r>
+        <w:br/>
+        <w:t>//inicializace šachovnice</w:t>
+      </w:r>
+      <w:r>
+        <w:br/>
+      </w:r>
+      <w:r>
+        <w:br/>
+        <w:t xml:space="preserve">                </w:t>
+      </w:r>
+      <w:proofErr w:type="spellStart"/>
+      <w:r>
+        <w:t>ChessBoard</w:t>
+      </w:r>
+      <w:proofErr w:type="spellEnd"/>
+      <w:r>
+        <w:t xml:space="preserve"> </w:t>
+      </w:r>
+      <w:proofErr w:type="spellStart"/>
+      <w:r>
+        <w:t>chessBoard</w:t>
+      </w:r>
+      <w:proofErr w:type="spellEnd"/>
+      <w:r>
+        <w:t xml:space="preserve"> = </w:t>
+      </w:r>
+      <w:proofErr w:type="spellStart"/>
+      <w:r>
+        <w:t>new</w:t>
+      </w:r>
+      <w:proofErr w:type="spellEnd"/>
+      <w:r>
+        <w:t xml:space="preserve"> </w:t>
+      </w:r>
+      <w:proofErr w:type="spellStart"/>
+      <w:r>
+        <w:t>ChessBoard</w:t>
+      </w:r>
+      <w:proofErr w:type="spellEnd"/>
+      <w:r>
+        <w:t>(10, 8);</w:t>
+      </w:r>
+      <w:r>
+        <w:br/>
+      </w:r>
+      <w:r>
+        <w:br/>
+        <w:t xml:space="preserve">                </w:t>
+      </w:r>
+      <w:proofErr w:type="spellStart"/>
+      <w:r>
+        <w:t>chessBoard.addPlayer</w:t>
+      </w:r>
+      <w:proofErr w:type="spellEnd"/>
+      <w:r>
+        <w:t>(player1);</w:t>
+      </w:r>
+      <w:r>
+        <w:br/>
+      </w:r>
+      <w:r>
+        <w:lastRenderedPageBreak/>
+        <w:t xml:space="preserve">                </w:t>
+      </w:r>
+      <w:proofErr w:type="spellStart"/>
+      <w:r>
+        <w:t>chessBoard.addPlayer</w:t>
+      </w:r>
+      <w:proofErr w:type="spellEnd"/>
+      <w:r>
+        <w:t>(player2);</w:t>
+      </w:r>
+      <w:r>
+        <w:br/>
+      </w:r>
+      <w:r>
+        <w:br/>
+        <w:t>// blokády</w:t>
+      </w:r>
+      <w:r>
+        <w:br/>
+        <w:t xml:space="preserve">                </w:t>
+      </w:r>
+      <w:proofErr w:type="spellStart"/>
+      <w:r>
+        <w:t>for</w:t>
+      </w:r>
+      <w:proofErr w:type="spellEnd"/>
+      <w:r>
+        <w:t xml:space="preserve"> (</w:t>
+      </w:r>
+      <w:proofErr w:type="spellStart"/>
+      <w:r>
+        <w:t>int</w:t>
+      </w:r>
+      <w:proofErr w:type="spellEnd"/>
+      <w:r>
+        <w:t xml:space="preserve"> i = 0; i &lt; 8; i++) {</w:t>
+      </w:r>
+      <w:r>
+        <w:br/>
+        <w:t xml:space="preserve">                    </w:t>
+      </w:r>
+      <w:proofErr w:type="spellStart"/>
+      <w:r>
+        <w:t>chessBoard.addPiece</w:t>
+      </w:r>
+      <w:proofErr w:type="spellEnd"/>
+      <w:r>
+        <w:t>(</w:t>
+      </w:r>
+      <w:proofErr w:type="spellStart"/>
+      <w:r>
+        <w:t>new</w:t>
+      </w:r>
+      <w:proofErr w:type="spellEnd"/>
+      <w:r>
+        <w:t xml:space="preserve"> </w:t>
+      </w:r>
+      <w:proofErr w:type="spellStart"/>
+      <w:r>
+        <w:t>Blocade</w:t>
+      </w:r>
+      <w:proofErr w:type="spellEnd"/>
+      <w:r>
+        <w:t>("</w:t>
+      </w:r>
+      <w:proofErr w:type="spellStart"/>
+      <w:r>
+        <w:t>blocade</w:t>
+      </w:r>
+      <w:proofErr w:type="spellEnd"/>
+      <w:r>
+        <w:t>", 7, i));</w:t>
+      </w:r>
+      <w:r>
+        <w:br/>
+        <w:t xml:space="preserve">                    </w:t>
+      </w:r>
+      <w:proofErr w:type="spellStart"/>
+      <w:r>
+        <w:t>chessBoard.addPiece</w:t>
+      </w:r>
+      <w:proofErr w:type="spellEnd"/>
+      <w:r>
+        <w:t>(</w:t>
+      </w:r>
+      <w:proofErr w:type="spellStart"/>
+      <w:r>
+        <w:t>new</w:t>
+      </w:r>
+      <w:proofErr w:type="spellEnd"/>
+      <w:r>
+        <w:t xml:space="preserve"> </w:t>
+      </w:r>
+      <w:proofErr w:type="spellStart"/>
+      <w:r>
+        <w:t>Blocade</w:t>
+      </w:r>
+      <w:proofErr w:type="spellEnd"/>
+      <w:r>
+        <w:t>("</w:t>
+      </w:r>
+      <w:proofErr w:type="spellStart"/>
+      <w:r>
+        <w:t>blocade</w:t>
+      </w:r>
+      <w:proofErr w:type="spellEnd"/>
+      <w:r>
+        <w:t>", 8, i));</w:t>
+      </w:r>
+      <w:r>
+        <w:br/>
+        <w:t xml:space="preserve">                }</w:t>
+      </w:r>
+      <w:r>
+        <w:br/>
+        <w:t xml:space="preserve">                </w:t>
+      </w:r>
+      <w:proofErr w:type="spellStart"/>
+      <w:r>
+        <w:t>for</w:t>
+      </w:r>
+      <w:proofErr w:type="spellEnd"/>
+      <w:r>
+        <w:t xml:space="preserve"> (</w:t>
+      </w:r>
+      <w:proofErr w:type="spellStart"/>
+      <w:r>
+        <w:t>int</w:t>
+      </w:r>
+      <w:proofErr w:type="spellEnd"/>
+      <w:r>
+        <w:t xml:space="preserve"> i = 0; i &lt; 5; i++) {</w:t>
+      </w:r>
+      <w:r>
+        <w:br/>
+        <w:t xml:space="preserve">                    </w:t>
+      </w:r>
+      <w:proofErr w:type="spellStart"/>
+      <w:r>
+        <w:t>chessBoard.addPiece</w:t>
+      </w:r>
+      <w:proofErr w:type="spellEnd"/>
+      <w:r>
+        <w:t>(</w:t>
+      </w:r>
+      <w:proofErr w:type="spellStart"/>
+      <w:r>
+        <w:t>new</w:t>
+      </w:r>
+      <w:proofErr w:type="spellEnd"/>
+      <w:r>
+        <w:t xml:space="preserve"> </w:t>
+      </w:r>
+      <w:proofErr w:type="spellStart"/>
+      <w:r>
+        <w:t>Blocade</w:t>
+      </w:r>
+      <w:proofErr w:type="spellEnd"/>
+      <w:r>
+        <w:t>("</w:t>
+      </w:r>
+      <w:proofErr w:type="spellStart"/>
+      <w:r>
+        <w:t>blocade</w:t>
+      </w:r>
+      <w:proofErr w:type="spellEnd"/>
+      <w:r>
+        <w:t>", 9, i));</w:t>
+      </w:r>
+      <w:r>
+        <w:br/>
+        <w:t xml:space="preserve">                }</w:t>
+      </w:r>
+      <w:r>
+        <w:br/>
+      </w:r>
+      <w:r>
+        <w:br/>
+      </w:r>
+      <w:r>
+        <w:br/>
+        <w:t xml:space="preserve">                </w:t>
+      </w:r>
+      <w:proofErr w:type="spellStart"/>
+      <w:r>
+        <w:t>for</w:t>
+      </w:r>
+      <w:proofErr w:type="spellEnd"/>
+      <w:r>
+        <w:t xml:space="preserve"> (</w:t>
+      </w:r>
+      <w:proofErr w:type="spellStart"/>
+      <w:r>
+        <w:t>int</w:t>
+      </w:r>
+      <w:proofErr w:type="spellEnd"/>
+      <w:r>
+        <w:t xml:space="preserve"> i = 0; i &lt; 7; i++) {</w:t>
+      </w:r>
+      <w:r>
+        <w:br/>
+        <w:t xml:space="preserve">                    </w:t>
+      </w:r>
+      <w:proofErr w:type="spellStart"/>
+      <w:r>
+        <w:t>chessBoard.addPromotionSquares</w:t>
+      </w:r>
+      <w:proofErr w:type="spellEnd"/>
+      <w:r>
+        <w:t xml:space="preserve">(i, 0, </w:t>
+      </w:r>
+      <w:proofErr w:type="spellStart"/>
+      <w:r>
+        <w:t>Colour.</w:t>
+      </w:r>
+      <w:r>
+        <w:rPr>
+          <w:i/>
+          <w:iCs/>
+        </w:rPr>
+        <w:t>White</w:t>
+      </w:r>
+      <w:proofErr w:type="spellEnd"/>
+      <w:r>
+        <w:t>);</w:t>
+      </w:r>
+      <w:r>
+        <w:br/>
+        <w:t xml:space="preserve">                    </w:t>
+      </w:r>
+      <w:proofErr w:type="spellStart"/>
+      <w:r>
+        <w:t>chessBoard.addPromotionSquares</w:t>
+      </w:r>
+      <w:proofErr w:type="spellEnd"/>
+      <w:r>
+        <w:t xml:space="preserve">(i, 7, </w:t>
+      </w:r>
+      <w:proofErr w:type="spellStart"/>
+      <w:r>
+        <w:t>Colour.</w:t>
+      </w:r>
+      <w:r>
+        <w:rPr>
+          <w:i/>
+          <w:iCs/>
+        </w:rPr>
+        <w:t>Black</w:t>
+      </w:r>
+      <w:proofErr w:type="spellEnd"/>
+      <w:r>
+        <w:t>);</w:t>
+      </w:r>
+      <w:r>
+        <w:br/>
+        <w:t xml:space="preserve">                }</w:t>
+      </w:r>
+      <w:r>
+        <w:br/>
+      </w:r>
+      <w:r>
+        <w:br/>
+        <w:t>// figury</w:t>
+      </w:r>
+      <w:r>
+        <w:br/>
+        <w:t xml:space="preserve">                </w:t>
+      </w:r>
+      <w:proofErr w:type="spellStart"/>
+      <w:r>
+        <w:t>chessBoard.addPiece</w:t>
+      </w:r>
+      <w:proofErr w:type="spellEnd"/>
+      <w:r>
+        <w:t>(</w:t>
+      </w:r>
+      <w:proofErr w:type="spellStart"/>
+      <w:r>
+        <w:t>wk</w:t>
+      </w:r>
+      <w:proofErr w:type="spellEnd"/>
+      <w:r>
+        <w:t>);</w:t>
+      </w:r>
+      <w:r>
+        <w:br/>
+        <w:t xml:space="preserve">                </w:t>
+      </w:r>
+      <w:proofErr w:type="spellStart"/>
+      <w:r>
+        <w:t>chessBoard.addPiece</w:t>
+      </w:r>
+      <w:proofErr w:type="spellEnd"/>
+      <w:r>
+        <w:t>(a1);</w:t>
+      </w:r>
+      <w:r>
+        <w:br/>
+        <w:t xml:space="preserve">                </w:t>
+      </w:r>
+      <w:proofErr w:type="spellStart"/>
+      <w:r>
+        <w:t>chessBoard.addPiece</w:t>
+      </w:r>
+      <w:proofErr w:type="spellEnd"/>
+      <w:r>
+        <w:t>(a2);</w:t>
+      </w:r>
+      <w:r>
+        <w:br/>
+        <w:t xml:space="preserve">                </w:t>
+      </w:r>
+      <w:proofErr w:type="spellStart"/>
+      <w:r>
+        <w:t>chessBoard.addPiece</w:t>
+      </w:r>
+      <w:proofErr w:type="spellEnd"/>
+      <w:r>
+        <w:t>(a3);</w:t>
+      </w:r>
+      <w:r>
+        <w:br/>
+      </w:r>
+      <w:r>
+        <w:br/>
+        <w:t xml:space="preserve">                </w:t>
+      </w:r>
+      <w:proofErr w:type="spellStart"/>
+      <w:r>
+        <w:t>chessBoard.addPiece</w:t>
+      </w:r>
+      <w:proofErr w:type="spellEnd"/>
+      <w:r>
+        <w:t>(</w:t>
+      </w:r>
+      <w:proofErr w:type="spellStart"/>
+      <w:r>
+        <w:t>bk</w:t>
+      </w:r>
+      <w:proofErr w:type="spellEnd"/>
+      <w:r>
+        <w:t>);</w:t>
+      </w:r>
+      <w:r>
+        <w:br/>
+        <w:t xml:space="preserve">                </w:t>
+      </w:r>
+      <w:proofErr w:type="spellStart"/>
+      <w:r>
+        <w:t>chessBoard.addPiece</w:t>
+      </w:r>
+      <w:proofErr w:type="spellEnd"/>
+      <w:r>
+        <w:t>(br);</w:t>
+      </w:r>
+      <w:r>
+        <w:br/>
+      </w:r>
+      <w:r>
+        <w:br/>
+        <w:t xml:space="preserve">                </w:t>
+      </w:r>
+      <w:proofErr w:type="spellStart"/>
+      <w:r>
+        <w:t>chessBoard.addPiece</w:t>
+      </w:r>
+      <w:proofErr w:type="spellEnd"/>
+      <w:r>
+        <w:t>(</w:t>
+      </w:r>
+      <w:proofErr w:type="spellStart"/>
+      <w:r>
+        <w:t>restartPiece</w:t>
+      </w:r>
+      <w:proofErr w:type="spellEnd"/>
+      <w:r>
+        <w:t>);</w:t>
+      </w:r>
+      <w:r>
+        <w:br/>
+        <w:t xml:space="preserve">                </w:t>
+      </w:r>
+      <w:proofErr w:type="spellStart"/>
+      <w:r>
+        <w:t>chessBoard.addPiece</w:t>
+      </w:r>
+      <w:proofErr w:type="spellEnd"/>
+      <w:r>
+        <w:t>(</w:t>
+      </w:r>
+      <w:proofErr w:type="spellStart"/>
+      <w:r>
+        <w:t>tutorialPiece</w:t>
+      </w:r>
+      <w:proofErr w:type="spellEnd"/>
+      <w:r>
+        <w:t>);</w:t>
       </w:r>
     </w:p>
     <w:p>

</xml_diff>

<commit_message>
V 148 better map loading ,banned maps
</commit_message>
<xml_diff>
--- a/chess setups.DOCX
+++ b/chess setups.DOCX
@@ -6,7 +6,7 @@
       <w:pPr>
         <w:pStyle w:val="Nadpis3"/>
       </w:pPr>
-      <w:bookmarkStart w:id="0" w:name="_Toc241177294"/>
+      <w:bookmarkStart w:id="0" w:name="_Toc241425311"/>
       <w:r>
         <w:t>Standard</w:t>
       </w:r>
@@ -651,7 +651,7 @@
       <w:pPr>
         <w:pStyle w:val="Nadpis3"/>
       </w:pPr>
-      <w:bookmarkStart w:id="1" w:name="_Toc241177295"/>
+      <w:bookmarkStart w:id="1" w:name="_Toc241425312"/>
       <w:r>
         <w:t>fighter defense - map 1</w:t>
       </w:r>
@@ -1306,7 +1306,7 @@
       <w:pPr>
         <w:pStyle w:val="Nadpis3"/>
       </w:pPr>
-      <w:bookmarkStart w:id="2" w:name="_Toc241177296"/>
+      <w:bookmarkStart w:id="2" w:name="_Toc241425313"/>
       <w:r>
         <w:lastRenderedPageBreak/>
         <w:t>Water fight</w:t>
@@ -1951,7 +1951,7 @@
       <w:pPr>
         <w:pStyle w:val="Nadpis3"/>
       </w:pPr>
-      <w:bookmarkStart w:id="3" w:name="_Toc241177297"/>
+      <w:bookmarkStart w:id="3" w:name="_Toc241425314"/>
       <w:r>
         <w:t>Test</w:t>
       </w:r>
@@ -3128,7 +3128,7 @@
       <w:pPr>
         <w:pStyle w:val="Nadpis3"/>
       </w:pPr>
-      <w:bookmarkStart w:id="4" w:name="_Toc241177298"/>
+      <w:bookmarkStart w:id="4" w:name="_Toc241425315"/>
       <w:r>
         <w:t>XXL chess (rip of)</w:t>
       </w:r>
@@ -4376,7 +4376,7 @@
       <w:pPr>
         <w:pStyle w:val="Nadpis3"/>
       </w:pPr>
-      <w:bookmarkStart w:id="5" w:name="_Toc241177299"/>
+      <w:bookmarkStart w:id="5" w:name="_Toc241425316"/>
       <w:r>
         <w:t>The discovery of America</w:t>
       </w:r>
@@ -4888,7 +4888,7 @@
       <w:pPr>
         <w:pStyle w:val="Nadpis3"/>
       </w:pPr>
-      <w:bookmarkStart w:id="6" w:name="_Toc241177300"/>
+      <w:bookmarkStart w:id="6" w:name="_Toc241425317"/>
       <w:r>
         <w:t>first flight</w:t>
       </w:r>
@@ -5216,12 +5216,14 @@
           <w:lang w:val="en-GB"/>
         </w:rPr>
       </w:pPr>
+      <w:bookmarkStart w:id="7" w:name="_Toc241425318"/>
       <w:r>
         <w:rPr>
           <w:lang w:val="en-GB"/>
         </w:rPr>
         <w:t>Level 3</w:t>
       </w:r>
+      <w:bookmarkEnd w:id="7"/>
     </w:p>
     <w:p>
       <w:r>
@@ -5744,6 +5746,2488 @@
         </w:rPr>
       </w:pPr>
     </w:p>
+    <w:p>
+      <w:pPr>
+        <w:pStyle w:val="Nadpis3"/>
+        <w:rPr>
+          <w:lang w:val="en-GB"/>
+        </w:rPr>
+      </w:pPr>
+      <w:bookmarkStart w:id="8" w:name="_Toc241425319"/>
+      <w:r>
+        <w:rPr>
+          <w:lang w:val="en-GB"/>
+        </w:rPr>
+        <w:t>Behind the mirror</w:t>
+      </w:r>
+      <w:bookmarkEnd w:id="8"/>
+    </w:p>
+    <w:p>
+      <w:r>
+        <w:br/>
+        <w:t>// inicializace hráčů</w:t>
+      </w:r>
+      <w:r>
+        <w:br/>
+        <w:t xml:space="preserve">                Player player1 = new Player("Bílý", Colour.</w:t>
+      </w:r>
+      <w:r>
+        <w:rPr>
+          <w:i/>
+          <w:iCs/>
+        </w:rPr>
+        <w:t>White</w:t>
+      </w:r>
+      <w:r>
+        <w:t>, 600);</w:t>
+      </w:r>
+      <w:r>
+        <w:br/>
+        <w:t xml:space="preserve">                Player player2 = new Player("Černý", Colour.</w:t>
+      </w:r>
+      <w:r>
+        <w:rPr>
+          <w:i/>
+          <w:iCs/>
+        </w:rPr>
+        <w:t>Black</w:t>
+      </w:r>
+      <w:r>
+        <w:t>, 600);</w:t>
+      </w:r>
+      <w:r>
+        <w:br/>
+      </w:r>
+      <w:r>
+        <w:br/>
+        <w:t>// inicializace šachovnice</w:t>
+      </w:r>
+      <w:r>
+        <w:br/>
+        <w:t xml:space="preserve">                ChessBoard chessBoard = new ChessBoard(14, 14);</w:t>
+      </w:r>
+      <w:r>
+        <w:br/>
+        <w:t xml:space="preserve">                chessBoard.addPlayer(player1);</w:t>
+      </w:r>
+      <w:r>
+        <w:br/>
+        <w:t xml:space="preserve">                chessBoard.addPlayer(player2);</w:t>
+      </w:r>
+      <w:r>
+        <w:br/>
+      </w:r>
+      <w:r>
+        <w:br/>
+      </w:r>
+      <w:r>
+        <w:br/>
+      </w:r>
+      <w:r>
+        <w:br/>
+      </w:r>
+      <w:r>
+        <w:br/>
+        <w:t>// promotion squares</w:t>
+      </w:r>
+      <w:r>
+        <w:br/>
+        <w:t xml:space="preserve">                for (int i = 0; i &lt; 14; i++) {</w:t>
+      </w:r>
+      <w:r>
+        <w:br/>
+        <w:t xml:space="preserve">                    chessBoard.addPromotionSquares(i, 3, Colour.</w:t>
+      </w:r>
+      <w:r>
+        <w:rPr>
+          <w:i/>
+          <w:iCs/>
+        </w:rPr>
+        <w:t>White</w:t>
+      </w:r>
+      <w:r>
+        <w:t>);</w:t>
+      </w:r>
+      <w:r>
+        <w:br/>
+      </w:r>
+      <w:r>
+        <w:br/>
+        <w:t xml:space="preserve">                    chessBoard.addPromotionSquares(i, 10, Colour.</w:t>
+      </w:r>
+      <w:r>
+        <w:rPr>
+          <w:i/>
+          <w:iCs/>
+        </w:rPr>
+        <w:t>Black</w:t>
+      </w:r>
+      <w:r>
+        <w:t>);</w:t>
+      </w:r>
+      <w:r>
+        <w:br/>
+        <w:t xml:space="preserve">                }</w:t>
+      </w:r>
+      <w:r>
+        <w:br/>
+      </w:r>
+      <w:r>
+        <w:br/>
+      </w:r>
+      <w:r>
+        <w:br/>
+        <w:t>// inicializace figur</w:t>
+      </w:r>
+      <w:r>
+        <w:br/>
+      </w:r>
+      <w:r>
+        <w:br/>
+        <w:t>// BLACK</w:t>
+      </w:r>
+      <w:r>
+        <w:br/>
+      </w:r>
+      <w:r>
+        <w:br/>
+        <w:t>// řádek 0</w:t>
+      </w:r>
+      <w:r>
+        <w:br/>
+        <w:t xml:space="preserve">                chessBoard.addPiece(new Knight("piece", 4, 0, Colour.</w:t>
+      </w:r>
+      <w:r>
+        <w:rPr>
+          <w:i/>
+          <w:iCs/>
+        </w:rPr>
+        <w:t>Black</w:t>
+      </w:r>
+      <w:r>
+        <w:t>));</w:t>
+      </w:r>
+      <w:r>
+        <w:br/>
+        <w:t xml:space="preserve">                chessBoard.addPiece(new Knight("piece", 9, 0, Colour.</w:t>
+      </w:r>
+      <w:r>
+        <w:rPr>
+          <w:i/>
+          <w:iCs/>
+        </w:rPr>
+        <w:t>Black</w:t>
+      </w:r>
+      <w:r>
+        <w:t>));</w:t>
+      </w:r>
+      <w:r>
+        <w:br/>
+      </w:r>
+      <w:r>
+        <w:br/>
+      </w:r>
+      <w:r>
+        <w:lastRenderedPageBreak/>
+        <w:t>// řádek 1</w:t>
+      </w:r>
+      <w:r>
+        <w:br/>
+        <w:t xml:space="preserve">                chessBoard.addPiece(new Knight("piece", 3, 1, Colour.</w:t>
+      </w:r>
+      <w:r>
+        <w:rPr>
+          <w:i/>
+          <w:iCs/>
+        </w:rPr>
+        <w:t>Black</w:t>
+      </w:r>
+      <w:r>
+        <w:t>));</w:t>
+      </w:r>
+      <w:r>
+        <w:br/>
+        <w:t xml:space="preserve">                chessBoard.addPiece(new Knight("piece", 10, 1, Colour.</w:t>
+      </w:r>
+      <w:r>
+        <w:rPr>
+          <w:i/>
+          <w:iCs/>
+        </w:rPr>
+        <w:t>Black</w:t>
+      </w:r>
+      <w:r>
+        <w:t>));</w:t>
+      </w:r>
+      <w:r>
+        <w:br/>
+      </w:r>
+      <w:r>
+        <w:br/>
+        <w:t>// řádek 3</w:t>
+      </w:r>
+      <w:r>
+        <w:br/>
+        <w:t xml:space="preserve">                chessBoard.addPiece(new Rook("piece", 0, 3, Colour.</w:t>
+      </w:r>
+      <w:r>
+        <w:rPr>
+          <w:i/>
+          <w:iCs/>
+        </w:rPr>
+        <w:t>Black</w:t>
+      </w:r>
+      <w:r>
+        <w:t>));</w:t>
+      </w:r>
+      <w:r>
+        <w:br/>
+        <w:t xml:space="preserve">                chessBoard.addPiece(new Bishop("piece", 1, 3, Colour.</w:t>
+      </w:r>
+      <w:r>
+        <w:rPr>
+          <w:i/>
+          <w:iCs/>
+        </w:rPr>
+        <w:t>Black</w:t>
+      </w:r>
+      <w:r>
+        <w:t>));</w:t>
+      </w:r>
+      <w:r>
+        <w:br/>
+        <w:t xml:space="preserve">                chessBoard.addPiece(new King("piece", 2, 3, Colour.</w:t>
+      </w:r>
+      <w:r>
+        <w:rPr>
+          <w:i/>
+          <w:iCs/>
+        </w:rPr>
+        <w:t>Black</w:t>
+      </w:r>
+      <w:r>
+        <w:t>, 2));</w:t>
+      </w:r>
+      <w:r>
+        <w:br/>
+        <w:t xml:space="preserve">                chessBoard.addPiece(new Queen("piece", 3, 3, Colour.</w:t>
+      </w:r>
+      <w:r>
+        <w:rPr>
+          <w:i/>
+          <w:iCs/>
+        </w:rPr>
+        <w:t>Black</w:t>
+      </w:r>
+      <w:r>
+        <w:t>));</w:t>
+      </w:r>
+      <w:r>
+        <w:br/>
+        <w:t xml:space="preserve">                chessBoard.addPiece(new Bishop("piece", 4, 3, Colour.</w:t>
+      </w:r>
+      <w:r>
+        <w:rPr>
+          <w:i/>
+          <w:iCs/>
+        </w:rPr>
+        <w:t>Black</w:t>
+      </w:r>
+      <w:r>
+        <w:t>));</w:t>
+      </w:r>
+      <w:r>
+        <w:br/>
+        <w:t xml:space="preserve">                chessBoard.addPiece(new Rook("piece", 5, 3, Colour.</w:t>
+      </w:r>
+      <w:r>
+        <w:rPr>
+          <w:i/>
+          <w:iCs/>
+        </w:rPr>
+        <w:t>Black</w:t>
+      </w:r>
+      <w:r>
+        <w:t>));</w:t>
+      </w:r>
+      <w:r>
+        <w:br/>
+      </w:r>
+      <w:r>
+        <w:br/>
+        <w:t xml:space="preserve">                chessBoard.addPiece(new Rook("piece", 8, 3, Colour.</w:t>
+      </w:r>
+      <w:r>
+        <w:rPr>
+          <w:i/>
+          <w:iCs/>
+        </w:rPr>
+        <w:t>Black</w:t>
+      </w:r>
+      <w:r>
+        <w:t>));</w:t>
+      </w:r>
+      <w:r>
+        <w:br/>
+        <w:t xml:space="preserve">                chessBoard.addPiece(new Bishop("piece", 9, 3, Colour.</w:t>
+      </w:r>
+      <w:r>
+        <w:rPr>
+          <w:i/>
+          <w:iCs/>
+        </w:rPr>
+        <w:t>Black</w:t>
+      </w:r>
+      <w:r>
+        <w:t>));</w:t>
+      </w:r>
+      <w:r>
+        <w:br/>
+        <w:t xml:space="preserve">                chessBoard.addPiece(new Queen("piece", 10, 3, Colour.</w:t>
+      </w:r>
+      <w:r>
+        <w:rPr>
+          <w:i/>
+          <w:iCs/>
+        </w:rPr>
+        <w:t>Black</w:t>
+      </w:r>
+      <w:r>
+        <w:t>));</w:t>
+      </w:r>
+      <w:r>
+        <w:br/>
+        <w:t xml:space="preserve">                chessBoard.addPiece(new King("piece", 11, 3, Colour.</w:t>
+      </w:r>
+      <w:r>
+        <w:rPr>
+          <w:i/>
+          <w:iCs/>
+        </w:rPr>
+        <w:t>Black</w:t>
+      </w:r>
+      <w:r>
+        <w:t>, 2));</w:t>
+      </w:r>
+      <w:r>
+        <w:br/>
+        <w:t xml:space="preserve">                chessBoard.addPiece(new Bishop("piece", 12, 3, Colour.</w:t>
+      </w:r>
+      <w:r>
+        <w:rPr>
+          <w:i/>
+          <w:iCs/>
+        </w:rPr>
+        <w:t>Black</w:t>
+      </w:r>
+      <w:r>
+        <w:t>));</w:t>
+      </w:r>
+      <w:r>
+        <w:br/>
+        <w:t xml:space="preserve">                chessBoard.addPiece(new Rook("piece", 13, 3, Colour.</w:t>
+      </w:r>
+      <w:r>
+        <w:rPr>
+          <w:i/>
+          <w:iCs/>
+        </w:rPr>
+        <w:t>Black</w:t>
+      </w:r>
+      <w:r>
+        <w:t>));</w:t>
+      </w:r>
+      <w:r>
+        <w:br/>
+      </w:r>
+      <w:r>
+        <w:br/>
+        <w:t>// řádek 4</w:t>
+      </w:r>
+      <w:r>
+        <w:br/>
+        <w:t xml:space="preserve">                chessBoard.addPiece(new Pawn("piece", 0, 4, Colour.</w:t>
+      </w:r>
+      <w:r>
+        <w:rPr>
+          <w:i/>
+          <w:iCs/>
+        </w:rPr>
+        <w:t>Black</w:t>
+      </w:r>
+      <w:r>
+        <w:t>, 2));</w:t>
+      </w:r>
+      <w:r>
+        <w:br/>
+        <w:t xml:space="preserve">                chessBoard.addPiece(new Pawn("piece", 1, 4, Colour.</w:t>
+      </w:r>
+      <w:r>
+        <w:rPr>
+          <w:i/>
+          <w:iCs/>
+        </w:rPr>
+        <w:t>Black</w:t>
+      </w:r>
+      <w:r>
+        <w:t>, 2));</w:t>
+      </w:r>
+      <w:r>
+        <w:br/>
+        <w:t xml:space="preserve">                chessBoard.addPiece(new Pawn("piece", 2, 4, Colour.</w:t>
+      </w:r>
+      <w:r>
+        <w:rPr>
+          <w:i/>
+          <w:iCs/>
+        </w:rPr>
+        <w:t>Black</w:t>
+      </w:r>
+      <w:r>
+        <w:t>, 2));</w:t>
+      </w:r>
+      <w:r>
+        <w:br/>
+        <w:t xml:space="preserve">                chessBoard.addPiece(new Pawn("piece", 3, 4, Colour.</w:t>
+      </w:r>
+      <w:r>
+        <w:rPr>
+          <w:i/>
+          <w:iCs/>
+        </w:rPr>
+        <w:t>Black</w:t>
+      </w:r>
+      <w:r>
+        <w:t>, 2));</w:t>
+      </w:r>
+      <w:r>
+        <w:br/>
+        <w:t xml:space="preserve">                chessBoard.addPiece(new Pawn("piece", 4, 4, Colour.</w:t>
+      </w:r>
+      <w:r>
+        <w:rPr>
+          <w:i/>
+          <w:iCs/>
+        </w:rPr>
+        <w:t>Black</w:t>
+      </w:r>
+      <w:r>
+        <w:t>, 2));</w:t>
+      </w:r>
+      <w:r>
+        <w:br/>
+        <w:t xml:space="preserve">                chessBoard.addPiece(new Pawn("piece", 5, 4, Colour.</w:t>
+      </w:r>
+      <w:r>
+        <w:rPr>
+          <w:i/>
+          <w:iCs/>
+        </w:rPr>
+        <w:t>Black</w:t>
+      </w:r>
+      <w:r>
+        <w:t>, 2));</w:t>
+      </w:r>
+      <w:r>
+        <w:br/>
+      </w:r>
+      <w:r>
+        <w:br/>
+        <w:t xml:space="preserve">                chessBoard.addPiece(new Pawn("piece", 8, 4, Colour.</w:t>
+      </w:r>
+      <w:r>
+        <w:rPr>
+          <w:i/>
+          <w:iCs/>
+        </w:rPr>
+        <w:t>Black</w:t>
+      </w:r>
+      <w:r>
+        <w:t>, 2));</w:t>
+      </w:r>
+      <w:r>
+        <w:br/>
+        <w:t xml:space="preserve">                chessBoard.addPiece(new Pawn("piece", 9, 4, Colour.</w:t>
+      </w:r>
+      <w:r>
+        <w:rPr>
+          <w:i/>
+          <w:iCs/>
+        </w:rPr>
+        <w:t>Black</w:t>
+      </w:r>
+      <w:r>
+        <w:t>, 2));</w:t>
+      </w:r>
+      <w:r>
+        <w:br/>
+        <w:t xml:space="preserve">                chessBoard.addPiece(new Pawn("piece", 10, 4, Colour.</w:t>
+      </w:r>
+      <w:r>
+        <w:rPr>
+          <w:i/>
+          <w:iCs/>
+        </w:rPr>
+        <w:t>Black</w:t>
+      </w:r>
+      <w:r>
+        <w:t>, 2));</w:t>
+      </w:r>
+      <w:r>
+        <w:br/>
+        <w:t xml:space="preserve">                chessBoard.addPiece(new Pawn("piece", 11, 4, Colour.</w:t>
+      </w:r>
+      <w:r>
+        <w:rPr>
+          <w:i/>
+          <w:iCs/>
+        </w:rPr>
+        <w:t>Black</w:t>
+      </w:r>
+      <w:r>
+        <w:t>, 2));</w:t>
+      </w:r>
+      <w:r>
+        <w:br/>
+        <w:t xml:space="preserve">                chessBoard.addPiece(new Pawn("piece", 12, 4, Colour.</w:t>
+      </w:r>
+      <w:r>
+        <w:rPr>
+          <w:i/>
+          <w:iCs/>
+        </w:rPr>
+        <w:t>Black</w:t>
+      </w:r>
+      <w:r>
+        <w:t>, 2));</w:t>
+      </w:r>
+      <w:r>
+        <w:br/>
+        <w:t xml:space="preserve">                chessBoard.addPiece(new Pawn("piece", 13, 4, Colour.</w:t>
+      </w:r>
+      <w:r>
+        <w:rPr>
+          <w:i/>
+          <w:iCs/>
+        </w:rPr>
+        <w:t>Black</w:t>
+      </w:r>
+      <w:r>
+        <w:t>, 2));</w:t>
+      </w:r>
+      <w:r>
+        <w:br/>
+      </w:r>
+      <w:r>
+        <w:br/>
+      </w:r>
+      <w:r>
+        <w:br/>
+        <w:t>// WHITE</w:t>
+      </w:r>
+      <w:r>
+        <w:br/>
+      </w:r>
+      <w:r>
+        <w:br/>
+        <w:t>// řádek 9</w:t>
+      </w:r>
+      <w:r>
+        <w:br/>
+        <w:t xml:space="preserve">                chessBoard.addPiece(new Pawn("piece", 0, 9, Colour.</w:t>
+      </w:r>
+      <w:r>
+        <w:rPr>
+          <w:i/>
+          <w:iCs/>
+        </w:rPr>
+        <w:t>White</w:t>
+      </w:r>
+      <w:r>
+        <w:t>, 0));</w:t>
+      </w:r>
+      <w:r>
+        <w:br/>
+        <w:t xml:space="preserve">                chessBoard.addPiece(new Pawn("piece", 1, 9, Colour.</w:t>
+      </w:r>
+      <w:r>
+        <w:rPr>
+          <w:i/>
+          <w:iCs/>
+        </w:rPr>
+        <w:t>White</w:t>
+      </w:r>
+      <w:r>
+        <w:t>, 0));</w:t>
+      </w:r>
+      <w:r>
+        <w:br/>
+        <w:t xml:space="preserve">                chessBoard.addPiece(new Pawn("piece", 2, 9, Colour.</w:t>
+      </w:r>
+      <w:r>
+        <w:rPr>
+          <w:i/>
+          <w:iCs/>
+        </w:rPr>
+        <w:t>White</w:t>
+      </w:r>
+      <w:r>
+        <w:t>, 0));</w:t>
+      </w:r>
+      <w:r>
+        <w:br/>
+      </w:r>
+      <w:r>
+        <w:lastRenderedPageBreak/>
+        <w:t xml:space="preserve">                chessBoard.addPiece(new Pawn("piece", 3, 9, Colour.</w:t>
+      </w:r>
+      <w:r>
+        <w:rPr>
+          <w:i/>
+          <w:iCs/>
+        </w:rPr>
+        <w:t>White</w:t>
+      </w:r>
+      <w:r>
+        <w:t>, 0));</w:t>
+      </w:r>
+      <w:r>
+        <w:br/>
+        <w:t xml:space="preserve">                chessBoard.addPiece(new Pawn("piece", 4, 9, Colour.</w:t>
+      </w:r>
+      <w:r>
+        <w:rPr>
+          <w:i/>
+          <w:iCs/>
+        </w:rPr>
+        <w:t>White</w:t>
+      </w:r>
+      <w:r>
+        <w:t>, 0));</w:t>
+      </w:r>
+      <w:r>
+        <w:br/>
+        <w:t xml:space="preserve">                chessBoard.addPiece(new Pawn("piece", 5, 9, Colour.</w:t>
+      </w:r>
+      <w:r>
+        <w:rPr>
+          <w:i/>
+          <w:iCs/>
+        </w:rPr>
+        <w:t>White</w:t>
+      </w:r>
+      <w:r>
+        <w:t>, 0));</w:t>
+      </w:r>
+      <w:r>
+        <w:br/>
+      </w:r>
+      <w:r>
+        <w:br/>
+        <w:t xml:space="preserve">                chessBoard.addPiece(new Pawn("piece", 8, 9, Colour.</w:t>
+      </w:r>
+      <w:r>
+        <w:rPr>
+          <w:i/>
+          <w:iCs/>
+        </w:rPr>
+        <w:t>White</w:t>
+      </w:r>
+      <w:r>
+        <w:t>, 0));</w:t>
+      </w:r>
+      <w:r>
+        <w:br/>
+        <w:t xml:space="preserve">                chessBoard.addPiece(new Pawn("piece", 9, 9, Colour.</w:t>
+      </w:r>
+      <w:r>
+        <w:rPr>
+          <w:i/>
+          <w:iCs/>
+        </w:rPr>
+        <w:t>White</w:t>
+      </w:r>
+      <w:r>
+        <w:t>, 0));</w:t>
+      </w:r>
+      <w:r>
+        <w:br/>
+        <w:t xml:space="preserve">                chessBoard.addPiece(new Pawn("piece", 10, 9, Colour.</w:t>
+      </w:r>
+      <w:r>
+        <w:rPr>
+          <w:i/>
+          <w:iCs/>
+        </w:rPr>
+        <w:t>White</w:t>
+      </w:r>
+      <w:r>
+        <w:t>, 0));</w:t>
+      </w:r>
+      <w:r>
+        <w:br/>
+        <w:t xml:space="preserve">                chessBoard.addPiece(new Pawn("piece", 11, 9, Colour.</w:t>
+      </w:r>
+      <w:r>
+        <w:rPr>
+          <w:i/>
+          <w:iCs/>
+        </w:rPr>
+        <w:t>White</w:t>
+      </w:r>
+      <w:r>
+        <w:t>, 0));</w:t>
+      </w:r>
+      <w:r>
+        <w:br/>
+        <w:t xml:space="preserve">                chessBoard.addPiece(new Pawn("piece", 12, 9, Colour.</w:t>
+      </w:r>
+      <w:r>
+        <w:rPr>
+          <w:i/>
+          <w:iCs/>
+        </w:rPr>
+        <w:t>White</w:t>
+      </w:r>
+      <w:r>
+        <w:t>, 0));</w:t>
+      </w:r>
+      <w:r>
+        <w:br/>
+        <w:t xml:space="preserve">                chessBoard.addPiece(new Pawn("piece", 13, 9, Colour.</w:t>
+      </w:r>
+      <w:r>
+        <w:rPr>
+          <w:i/>
+          <w:iCs/>
+        </w:rPr>
+        <w:t>White</w:t>
+      </w:r>
+      <w:r>
+        <w:t>, 0));</w:t>
+      </w:r>
+      <w:r>
+        <w:br/>
+      </w:r>
+      <w:r>
+        <w:br/>
+      </w:r>
+      <w:r>
+        <w:br/>
+        <w:t>// řádek 10</w:t>
+      </w:r>
+      <w:r>
+        <w:br/>
+        <w:t xml:space="preserve">                chessBoard.addPiece(new Rook("piece", 0, 10, Colour.</w:t>
+      </w:r>
+      <w:r>
+        <w:rPr>
+          <w:i/>
+          <w:iCs/>
+        </w:rPr>
+        <w:t>White</w:t>
+      </w:r>
+      <w:r>
+        <w:t>));</w:t>
+      </w:r>
+      <w:r>
+        <w:br/>
+        <w:t xml:space="preserve">                chessBoard.addPiece(new Bishop("piece", 1, 10, Colour.</w:t>
+      </w:r>
+      <w:r>
+        <w:rPr>
+          <w:i/>
+          <w:iCs/>
+        </w:rPr>
+        <w:t>White</w:t>
+      </w:r>
+      <w:r>
+        <w:t>));</w:t>
+      </w:r>
+      <w:r>
+        <w:br/>
+        <w:t xml:space="preserve">                chessBoard.addPiece(new King("piece", 2, 10, Colour.</w:t>
+      </w:r>
+      <w:r>
+        <w:rPr>
+          <w:i/>
+          <w:iCs/>
+        </w:rPr>
+        <w:t>White</w:t>
+      </w:r>
+      <w:r>
+        <w:t>, 0));</w:t>
+      </w:r>
+      <w:r>
+        <w:br/>
+        <w:t xml:space="preserve">                chessBoard.addPiece(new Queen("piece", 3, 10, Colour.</w:t>
+      </w:r>
+      <w:r>
+        <w:rPr>
+          <w:i/>
+          <w:iCs/>
+        </w:rPr>
+        <w:t>White</w:t>
+      </w:r>
+      <w:r>
+        <w:t>));</w:t>
+      </w:r>
+      <w:r>
+        <w:br/>
+        <w:t xml:space="preserve">                chessBoard.addPiece(new Bishop("piece", 4, 10, Colour.</w:t>
+      </w:r>
+      <w:r>
+        <w:rPr>
+          <w:i/>
+          <w:iCs/>
+        </w:rPr>
+        <w:t>White</w:t>
+      </w:r>
+      <w:r>
+        <w:t>));</w:t>
+      </w:r>
+      <w:r>
+        <w:br/>
+        <w:t xml:space="preserve">                chessBoard.addPiece(new Rook("piece", 5, 10, Colour.</w:t>
+      </w:r>
+      <w:r>
+        <w:rPr>
+          <w:i/>
+          <w:iCs/>
+        </w:rPr>
+        <w:t>White</w:t>
+      </w:r>
+      <w:r>
+        <w:t>));</w:t>
+      </w:r>
+      <w:r>
+        <w:br/>
+      </w:r>
+      <w:r>
+        <w:br/>
+        <w:t xml:space="preserve">                chessBoard.addPiece(new Rook("piece", 8, 10, Colour.</w:t>
+      </w:r>
+      <w:r>
+        <w:rPr>
+          <w:i/>
+          <w:iCs/>
+        </w:rPr>
+        <w:t>White</w:t>
+      </w:r>
+      <w:r>
+        <w:t>));</w:t>
+      </w:r>
+      <w:r>
+        <w:br/>
+        <w:t xml:space="preserve">                chessBoard.addPiece(new Bishop("piece", 9, 10, Colour.</w:t>
+      </w:r>
+      <w:r>
+        <w:rPr>
+          <w:i/>
+          <w:iCs/>
+        </w:rPr>
+        <w:t>White</w:t>
+      </w:r>
+      <w:r>
+        <w:t>));</w:t>
+      </w:r>
+      <w:r>
+        <w:br/>
+        <w:t xml:space="preserve">                chessBoard.addPiece(new Queen("piece", 10, 10, Colour.</w:t>
+      </w:r>
+      <w:r>
+        <w:rPr>
+          <w:i/>
+          <w:iCs/>
+        </w:rPr>
+        <w:t>White</w:t>
+      </w:r>
+      <w:r>
+        <w:t>));</w:t>
+      </w:r>
+      <w:r>
+        <w:br/>
+        <w:t xml:space="preserve">                chessBoard.addPiece(new King("piece", 11, 10, Colour.</w:t>
+      </w:r>
+      <w:r>
+        <w:rPr>
+          <w:i/>
+          <w:iCs/>
+        </w:rPr>
+        <w:t>White</w:t>
+      </w:r>
+      <w:r>
+        <w:t>, 0));</w:t>
+      </w:r>
+      <w:r>
+        <w:br/>
+        <w:t xml:space="preserve">                chessBoard.addPiece(new Bishop("piece", 12, 10, Colour.</w:t>
+      </w:r>
+      <w:r>
+        <w:rPr>
+          <w:i/>
+          <w:iCs/>
+        </w:rPr>
+        <w:t>White</w:t>
+      </w:r>
+      <w:r>
+        <w:t>));</w:t>
+      </w:r>
+      <w:r>
+        <w:br/>
+        <w:t xml:space="preserve">                chessBoard.addPiece(new Rook("piece", 13, 10, Colour.</w:t>
+      </w:r>
+      <w:r>
+        <w:rPr>
+          <w:i/>
+          <w:iCs/>
+        </w:rPr>
+        <w:t>White</w:t>
+      </w:r>
+      <w:r>
+        <w:t>));</w:t>
+      </w:r>
+      <w:r>
+        <w:br/>
+      </w:r>
+      <w:r>
+        <w:br/>
+      </w:r>
+      <w:r>
+        <w:br/>
+        <w:t>// řádek 12</w:t>
+      </w:r>
+      <w:r>
+        <w:br/>
+        <w:t xml:space="preserve">                chessBoard.addPiece(new Knight("piece", 3, 12, Colour.</w:t>
+      </w:r>
+      <w:r>
+        <w:rPr>
+          <w:i/>
+          <w:iCs/>
+        </w:rPr>
+        <w:t>White</w:t>
+      </w:r>
+      <w:r>
+        <w:t>));</w:t>
+      </w:r>
+      <w:r>
+        <w:br/>
+        <w:t xml:space="preserve">                chessBoard.addPiece(new Knight("piece", 10, 12, Colour.</w:t>
+      </w:r>
+      <w:r>
+        <w:rPr>
+          <w:i/>
+          <w:iCs/>
+        </w:rPr>
+        <w:t>White</w:t>
+      </w:r>
+      <w:r>
+        <w:t>));</w:t>
+      </w:r>
+      <w:r>
+        <w:br/>
+      </w:r>
+      <w:r>
+        <w:br/>
+        <w:t>// řádek 13</w:t>
+      </w:r>
+      <w:r>
+        <w:br/>
+        <w:t xml:space="preserve">                chessBoard.addPiece(new Knight("piece", 4, 13, Colour.</w:t>
+      </w:r>
+      <w:r>
+        <w:rPr>
+          <w:i/>
+          <w:iCs/>
+        </w:rPr>
+        <w:t>White</w:t>
+      </w:r>
+      <w:r>
+        <w:t>));</w:t>
+      </w:r>
+      <w:r>
+        <w:br/>
+        <w:t xml:space="preserve">                chessBoard.addPiece(new Knight("piece", 9, 13, Colour.</w:t>
+      </w:r>
+      <w:r>
+        <w:rPr>
+          <w:i/>
+          <w:iCs/>
+        </w:rPr>
+        <w:t>White</w:t>
+      </w:r>
+      <w:r>
+        <w:t>));</w:t>
+      </w:r>
+      <w:r>
+        <w:br/>
+      </w:r>
+      <w:r>
+        <w:br/>
+      </w:r>
+      <w:r>
+        <w:br/>
+      </w:r>
+      <w:r>
+        <w:br/>
+        <w:t>// inicializace blokád</w:t>
+      </w:r>
+      <w:r>
+        <w:br/>
+      </w:r>
+      <w:r>
+        <w:br/>
+        <w:t>// řádek 0</w:t>
+      </w:r>
+      <w:r>
+        <w:br/>
+      </w:r>
+      <w:r>
+        <w:lastRenderedPageBreak/>
+        <w:t xml:space="preserve">                chessBoard.addPiece(new Blocade("blockade", 0, 0));</w:t>
+      </w:r>
+      <w:r>
+        <w:br/>
+        <w:t xml:space="preserve">                chessBoard.addPiece(new Blocade("blockade", 1, 0));</w:t>
+      </w:r>
+      <w:r>
+        <w:br/>
+        <w:t xml:space="preserve">                chessBoard.addPiece(new Blocade("blockade", 2, 0));</w:t>
+      </w:r>
+      <w:r>
+        <w:br/>
+        <w:t xml:space="preserve">                chessBoard.addPiece(new Blocade("blockade", 3, 0));</w:t>
+      </w:r>
+      <w:r>
+        <w:br/>
+        <w:t xml:space="preserve">                chessBoard.addPiece(new Blocade("blockade", 5, 0));</w:t>
+      </w:r>
+      <w:r>
+        <w:br/>
+        <w:t xml:space="preserve">                chessBoard.addPiece(new Blocade("blockade", 6, 0));</w:t>
+      </w:r>
+      <w:r>
+        <w:br/>
+        <w:t xml:space="preserve">                chessBoard.addPiece(new Blocade("blockade", 7, 0));</w:t>
+      </w:r>
+      <w:r>
+        <w:br/>
+        <w:t xml:space="preserve">                chessBoard.addPiece(new Blocade("blockade", 8, 0));</w:t>
+      </w:r>
+      <w:r>
+        <w:br/>
+        <w:t xml:space="preserve">                chessBoard.addPiece(new Blocade("blockade", 10, 0));</w:t>
+      </w:r>
+      <w:r>
+        <w:br/>
+        <w:t xml:space="preserve">                chessBoard.addPiece(new Blocade("blockade", 11, 0));</w:t>
+      </w:r>
+      <w:r>
+        <w:br/>
+        <w:t xml:space="preserve">                chessBoard.addPiece(new Blocade("blockade", 12, 0));</w:t>
+      </w:r>
+      <w:r>
+        <w:br/>
+        <w:t xml:space="preserve">                chessBoard.addPiece(new Blocade("blockade", 13, 0));</w:t>
+      </w:r>
+      <w:r>
+        <w:br/>
+      </w:r>
+      <w:r>
+        <w:br/>
+        <w:t>// řádek 1</w:t>
+      </w:r>
+      <w:r>
+        <w:br/>
+        <w:t xml:space="preserve">                chessBoard.addPiece(new Blocade("blockade", 0, 1));</w:t>
+      </w:r>
+      <w:r>
+        <w:br/>
+        <w:t xml:space="preserve">                chessBoard.addPiece(new Blocade("blockade", 1, 1));</w:t>
+      </w:r>
+      <w:r>
+        <w:br/>
+        <w:t xml:space="preserve">                chessBoard.addPiece(new Blocade("blockade", 2, 1));</w:t>
+      </w:r>
+      <w:r>
+        <w:br/>
+        <w:t xml:space="preserve">                chessBoard.addPiece(new Blocade("blockade", 4, 1));</w:t>
+      </w:r>
+      <w:r>
+        <w:br/>
+        <w:t xml:space="preserve">                chessBoard.addPiece(new Blocade("blockade", 5, 1));</w:t>
+      </w:r>
+      <w:r>
+        <w:br/>
+        <w:t xml:space="preserve">                chessBoard.addPiece(new Blocade("blockade", 8, 1));</w:t>
+      </w:r>
+      <w:r>
+        <w:br/>
+        <w:t xml:space="preserve">                chessBoard.addPiece(new Blocade("blockade", 9, 1));</w:t>
+      </w:r>
+      <w:r>
+        <w:br/>
+        <w:t xml:space="preserve">                chessBoard.addPiece(new Blocade("blockade", 11, 1));</w:t>
+      </w:r>
+      <w:r>
+        <w:br/>
+        <w:t xml:space="preserve">                chessBoard.addPiece(new Blocade("blockade", 12, 1));</w:t>
+      </w:r>
+      <w:r>
+        <w:br/>
+        <w:t xml:space="preserve">                chessBoard.addPiece(new Blocade("blockade", 13, 1));</w:t>
+      </w:r>
+      <w:r>
+        <w:br/>
+      </w:r>
+      <w:r>
+        <w:br/>
+        <w:t>// řádek 2</w:t>
+      </w:r>
+      <w:r>
+        <w:br/>
+        <w:t xml:space="preserve">                chessBoard.addPiece(new Blocade("blockade", 0, 2));</w:t>
+      </w:r>
+      <w:r>
+        <w:br/>
+        <w:t xml:space="preserve">                chessBoard.addPiece(new Blocade("blockade", 1, 2));</w:t>
+      </w:r>
+      <w:r>
+        <w:br/>
+        <w:t xml:space="preserve">                chessBoard.addPiece(new Blocade("blockade", 2, 2));</w:t>
+      </w:r>
+      <w:r>
+        <w:br/>
+        <w:t xml:space="preserve">                chessBoard.addPiece(new Blocade("blockade", 3, 2));</w:t>
+      </w:r>
+      <w:r>
+        <w:br/>
+        <w:t xml:space="preserve">                chessBoard.addPiece(new Blocade("blockade", 4, 2));</w:t>
+      </w:r>
+      <w:r>
+        <w:br/>
+        <w:t xml:space="preserve">                chessBoard.addPiece(new Blocade("blockade", 9, 2));</w:t>
+      </w:r>
+      <w:r>
+        <w:br/>
+        <w:t xml:space="preserve">                chessBoard.addPiece(new Blocade("blockade", 10, 2));</w:t>
+      </w:r>
+      <w:r>
+        <w:br/>
+        <w:t xml:space="preserve">                chessBoard.addPiece(new Blocade("blockade", 11, 2));</w:t>
+      </w:r>
+      <w:r>
+        <w:br/>
+        <w:t xml:space="preserve">                chessBoard.addPiece(new Blocade("blockade", 12, 2));</w:t>
+      </w:r>
+      <w:r>
+        <w:br/>
+        <w:t xml:space="preserve">                chessBoard.addPiece(new Blocade("blockade", 13, 2));</w:t>
+      </w:r>
+      <w:r>
+        <w:br/>
+      </w:r>
+      <w:r>
+        <w:br/>
+        <w:t>// řádek 3</w:t>
+      </w:r>
+      <w:r>
+        <w:br/>
+        <w:t xml:space="preserve">                chessBoard.addPiece(new Blocade("blockade", 6, 3));</w:t>
+      </w:r>
+      <w:r>
+        <w:br/>
+        <w:t xml:space="preserve">                chessBoard.addPiece(new Blocade("blockade", 7, 3));</w:t>
+      </w:r>
+      <w:r>
+        <w:br/>
+      </w:r>
+      <w:r>
+        <w:br/>
+      </w:r>
+      <w:r>
+        <w:lastRenderedPageBreak/>
+        <w:t>// řádek 4</w:t>
+      </w:r>
+      <w:r>
+        <w:br/>
+        <w:t xml:space="preserve">                chessBoard.addPiece(new Blocade("blockade", 6, 4));</w:t>
+      </w:r>
+      <w:r>
+        <w:br/>
+        <w:t xml:space="preserve">                chessBoard.addPiece(new Blocade("blockade", 7, 4));</w:t>
+      </w:r>
+      <w:r>
+        <w:br/>
+      </w:r>
+      <w:r>
+        <w:br/>
+        <w:t>// řádky 5–8</w:t>
+      </w:r>
+      <w:r>
+        <w:br/>
+        <w:t xml:space="preserve">                for (int y = 5; y &lt;= 8; y++) {</w:t>
+      </w:r>
+      <w:r>
+        <w:br/>
+        <w:t xml:space="preserve">                    chessBoard.addPiece(new Blocade("blockade", 6, y));</w:t>
+      </w:r>
+      <w:r>
+        <w:br/>
+        <w:t xml:space="preserve">                    chessBoard.addPiece(new Blocade("blockade", 7, y));</w:t>
+      </w:r>
+      <w:r>
+        <w:br/>
+        <w:t xml:space="preserve">                }</w:t>
+      </w:r>
+      <w:r>
+        <w:br/>
+      </w:r>
+      <w:r>
+        <w:br/>
+        <w:t>// řádek 9</w:t>
+      </w:r>
+      <w:r>
+        <w:br/>
+        <w:t xml:space="preserve">                chessBoard.addPiece(new Blocade("blockade", 6, 9));</w:t>
+      </w:r>
+      <w:r>
+        <w:br/>
+        <w:t xml:space="preserve">                chessBoard.addPiece(new Blocade("blockade", 7, 9));</w:t>
+      </w:r>
+      <w:r>
+        <w:br/>
+      </w:r>
+      <w:r>
+        <w:br/>
+        <w:t>// řádek 10</w:t>
+      </w:r>
+      <w:r>
+        <w:br/>
+        <w:t xml:space="preserve">                chessBoard.addPiece(new Blocade("blockade", 6, 10));</w:t>
+      </w:r>
+      <w:r>
+        <w:br/>
+        <w:t xml:space="preserve">                chessBoard.addPiece(new Blocade("blockade", 7, 10));</w:t>
+      </w:r>
+      <w:r>
+        <w:br/>
+      </w:r>
+      <w:r>
+        <w:br/>
+        <w:t>// řádek 11</w:t>
+      </w:r>
+      <w:r>
+        <w:br/>
+        <w:t xml:space="preserve">                chessBoard.addPiece(new Blocade("blockade", 0, 11));</w:t>
+      </w:r>
+      <w:r>
+        <w:br/>
+        <w:t xml:space="preserve">                chessBoard.addPiece(new Blocade("blockade", 1, 11));</w:t>
+      </w:r>
+      <w:r>
+        <w:br/>
+        <w:t xml:space="preserve">                chessBoard.addPiece(new Blocade("blockade", 2, 11));</w:t>
+      </w:r>
+      <w:r>
+        <w:br/>
+        <w:t xml:space="preserve">                chessBoard.addPiece(new Blocade("blockade", 3, 11));</w:t>
+      </w:r>
+      <w:r>
+        <w:br/>
+        <w:t xml:space="preserve">                chessBoard.addPiece(new Blocade("blockade", 4, 11));</w:t>
+      </w:r>
+      <w:r>
+        <w:br/>
+        <w:t xml:space="preserve">                chessBoard.addPiece(new Blocade("blockade", 9, 11));</w:t>
+      </w:r>
+      <w:r>
+        <w:br/>
+        <w:t xml:space="preserve">                chessBoard.addPiece(new Blocade("blockade", 10, 11));</w:t>
+      </w:r>
+      <w:r>
+        <w:br/>
+        <w:t xml:space="preserve">                chessBoard.addPiece(new Blocade("blockade", 11, 11));</w:t>
+      </w:r>
+      <w:r>
+        <w:br/>
+        <w:t xml:space="preserve">                chessBoard.addPiece(new Blocade("blockade", 12, 11));</w:t>
+      </w:r>
+      <w:r>
+        <w:br/>
+        <w:t xml:space="preserve">                chessBoard.addPiece(new Blocade("blockade", 13, 11));</w:t>
+      </w:r>
+      <w:r>
+        <w:br/>
+      </w:r>
+      <w:r>
+        <w:br/>
+        <w:t>// řádek 12</w:t>
+      </w:r>
+      <w:r>
+        <w:br/>
+        <w:t xml:space="preserve">                chessBoard.addPiece(new Blocade("blockade", 0, 12));</w:t>
+      </w:r>
+      <w:r>
+        <w:br/>
+        <w:t xml:space="preserve">                chessBoard.addPiece(new Blocade("blockade", 1, 12));</w:t>
+      </w:r>
+      <w:r>
+        <w:br/>
+        <w:t xml:space="preserve">                chessBoard.addPiece(new Blocade("blockade", 2, 12));</w:t>
+      </w:r>
+      <w:r>
+        <w:br/>
+        <w:t xml:space="preserve">                chessBoard.addPiece(new Blocade("blockade", 4, 12));</w:t>
+      </w:r>
+      <w:r>
+        <w:br/>
+        <w:t xml:space="preserve">                chessBoard.addPiece(new Blocade("blockade", 5, 12));</w:t>
+      </w:r>
+      <w:r>
+        <w:br/>
+        <w:t xml:space="preserve">                chessBoard.addPiece(new Blocade("blockade", 8, 12));</w:t>
+      </w:r>
+      <w:r>
+        <w:br/>
+        <w:t xml:space="preserve">                chessBoard.addPiece(new Blocade("blockade", 9, 12));</w:t>
+      </w:r>
+      <w:r>
+        <w:br/>
+        <w:t xml:space="preserve">                chessBoard.addPiece(new Blocade("blockade", 11, 12));</w:t>
+      </w:r>
+      <w:r>
+        <w:br/>
+        <w:t xml:space="preserve">                chessBoard.addPiece(new Blocade("blockade", 12, 12));</w:t>
+      </w:r>
+      <w:r>
+        <w:br/>
+        <w:t xml:space="preserve">                chessBoard.addPiece(new Blocade("blockade", 13, 12));</w:t>
+      </w:r>
+      <w:r>
+        <w:br/>
+      </w:r>
+      <w:r>
+        <w:lastRenderedPageBreak/>
+        <w:br/>
+        <w:t>// řádek 13</w:t>
+      </w:r>
+      <w:r>
+        <w:br/>
+        <w:t xml:space="preserve">                chessBoard.addPiece(new Blocade("blockade", 0, 13));</w:t>
+      </w:r>
+      <w:r>
+        <w:br/>
+        <w:t xml:space="preserve">                chessBoard.addPiece(new Blocade("blockade", 1, 13));</w:t>
+      </w:r>
+      <w:r>
+        <w:br/>
+        <w:t xml:space="preserve">                chessBoard.addPiece(new Blocade("blockade", 2, 13));</w:t>
+      </w:r>
+      <w:r>
+        <w:br/>
+        <w:t xml:space="preserve">                chessBoard.addPiece(new Blocade("blockade", 3, 13));</w:t>
+      </w:r>
+      <w:r>
+        <w:br/>
+        <w:t xml:space="preserve">                chessBoard.addPiece(new Blocade("blockade", 5, 13));</w:t>
+      </w:r>
+      <w:r>
+        <w:br/>
+        <w:t xml:space="preserve">                chessBoard.addPiece(new Blocade("blockade", 6, 13));</w:t>
+      </w:r>
+      <w:r>
+        <w:br/>
+        <w:t xml:space="preserve">                chessBoard.addPiece(new Blocade("blockade", 7, 13));</w:t>
+      </w:r>
+      <w:r>
+        <w:br/>
+        <w:t xml:space="preserve">                chessBoard.addPiece(new Blocade("blockade", 8, 13));</w:t>
+      </w:r>
+      <w:r>
+        <w:br/>
+        <w:t xml:space="preserve">                chessBoard.addPiece(new Blocade("blockade", 10, 13));</w:t>
+      </w:r>
+      <w:r>
+        <w:br/>
+        <w:t xml:space="preserve">                chessBoard.addPiece(new Blocade("blockade", 11, 13));</w:t>
+      </w:r>
+      <w:r>
+        <w:br/>
+        <w:t xml:space="preserve">                chessBoard.addPiece(new Blocade("blockade", 12, 13));</w:t>
+      </w:r>
+      <w:r>
+        <w:br/>
+        <w:t xml:space="preserve">                chessBoard.addPiece(new Blocade("blockade", 13, 13));</w:t>
+      </w:r>
+    </w:p>
+    <w:p/>
+    <w:p>
+      <w:pPr>
+        <w:pStyle w:val="Nadpis3"/>
+      </w:pPr>
+      <w:bookmarkStart w:id="9" w:name="_Toc241425320"/>
+      <w:r>
+        <w:t>Level 4</w:t>
+      </w:r>
+      <w:bookmarkEnd w:id="9"/>
+      <w:r>
+        <w:t xml:space="preserve"> </w:t>
+      </w:r>
+    </w:p>
+    <w:p>
+      <w:r>
+        <w:br/>
+        <w:t>// inicializace hráčů</w:t>
+      </w:r>
+      <w:r>
+        <w:br/>
+        <w:t xml:space="preserve">                Player player1 = new Player("Bílý", Colour.</w:t>
+      </w:r>
+      <w:r>
+        <w:rPr>
+          <w:i/>
+          <w:iCs/>
+        </w:rPr>
+        <w:t>White</w:t>
+      </w:r>
+      <w:r>
+        <w:t>, 600);</w:t>
+      </w:r>
+      <w:r>
+        <w:br/>
+        <w:t xml:space="preserve">                Player player2 = new Player("Černý", Colour.</w:t>
+      </w:r>
+      <w:r>
+        <w:rPr>
+          <w:i/>
+          <w:iCs/>
+        </w:rPr>
+        <w:t>Black</w:t>
+      </w:r>
+      <w:r>
+        <w:t>, 600);</w:t>
+      </w:r>
+      <w:r>
+        <w:br/>
+      </w:r>
+      <w:r>
+        <w:br/>
+        <w:t>// inicializace šachovnice</w:t>
+      </w:r>
+      <w:r>
+        <w:br/>
+      </w:r>
+      <w:r>
+        <w:br/>
+        <w:t xml:space="preserve">                ChessBoard chessBoard = new ChessBoard(8,10 );</w:t>
+      </w:r>
+      <w:r>
+        <w:br/>
+        <w:t xml:space="preserve">                chessBoard.addPlayer(player1);</w:t>
+      </w:r>
+      <w:r>
+        <w:br/>
+        <w:t xml:space="preserve">                chessBoard.addPlayer(player2);</w:t>
+      </w:r>
+      <w:r>
+        <w:br/>
+      </w:r>
+      <w:r>
+        <w:br/>
+        <w:t xml:space="preserve">                for (int j= 0;j&lt;10;j++){for (int i= 0;i&lt;8;i++){ chessBoard.addWaterSquares(i,j);}}</w:t>
+      </w:r>
+      <w:r>
+        <w:br/>
+      </w:r>
+      <w:r>
+        <w:br/>
+      </w:r>
+      <w:r>
+        <w:br/>
+        <w:t xml:space="preserve">                for (int i = 0; i &lt; 8; i++) {</w:t>
+      </w:r>
+      <w:r>
+        <w:br/>
+        <w:t xml:space="preserve">                    chessBoard.addPromotionSquares(i, 0, Colour.</w:t>
+      </w:r>
+      <w:r>
+        <w:rPr>
+          <w:i/>
+          <w:iCs/>
+        </w:rPr>
+        <w:t>White</w:t>
+      </w:r>
+      <w:r>
+        <w:t>);</w:t>
+      </w:r>
+      <w:r>
+        <w:br/>
+        <w:t xml:space="preserve">                    chessBoard.addPromotionSquares(i, 1, Colour.</w:t>
+      </w:r>
+      <w:r>
+        <w:rPr>
+          <w:i/>
+          <w:iCs/>
+        </w:rPr>
+        <w:t>White</w:t>
+      </w:r>
+      <w:r>
+        <w:t>);</w:t>
+      </w:r>
+      <w:r>
+        <w:br/>
+      </w:r>
+      <w:r>
+        <w:br/>
+        <w:t xml:space="preserve">                    chessBoard.addPromotionSquares(i, 8, Colour.</w:t>
+      </w:r>
+      <w:r>
+        <w:rPr>
+          <w:i/>
+          <w:iCs/>
+        </w:rPr>
+        <w:t>Black</w:t>
+      </w:r>
+      <w:r>
+        <w:t>);</w:t>
+      </w:r>
+      <w:r>
+        <w:br/>
+        <w:t xml:space="preserve">                    chessBoard.addPromotionSquares(i, 9, Colour.</w:t>
+      </w:r>
+      <w:r>
+        <w:rPr>
+          <w:i/>
+          <w:iCs/>
+        </w:rPr>
+        <w:t>Black</w:t>
+      </w:r>
+      <w:r>
+        <w:t>);</w:t>
+      </w:r>
+      <w:r>
+        <w:br/>
+      </w:r>
+      <w:r>
+        <w:br/>
+        <w:t xml:space="preserve">                }</w:t>
+      </w:r>
+      <w:r>
+        <w:br/>
+      </w:r>
+      <w:r>
+        <w:br/>
+      </w:r>
+      <w:r>
+        <w:br/>
+      </w:r>
+      <w:r>
+        <w:lastRenderedPageBreak/>
+        <w:t>// inicializace figur</w:t>
+      </w:r>
+      <w:r>
+        <w:br/>
+        <w:t xml:space="preserve">                //white</w:t>
+      </w:r>
+      <w:r>
+        <w:br/>
+        <w:t xml:space="preserve">                chessBoard.addPiece(new King("piece",1,8,Colour.</w:t>
+      </w:r>
+      <w:r>
+        <w:rPr>
+          <w:i/>
+          <w:iCs/>
+        </w:rPr>
+        <w:t>White</w:t>
+      </w:r>
+      <w:r>
+        <w:t>,0));</w:t>
+      </w:r>
+      <w:r>
+        <w:br/>
+        <w:t xml:space="preserve">                chessBoard.addPiece(new ShipCarrier("piece",1,7,Colour.</w:t>
+      </w:r>
+      <w:r>
+        <w:rPr>
+          <w:i/>
+          <w:iCs/>
+        </w:rPr>
+        <w:t>White</w:t>
+      </w:r>
+      <w:r>
+        <w:t>,0));</w:t>
+      </w:r>
+      <w:r>
+        <w:br/>
+        <w:t xml:space="preserve">                chessBoard.addPiece(new Helicopter("Piece",0,7,Colour.</w:t>
+      </w:r>
+      <w:r>
+        <w:rPr>
+          <w:i/>
+          <w:iCs/>
+        </w:rPr>
+        <w:t>White</w:t>
+      </w:r>
+      <w:r>
+        <w:t>));</w:t>
+      </w:r>
+      <w:r>
+        <w:br/>
+      </w:r>
+      <w:r>
+        <w:br/>
+        <w:t xml:space="preserve">                chessBoard.addPiece(new Bishop("Piece",2,9,Colour.</w:t>
+      </w:r>
+      <w:r>
+        <w:rPr>
+          <w:i/>
+          <w:iCs/>
+        </w:rPr>
+        <w:t>White</w:t>
+      </w:r>
+      <w:r>
+        <w:t>));</w:t>
+      </w:r>
+      <w:r>
+        <w:br/>
+        <w:t xml:space="preserve">                chessBoard.addPiece(new Torpedo("Piece",2,7,Colour.</w:t>
+      </w:r>
+      <w:r>
+        <w:rPr>
+          <w:i/>
+          <w:iCs/>
+        </w:rPr>
+        <w:t>White</w:t>
+      </w:r>
+      <w:r>
+        <w:t>,0));</w:t>
+      </w:r>
+      <w:r>
+        <w:br/>
+      </w:r>
+      <w:r>
+        <w:br/>
+        <w:t xml:space="preserve">                chessBoard.addPiece(new Pawn("Piece",0,6,Colour.</w:t>
+      </w:r>
+      <w:r>
+        <w:rPr>
+          <w:i/>
+          <w:iCs/>
+        </w:rPr>
+        <w:t>White</w:t>
+      </w:r>
+      <w:r>
+        <w:t>,0));</w:t>
+      </w:r>
+      <w:r>
+        <w:br/>
+        <w:t xml:space="preserve">                chessBoard.addPiece(new Pawn("Piece",1,6,Colour.</w:t>
+      </w:r>
+      <w:r>
+        <w:rPr>
+          <w:i/>
+          <w:iCs/>
+        </w:rPr>
+        <w:t>White</w:t>
+      </w:r>
+      <w:r>
+        <w:t>,0));</w:t>
+      </w:r>
+      <w:r>
+        <w:br/>
+        <w:t xml:space="preserve">                chessBoard.addPiece(new Pawn("Piece",2,6,Colour.</w:t>
+      </w:r>
+      <w:r>
+        <w:rPr>
+          <w:i/>
+          <w:iCs/>
+        </w:rPr>
+        <w:t>White</w:t>
+      </w:r>
+      <w:r>
+        <w:t>,0));</w:t>
+      </w:r>
+      <w:r>
+        <w:br/>
+        <w:t xml:space="preserve">                chessBoard.addPiece(new Pawn("Piece",1,5,Colour.</w:t>
+      </w:r>
+      <w:r>
+        <w:rPr>
+          <w:i/>
+          <w:iCs/>
+        </w:rPr>
+        <w:t>White</w:t>
+      </w:r>
+      <w:r>
+        <w:t>,0));</w:t>
+      </w:r>
+      <w:r>
+        <w:br/>
+      </w:r>
+      <w:r>
+        <w:br/>
+        <w:t xml:space="preserve">                chessBoard.addPiece(new ArciBishop("Piece",0,8,Colour.</w:t>
+      </w:r>
+      <w:r>
+        <w:rPr>
+          <w:i/>
+          <w:iCs/>
+        </w:rPr>
+        <w:t>White</w:t>
+      </w:r>
+      <w:r>
+        <w:t>));</w:t>
+      </w:r>
+      <w:r>
+        <w:br/>
+        <w:t xml:space="preserve">                chessBoard.addPiece(new HexaRook("Piece",0,9,Colour.</w:t>
+      </w:r>
+      <w:r>
+        <w:rPr>
+          <w:i/>
+          <w:iCs/>
+        </w:rPr>
+        <w:t>White</w:t>
+      </w:r>
+      <w:r>
+        <w:t>));</w:t>
+      </w:r>
+      <w:r>
+        <w:br/>
+      </w:r>
+      <w:r>
+        <w:br/>
+        <w:t xml:space="preserve">                chessBoard.addPiece(new Airplane("Piece",1,9,Colour.</w:t>
+      </w:r>
+      <w:r>
+        <w:rPr>
+          <w:i/>
+          <w:iCs/>
+        </w:rPr>
+        <w:t>White</w:t>
+      </w:r>
+      <w:r>
+        <w:t>,0));</w:t>
+      </w:r>
+      <w:r>
+        <w:br/>
+        <w:t xml:space="preserve">                chessBoard.addPiece(new Airplane("Piece",2,8,Colour.</w:t>
+      </w:r>
+      <w:r>
+        <w:rPr>
+          <w:i/>
+          <w:iCs/>
+        </w:rPr>
+        <w:t>White</w:t>
+      </w:r>
+      <w:r>
+        <w:t>,0));</w:t>
+      </w:r>
+      <w:r>
+        <w:br/>
+      </w:r>
+      <w:r>
+        <w:br/>
+        <w:t xml:space="preserve">                chessBoard.addPiece(new RaftCarrier("Piece",6,9,Colour.</w:t>
+      </w:r>
+      <w:r>
+        <w:rPr>
+          <w:i/>
+          <w:iCs/>
+        </w:rPr>
+        <w:t>White</w:t>
+      </w:r>
+      <w:r>
+        <w:t>,0));</w:t>
+      </w:r>
+      <w:r>
+        <w:br/>
+        <w:t xml:space="preserve">                chessBoard.addPiece(new Bishop("Piece",6,8,Colour.</w:t>
+      </w:r>
+      <w:r>
+        <w:rPr>
+          <w:i/>
+          <w:iCs/>
+        </w:rPr>
+        <w:t>White</w:t>
+      </w:r>
+      <w:r>
+        <w:t>));</w:t>
+      </w:r>
+      <w:r>
+        <w:br/>
+        <w:t>// black</w:t>
+      </w:r>
+      <w:r>
+        <w:br/>
+        <w:t xml:space="preserve">                chessBoard.addPiece(new King("piece",6,1,Colour.</w:t>
+      </w:r>
+      <w:r>
+        <w:rPr>
+          <w:i/>
+          <w:iCs/>
+        </w:rPr>
+        <w:t>Black</w:t>
+      </w:r>
+      <w:r>
+        <w:t>,2));</w:t>
+      </w:r>
+      <w:r>
+        <w:br/>
+        <w:t xml:space="preserve">                chessBoard.addPiece(new ShipCarrier("piece",6,2,Colour.</w:t>
+      </w:r>
+      <w:r>
+        <w:rPr>
+          <w:i/>
+          <w:iCs/>
+        </w:rPr>
+        <w:t>Black</w:t>
+      </w:r>
+      <w:r>
+        <w:t>,2));</w:t>
+      </w:r>
+      <w:r>
+        <w:br/>
+        <w:t xml:space="preserve">                chessBoard.addPiece(new Helicopter("Piece",7,2,Colour.</w:t>
+      </w:r>
+      <w:r>
+        <w:rPr>
+          <w:i/>
+          <w:iCs/>
+        </w:rPr>
+        <w:t>Black</w:t>
+      </w:r>
+      <w:r>
+        <w:t>));</w:t>
+      </w:r>
+      <w:r>
+        <w:br/>
+      </w:r>
+      <w:r>
+        <w:br/>
+        <w:t xml:space="preserve">                chessBoard.addPiece(new Bishop("Piece",5,0,Colour.</w:t>
+      </w:r>
+      <w:r>
+        <w:rPr>
+          <w:i/>
+          <w:iCs/>
+        </w:rPr>
+        <w:t>Black</w:t>
+      </w:r>
+      <w:r>
+        <w:t>));</w:t>
+      </w:r>
+      <w:r>
+        <w:br/>
+        <w:t xml:space="preserve">                chessBoard.addPiece(new Torpedo("Piece",5,2,Colour.</w:t>
+      </w:r>
+      <w:r>
+        <w:rPr>
+          <w:i/>
+          <w:iCs/>
+        </w:rPr>
+        <w:t>Black</w:t>
+      </w:r>
+      <w:r>
+        <w:t>,2));</w:t>
+      </w:r>
+      <w:r>
+        <w:br/>
+      </w:r>
+      <w:r>
+        <w:br/>
+        <w:t xml:space="preserve">                chessBoard.addPiece(new Pawn("Piece",7,3,Colour.</w:t>
+      </w:r>
+      <w:r>
+        <w:rPr>
+          <w:i/>
+          <w:iCs/>
+        </w:rPr>
+        <w:t>Black</w:t>
+      </w:r>
+      <w:r>
+        <w:t>,2));</w:t>
+      </w:r>
+      <w:r>
+        <w:br/>
+        <w:t xml:space="preserve">                chessBoard.addPiece(new Pawn("Piece",6,3,Colour.</w:t>
+      </w:r>
+      <w:r>
+        <w:rPr>
+          <w:i/>
+          <w:iCs/>
+        </w:rPr>
+        <w:t>Black</w:t>
+      </w:r>
+      <w:r>
+        <w:t>,2));</w:t>
+      </w:r>
+      <w:r>
+        <w:br/>
+        <w:t xml:space="preserve">                chessBoard.addPiece(new Pawn("Piece",5,3,Colour.</w:t>
+      </w:r>
+      <w:r>
+        <w:rPr>
+          <w:i/>
+          <w:iCs/>
+        </w:rPr>
+        <w:t>Black</w:t>
+      </w:r>
+      <w:r>
+        <w:t>,2));</w:t>
+      </w:r>
+      <w:r>
+        <w:br/>
+        <w:t xml:space="preserve">                chessBoard.addPiece(new Pawn("Piece",6,4,Colour.</w:t>
+      </w:r>
+      <w:r>
+        <w:rPr>
+          <w:i/>
+          <w:iCs/>
+        </w:rPr>
+        <w:t>Black</w:t>
+      </w:r>
+      <w:r>
+        <w:t>,2));</w:t>
+      </w:r>
+      <w:r>
+        <w:br/>
+      </w:r>
+      <w:r>
+        <w:br/>
+        <w:t xml:space="preserve">                chessBoard.addPiece(new ArciBishop("Piece",7,1,Colour.</w:t>
+      </w:r>
+      <w:r>
+        <w:rPr>
+          <w:i/>
+          <w:iCs/>
+        </w:rPr>
+        <w:t>Black</w:t>
+      </w:r>
+      <w:r>
+        <w:t>));</w:t>
+      </w:r>
+      <w:r>
+        <w:br/>
+        <w:t xml:space="preserve">                chessBoard.addPiece(new HexaRook("Piece",7,0,Colour.</w:t>
+      </w:r>
+      <w:r>
+        <w:rPr>
+          <w:i/>
+          <w:iCs/>
+        </w:rPr>
+        <w:t>Black</w:t>
+      </w:r>
+      <w:r>
+        <w:t>));</w:t>
+      </w:r>
+      <w:r>
+        <w:br/>
+      </w:r>
+      <w:r>
+        <w:br/>
+        <w:t xml:space="preserve">                chessBoard.addPiece(new Airplane("Piece",5,1,Colour.</w:t>
+      </w:r>
+      <w:r>
+        <w:rPr>
+          <w:i/>
+          <w:iCs/>
+        </w:rPr>
+        <w:t>Black</w:t>
+      </w:r>
+      <w:r>
+        <w:t>,2));</w:t>
+      </w:r>
+      <w:r>
+        <w:br/>
+        <w:t xml:space="preserve">                chessBoard.addPiece(new Airplane("Piece",6,0,Colour.</w:t>
+      </w:r>
+      <w:r>
+        <w:rPr>
+          <w:i/>
+          <w:iCs/>
+        </w:rPr>
+        <w:t>Black</w:t>
+      </w:r>
+      <w:r>
+        <w:t>,2));</w:t>
+      </w:r>
+      <w:r>
+        <w:br/>
+      </w:r>
+      <w:r>
+        <w:br/>
+      </w:r>
+      <w:r>
+        <w:lastRenderedPageBreak/>
+        <w:t xml:space="preserve">                chessBoard.addPiece(new RaftCarrier("Piece",1,0,Colour.</w:t>
+      </w:r>
+      <w:r>
+        <w:rPr>
+          <w:i/>
+          <w:iCs/>
+        </w:rPr>
+        <w:t>Black</w:t>
+      </w:r>
+      <w:r>
+        <w:t>,2));</w:t>
+      </w:r>
+      <w:r>
+        <w:br/>
+        <w:t xml:space="preserve">                chessBoard.addPiece(new Bishop("Piece",1,1,Colour.</w:t>
+      </w:r>
+      <w:r>
+        <w:rPr>
+          <w:i/>
+          <w:iCs/>
+        </w:rPr>
+        <w:t>Black</w:t>
+      </w:r>
+      <w:r>
+        <w:t>));</w:t>
+      </w:r>
+      <w:r>
+        <w:br/>
+        <w:t>//end inicializace figur</w:t>
+      </w:r>
+    </w:p>
+    <w:p>
+      <w:pPr>
+        <w:pStyle w:val="Nadpis3"/>
+      </w:pPr>
+      <w:r>
+        <w:tab/>
+      </w:r>
+      <w:bookmarkStart w:id="10" w:name="_Toc241425321"/>
+      <w:r>
+        <w:t>Level 5</w:t>
+      </w:r>
+      <w:bookmarkEnd w:id="10"/>
+    </w:p>
+    <w:p>
+      <w:r>
+        <w:t>// inicializace hráčů</w:t>
+      </w:r>
+      <w:r>
+        <w:br/>
+        <w:t xml:space="preserve">                Player player1 = new Player("Bílý", Colour.</w:t>
+      </w:r>
+      <w:r>
+        <w:rPr>
+          <w:i/>
+          <w:iCs/>
+        </w:rPr>
+        <w:t>White</w:t>
+      </w:r>
+      <w:r>
+        <w:t>, 600);</w:t>
+      </w:r>
+      <w:r>
+        <w:br/>
+        <w:t xml:space="preserve">                Player player2 = new Player("Černý", Colour.</w:t>
+      </w:r>
+      <w:r>
+        <w:rPr>
+          <w:i/>
+          <w:iCs/>
+        </w:rPr>
+        <w:t>Black</w:t>
+      </w:r>
+      <w:r>
+        <w:t>, 600);</w:t>
+      </w:r>
+      <w:r>
+        <w:br/>
+      </w:r>
+      <w:r>
+        <w:br/>
+        <w:t>// inicializace šachovnice</w:t>
+      </w:r>
+      <w:r>
+        <w:br/>
+      </w:r>
+      <w:r>
+        <w:br/>
+        <w:t xml:space="preserve">                ChessBoard chessBoard = new ChessBoard(9,12 );</w:t>
+      </w:r>
+      <w:r>
+        <w:br/>
+        <w:t xml:space="preserve">                chessBoard.addPlayer(player1);</w:t>
+      </w:r>
+      <w:r>
+        <w:br/>
+        <w:t xml:space="preserve">                chessBoard.addPlayer(player2);</w:t>
+      </w:r>
+      <w:r>
+        <w:br/>
+      </w:r>
+      <w:r>
+        <w:br/>
+        <w:t xml:space="preserve">                for (int j= 0;j&lt;12;j++){for (int i= 0;i&lt;9;i++){ chessBoard.addWaterSquares(i,j);}}</w:t>
+      </w:r>
+      <w:r>
+        <w:br/>
+      </w:r>
+      <w:r>
+        <w:br/>
+      </w:r>
+      <w:r>
+        <w:br/>
+        <w:t xml:space="preserve">                for (int i = 0; i &lt; 8; i++) {</w:t>
+      </w:r>
+      <w:r>
+        <w:br/>
+        <w:t xml:space="preserve">                    chessBoard.addPromotionSquares(i, 0, Colour.</w:t>
+      </w:r>
+      <w:r>
+        <w:rPr>
+          <w:i/>
+          <w:iCs/>
+        </w:rPr>
+        <w:t>White</w:t>
+      </w:r>
+      <w:r>
+        <w:t>);</w:t>
+      </w:r>
+      <w:r>
+        <w:br/>
+        <w:t xml:space="preserve">                    //  / chessBoard.addPromotionSquares(i, 1, Colour.White);</w:t>
+      </w:r>
+      <w:r>
+        <w:br/>
+      </w:r>
+      <w:r>
+        <w:br/>
+        <w:t xml:space="preserve">                    chessBoard.addPromotionSquares(i, 10, Colour.</w:t>
+      </w:r>
+      <w:r>
+        <w:rPr>
+          <w:i/>
+          <w:iCs/>
+        </w:rPr>
+        <w:t>Black</w:t>
+      </w:r>
+      <w:r>
+        <w:t>);</w:t>
+      </w:r>
+      <w:r>
+        <w:br/>
+        <w:t xml:space="preserve">                    chessBoard.addPromotionSquares(i, 11, Colour.</w:t>
+      </w:r>
+      <w:r>
+        <w:rPr>
+          <w:i/>
+          <w:iCs/>
+        </w:rPr>
+        <w:t>Black</w:t>
+      </w:r>
+      <w:r>
+        <w:t>);</w:t>
+      </w:r>
+      <w:r>
+        <w:br/>
+      </w:r>
+      <w:r>
+        <w:br/>
+        <w:t xml:space="preserve">                }</w:t>
+      </w:r>
+      <w:r>
+        <w:br/>
+      </w:r>
+      <w:r>
+        <w:br/>
+      </w:r>
+      <w:r>
+        <w:br/>
+        <w:t>// inicializace figur</w:t>
+      </w:r>
+      <w:r>
+        <w:br/>
+      </w:r>
+      <w:r>
+        <w:br/>
+        <w:t xml:space="preserve">                //black</w:t>
+      </w:r>
+      <w:r>
+        <w:br/>
+        <w:t xml:space="preserve">                chessBoard.addPiece(new King("Piece",4,1,Colour.</w:t>
+      </w:r>
+      <w:r>
+        <w:rPr>
+          <w:i/>
+          <w:iCs/>
+        </w:rPr>
+        <w:t>Black</w:t>
+      </w:r>
+      <w:r>
+        <w:t>,2));</w:t>
+      </w:r>
+      <w:r>
+        <w:br/>
+        <w:t xml:space="preserve">                chessBoard.addPiece(new ShipCarrier("Piece",4,2,Colour.</w:t>
+      </w:r>
+      <w:r>
+        <w:rPr>
+          <w:i/>
+          <w:iCs/>
+        </w:rPr>
+        <w:t>Black</w:t>
+      </w:r>
+      <w:r>
+        <w:t>,2));</w:t>
+      </w:r>
+      <w:r>
+        <w:br/>
+      </w:r>
+      <w:r>
+        <w:br/>
+        <w:t xml:space="preserve">                chessBoard.addPiece(new Guardian("Piece",3,1,Colour.</w:t>
+      </w:r>
+      <w:r>
+        <w:rPr>
+          <w:i/>
+          <w:iCs/>
+        </w:rPr>
+        <w:t>Black</w:t>
+      </w:r>
+      <w:r>
+        <w:t>));</w:t>
+      </w:r>
+      <w:r>
+        <w:br/>
+        <w:t xml:space="preserve">                chessBoard.addPiece(new Guardian("Piece",5,1,Colour.</w:t>
+      </w:r>
+      <w:r>
+        <w:rPr>
+          <w:i/>
+          <w:iCs/>
+        </w:rPr>
+        <w:t>Black</w:t>
+      </w:r>
+      <w:r>
+        <w:t>));</w:t>
+      </w:r>
+      <w:r>
+        <w:br/>
+      </w:r>
+      <w:r>
+        <w:br/>
+        <w:t xml:space="preserve">                chessBoard.addPiece(new Pawn("Piece",3,2,Colour.</w:t>
+      </w:r>
+      <w:r>
+        <w:rPr>
+          <w:i/>
+          <w:iCs/>
+        </w:rPr>
+        <w:t>Black</w:t>
+      </w:r>
+      <w:r>
+        <w:t>,2));</w:t>
+      </w:r>
+      <w:r>
+        <w:br/>
+        <w:t xml:space="preserve">                chessBoard.addPiece(new Pawn("Piece",5,2,Colour.</w:t>
+      </w:r>
+      <w:r>
+        <w:rPr>
+          <w:i/>
+          <w:iCs/>
+        </w:rPr>
+        <w:t>Black</w:t>
+      </w:r>
+      <w:r>
+        <w:t>,2));</w:t>
+      </w:r>
+      <w:r>
+        <w:br/>
+      </w:r>
+      <w:r>
+        <w:br/>
+      </w:r>
+      <w:r>
+        <w:br/>
+      </w:r>
+      <w:r>
+        <w:lastRenderedPageBreak/>
+        <w:t xml:space="preserve">                chessBoard.addPiece(new Pawn("Piece",3,3,Colour.</w:t>
+      </w:r>
+      <w:r>
+        <w:rPr>
+          <w:i/>
+          <w:iCs/>
+        </w:rPr>
+        <w:t>Black</w:t>
+      </w:r>
+      <w:r>
+        <w:t>,2));</w:t>
+      </w:r>
+      <w:r>
+        <w:br/>
+        <w:t xml:space="preserve">                chessBoard.addPiece(new Pawn("Piece",4,3,Colour.</w:t>
+      </w:r>
+      <w:r>
+        <w:rPr>
+          <w:i/>
+          <w:iCs/>
+        </w:rPr>
+        <w:t>Black</w:t>
+      </w:r>
+      <w:r>
+        <w:t>,2));</w:t>
+      </w:r>
+      <w:r>
+        <w:br/>
+        <w:t xml:space="preserve">                chessBoard.addPiece(new Pawn("Piece",5,3,Colour.</w:t>
+      </w:r>
+      <w:r>
+        <w:rPr>
+          <w:i/>
+          <w:iCs/>
+        </w:rPr>
+        <w:t>Black</w:t>
+      </w:r>
+      <w:r>
+        <w:t>,2));</w:t>
+      </w:r>
+      <w:r>
+        <w:br/>
+      </w:r>
+      <w:r>
+        <w:br/>
+        <w:t xml:space="preserve">                chessBoard.addPiece(new Pawn("Piece",4,4,Colour.</w:t>
+      </w:r>
+      <w:r>
+        <w:rPr>
+          <w:i/>
+          <w:iCs/>
+        </w:rPr>
+        <w:t>Black</w:t>
+      </w:r>
+      <w:r>
+        <w:t>,2));</w:t>
+      </w:r>
+      <w:r>
+        <w:br/>
+      </w:r>
+      <w:r>
+        <w:br/>
+      </w:r>
+      <w:r>
+        <w:br/>
+        <w:t xml:space="preserve">                //white</w:t>
+      </w:r>
+      <w:r>
+        <w:br/>
+        <w:t xml:space="preserve">                chessBoard.addPiece(new King("Piece",4,11,Colour.</w:t>
+      </w:r>
+      <w:r>
+        <w:rPr>
+          <w:i/>
+          <w:iCs/>
+        </w:rPr>
+        <w:t>White</w:t>
+      </w:r>
+      <w:r>
+        <w:t>,0));</w:t>
+      </w:r>
+      <w:r>
+        <w:br/>
+        <w:t xml:space="preserve">                chessBoard.addPiece(new Airplane("Piece",1,10,Colour.</w:t>
+      </w:r>
+      <w:r>
+        <w:rPr>
+          <w:i/>
+          <w:iCs/>
+        </w:rPr>
+        <w:t>White</w:t>
+      </w:r>
+      <w:r>
+        <w:t>,0));</w:t>
+      </w:r>
+      <w:r>
+        <w:br/>
+        <w:t xml:space="preserve">                chessBoard.addPiece(new Airplane("Piece",2,10,Colour.</w:t>
+      </w:r>
+      <w:r>
+        <w:rPr>
+          <w:i/>
+          <w:iCs/>
+        </w:rPr>
+        <w:t>White</w:t>
+      </w:r>
+      <w:r>
+        <w:t>,0));</w:t>
+      </w:r>
+      <w:r>
+        <w:br/>
+        <w:t xml:space="preserve">                chessBoard.addPiece(new Helicopter("Piece",3,10,Colour.</w:t>
+      </w:r>
+      <w:r>
+        <w:rPr>
+          <w:i/>
+          <w:iCs/>
+        </w:rPr>
+        <w:t>White</w:t>
+      </w:r>
+      <w:r>
+        <w:t>));</w:t>
+      </w:r>
+      <w:r>
+        <w:br/>
+      </w:r>
+      <w:r>
+        <w:br/>
+        <w:t xml:space="preserve">                chessBoard.addPiece(new Helicopter("Piece",5,10,Colour.</w:t>
+      </w:r>
+      <w:r>
+        <w:rPr>
+          <w:i/>
+          <w:iCs/>
+        </w:rPr>
+        <w:t>White</w:t>
+      </w:r>
+      <w:r>
+        <w:t>));</w:t>
+      </w:r>
+      <w:r>
+        <w:br/>
+        <w:t xml:space="preserve">                chessBoard.addPiece(new Airplane("Piece",6,10,Colour.</w:t>
+      </w:r>
+      <w:r>
+        <w:rPr>
+          <w:i/>
+          <w:iCs/>
+        </w:rPr>
+        <w:t>White</w:t>
+      </w:r>
+      <w:r>
+        <w:t>,0));</w:t>
+      </w:r>
+      <w:r>
+        <w:br/>
+        <w:t xml:space="preserve">                chessBoard.addPiece(new Airplane("Piece",7,10,Colour.</w:t>
+      </w:r>
+      <w:r>
+        <w:rPr>
+          <w:i/>
+          <w:iCs/>
+        </w:rPr>
+        <w:t>White</w:t>
+      </w:r>
+      <w:r>
+        <w:t>,0));</w:t>
+      </w:r>
+      <w:r>
+        <w:br/>
+      </w:r>
+      <w:r>
+        <w:br/>
+        <w:t>//end inicializace figur</w:t>
+      </w:r>
+    </w:p>
+    <w:p/>
     <w:p>
       <w:pPr>
         <w:rPr>
@@ -5811,27 +8295,13 @@
           <w:r>
             <w:fldChar w:fldCharType="separate"/>
           </w:r>
-          <w:hyperlink w:anchor="_Toc241177294" w:history="1">
+          <w:hyperlink w:anchor="_Toc241425311" w:history="1">
             <w:r>
               <w:rPr>
                 <w:rStyle w:val="Hypertextovodkaz"/>
                 <w:noProof/>
               </w:rPr>
-              <w:t>Stan</w:t>
-            </w:r>
-            <w:r>
-              <w:rPr>
-                <w:rStyle w:val="Hypertextovodkaz"/>
-                <w:noProof/>
-              </w:rPr>
-              <w:t>d</w:t>
-            </w:r>
-            <w:r>
-              <w:rPr>
-                <w:rStyle w:val="Hypertextovodkaz"/>
-                <w:noProof/>
-              </w:rPr>
-              <w:t>ard</w:t>
+              <w:t>Standard</w:t>
             </w:r>
             <w:r>
               <w:rPr>
@@ -5852,7 +8322,7 @@
                 <w:noProof/>
                 <w:webHidden/>
               </w:rPr>
-              <w:instrText xml:space="preserve"> PAGEREF _Toc241177294 \h </w:instrText>
+              <w:instrText xml:space="preserve"> PAGEREF _Toc241425311 \h </w:instrText>
             </w:r>
             <w:r>
               <w:rPr>
@@ -5895,7 +8365,7 @@
               <w:lang w:eastAsia="cs-CZ"/>
             </w:rPr>
           </w:pPr>
-          <w:hyperlink w:anchor="_Toc241177295" w:history="1">
+          <w:hyperlink w:anchor="_Toc241425312" w:history="1">
             <w:r>
               <w:rPr>
                 <w:rStyle w:val="Hypertextovodkaz"/>
@@ -5922,7 +8392,7 @@
                 <w:noProof/>
                 <w:webHidden/>
               </w:rPr>
-              <w:instrText xml:space="preserve"> PAGEREF _Toc241177295 \h </w:instrText>
+              <w:instrText xml:space="preserve"> PAGEREF _Toc241425312 \h </w:instrText>
             </w:r>
             <w:r>
               <w:rPr>
@@ -5965,7 +8435,7 @@
               <w:lang w:eastAsia="cs-CZ"/>
             </w:rPr>
           </w:pPr>
-          <w:hyperlink w:anchor="_Toc241177296" w:history="1">
+          <w:hyperlink w:anchor="_Toc241425313" w:history="1">
             <w:r>
               <w:rPr>
                 <w:rStyle w:val="Hypertextovodkaz"/>
@@ -5992,7 +8462,7 @@
                 <w:noProof/>
                 <w:webHidden/>
               </w:rPr>
-              <w:instrText xml:space="preserve"> PAGEREF _Toc241177296 \h </w:instrText>
+              <w:instrText xml:space="preserve"> PAGEREF _Toc241425313 \h </w:instrText>
             </w:r>
             <w:r>
               <w:rPr>
@@ -6035,27 +8505,13 @@
               <w:lang w:eastAsia="cs-CZ"/>
             </w:rPr>
           </w:pPr>
-          <w:hyperlink w:anchor="_Toc241177297" w:history="1">
+          <w:hyperlink w:anchor="_Toc241425314" w:history="1">
             <w:r>
               <w:rPr>
                 <w:rStyle w:val="Hypertextovodkaz"/>
                 <w:noProof/>
               </w:rPr>
-              <w:t>Te</w:t>
-            </w:r>
-            <w:r>
-              <w:rPr>
-                <w:rStyle w:val="Hypertextovodkaz"/>
-                <w:noProof/>
-              </w:rPr>
-              <w:t>s</w:t>
-            </w:r>
-            <w:r>
-              <w:rPr>
-                <w:rStyle w:val="Hypertextovodkaz"/>
-                <w:noProof/>
-              </w:rPr>
-              <w:t>t</w:t>
+              <w:t>Test</w:t>
             </w:r>
             <w:r>
               <w:rPr>
@@ -6076,7 +8532,7 @@
                 <w:noProof/>
                 <w:webHidden/>
               </w:rPr>
-              <w:instrText xml:space="preserve"> PAGEREF _Toc241177297 \h </w:instrText>
+              <w:instrText xml:space="preserve"> PAGEREF _Toc241425314 \h </w:instrText>
             </w:r>
             <w:r>
               <w:rPr>
@@ -6119,7 +8575,7 @@
               <w:lang w:eastAsia="cs-CZ"/>
             </w:rPr>
           </w:pPr>
-          <w:hyperlink w:anchor="_Toc241177298" w:history="1">
+          <w:hyperlink w:anchor="_Toc241425315" w:history="1">
             <w:r>
               <w:rPr>
                 <w:rStyle w:val="Hypertextovodkaz"/>
@@ -6146,7 +8602,7 @@
                 <w:noProof/>
                 <w:webHidden/>
               </w:rPr>
-              <w:instrText xml:space="preserve"> PAGEREF _Toc241177298 \h </w:instrText>
+              <w:instrText xml:space="preserve"> PAGEREF _Toc241425315 \h </w:instrText>
             </w:r>
             <w:r>
               <w:rPr>
@@ -6189,7 +8645,7 @@
               <w:lang w:eastAsia="cs-CZ"/>
             </w:rPr>
           </w:pPr>
-          <w:hyperlink w:anchor="_Toc241177299" w:history="1">
+          <w:hyperlink w:anchor="_Toc241425316" w:history="1">
             <w:r>
               <w:rPr>
                 <w:rStyle w:val="Hypertextovodkaz"/>
@@ -6216,7 +8672,7 @@
                 <w:noProof/>
                 <w:webHidden/>
               </w:rPr>
-              <w:instrText xml:space="preserve"> PAGEREF _Toc241177299 \h </w:instrText>
+              <w:instrText xml:space="preserve"> PAGEREF _Toc241425316 \h </w:instrText>
             </w:r>
             <w:r>
               <w:rPr>
@@ -6259,7 +8715,7 @@
               <w:lang w:eastAsia="cs-CZ"/>
             </w:rPr>
           </w:pPr>
-          <w:hyperlink w:anchor="_Toc241177300" w:history="1">
+          <w:hyperlink w:anchor="_Toc241425317" w:history="1">
             <w:r>
               <w:rPr>
                 <w:rStyle w:val="Hypertextovodkaz"/>
@@ -6286,7 +8742,7 @@
                 <w:noProof/>
                 <w:webHidden/>
               </w:rPr>
-              <w:instrText xml:space="preserve"> PAGEREF _Toc241177300 \h </w:instrText>
+              <w:instrText xml:space="preserve"> PAGEREF _Toc241425317 \h </w:instrText>
             </w:r>
             <w:r>
               <w:rPr>
@@ -6307,6 +8763,288 @@
                 <w:webHidden/>
               </w:rPr>
               <w:t>21</w:t>
+            </w:r>
+            <w:r>
+              <w:rPr>
+                <w:noProof/>
+                <w:webHidden/>
+              </w:rPr>
+              <w:fldChar w:fldCharType="end"/>
+            </w:r>
+          </w:hyperlink>
+        </w:p>
+        <w:p>
+          <w:pPr>
+            <w:pStyle w:val="Obsah3"/>
+            <w:tabs>
+              <w:tab w:val="right" w:leader="dot" w:pos="9062"/>
+            </w:tabs>
+            <w:rPr>
+              <w:rFonts w:eastAsiaTheme="minorEastAsia"/>
+              <w:noProof/>
+              <w:lang w:eastAsia="cs-CZ"/>
+            </w:rPr>
+          </w:pPr>
+          <w:hyperlink w:anchor="_Toc241425318" w:history="1">
+            <w:r>
+              <w:rPr>
+                <w:rStyle w:val="Hypertextovodkaz"/>
+                <w:noProof/>
+                <w:lang w:val="en-GB"/>
+              </w:rPr>
+              <w:t>Level 3</w:t>
+            </w:r>
+            <w:r>
+              <w:rPr>
+                <w:noProof/>
+                <w:webHidden/>
+              </w:rPr>
+              <w:tab/>
+            </w:r>
+            <w:r>
+              <w:rPr>
+                <w:noProof/>
+                <w:webHidden/>
+              </w:rPr>
+              <w:fldChar w:fldCharType="begin"/>
+            </w:r>
+            <w:r>
+              <w:rPr>
+                <w:noProof/>
+                <w:webHidden/>
+              </w:rPr>
+              <w:instrText xml:space="preserve"> PAGEREF _Toc241425318 \h </w:instrText>
+            </w:r>
+            <w:r>
+              <w:rPr>
+                <w:noProof/>
+                <w:webHidden/>
+              </w:rPr>
+            </w:r>
+            <w:r>
+              <w:rPr>
+                <w:noProof/>
+                <w:webHidden/>
+              </w:rPr>
+              <w:fldChar w:fldCharType="separate"/>
+            </w:r>
+            <w:r>
+              <w:rPr>
+                <w:noProof/>
+                <w:webHidden/>
+              </w:rPr>
+              <w:t>22</w:t>
+            </w:r>
+            <w:r>
+              <w:rPr>
+                <w:noProof/>
+                <w:webHidden/>
+              </w:rPr>
+              <w:fldChar w:fldCharType="end"/>
+            </w:r>
+          </w:hyperlink>
+        </w:p>
+        <w:p>
+          <w:pPr>
+            <w:pStyle w:val="Obsah3"/>
+            <w:tabs>
+              <w:tab w:val="right" w:leader="dot" w:pos="9062"/>
+            </w:tabs>
+            <w:rPr>
+              <w:rFonts w:eastAsiaTheme="minorEastAsia"/>
+              <w:noProof/>
+              <w:lang w:eastAsia="cs-CZ"/>
+            </w:rPr>
+          </w:pPr>
+          <w:hyperlink w:anchor="_Toc241425319" w:history="1">
+            <w:r>
+              <w:rPr>
+                <w:rStyle w:val="Hypertextovodkaz"/>
+                <w:noProof/>
+                <w:lang w:val="en-GB"/>
+              </w:rPr>
+              <w:t>Behind the mirror</w:t>
+            </w:r>
+            <w:r>
+              <w:rPr>
+                <w:noProof/>
+                <w:webHidden/>
+              </w:rPr>
+              <w:tab/>
+            </w:r>
+            <w:r>
+              <w:rPr>
+                <w:noProof/>
+                <w:webHidden/>
+              </w:rPr>
+              <w:fldChar w:fldCharType="begin"/>
+            </w:r>
+            <w:r>
+              <w:rPr>
+                <w:noProof/>
+                <w:webHidden/>
+              </w:rPr>
+              <w:instrText xml:space="preserve"> PAGEREF _Toc241425319 \h </w:instrText>
+            </w:r>
+            <w:r>
+              <w:rPr>
+                <w:noProof/>
+                <w:webHidden/>
+              </w:rPr>
+            </w:r>
+            <w:r>
+              <w:rPr>
+                <w:noProof/>
+                <w:webHidden/>
+              </w:rPr>
+              <w:fldChar w:fldCharType="separate"/>
+            </w:r>
+            <w:r>
+              <w:rPr>
+                <w:noProof/>
+                <w:webHidden/>
+              </w:rPr>
+              <w:t>24</w:t>
+            </w:r>
+            <w:r>
+              <w:rPr>
+                <w:noProof/>
+                <w:webHidden/>
+              </w:rPr>
+              <w:fldChar w:fldCharType="end"/>
+            </w:r>
+          </w:hyperlink>
+        </w:p>
+        <w:p>
+          <w:pPr>
+            <w:pStyle w:val="Obsah3"/>
+            <w:tabs>
+              <w:tab w:val="right" w:leader="dot" w:pos="9062"/>
+            </w:tabs>
+            <w:rPr>
+              <w:rFonts w:eastAsiaTheme="minorEastAsia"/>
+              <w:noProof/>
+              <w:lang w:eastAsia="cs-CZ"/>
+            </w:rPr>
+          </w:pPr>
+          <w:hyperlink w:anchor="_Toc241425320" w:history="1">
+            <w:r>
+              <w:rPr>
+                <w:rStyle w:val="Hypertextovodkaz"/>
+                <w:noProof/>
+              </w:rPr>
+              <w:t>Level 4</w:t>
+            </w:r>
+            <w:r>
+              <w:rPr>
+                <w:noProof/>
+                <w:webHidden/>
+              </w:rPr>
+              <w:tab/>
+            </w:r>
+            <w:r>
+              <w:rPr>
+                <w:noProof/>
+                <w:webHidden/>
+              </w:rPr>
+              <w:fldChar w:fldCharType="begin"/>
+            </w:r>
+            <w:r>
+              <w:rPr>
+                <w:noProof/>
+                <w:webHidden/>
+              </w:rPr>
+              <w:instrText xml:space="preserve"> PAGEREF _Toc241425320 \h </w:instrText>
+            </w:r>
+            <w:r>
+              <w:rPr>
+                <w:noProof/>
+                <w:webHidden/>
+              </w:rPr>
+            </w:r>
+            <w:r>
+              <w:rPr>
+                <w:noProof/>
+                <w:webHidden/>
+              </w:rPr>
+              <w:fldChar w:fldCharType="separate"/>
+            </w:r>
+            <w:r>
+              <w:rPr>
+                <w:noProof/>
+                <w:webHidden/>
+              </w:rPr>
+              <w:t>29</w:t>
+            </w:r>
+            <w:r>
+              <w:rPr>
+                <w:noProof/>
+                <w:webHidden/>
+              </w:rPr>
+              <w:fldChar w:fldCharType="end"/>
+            </w:r>
+          </w:hyperlink>
+        </w:p>
+        <w:p>
+          <w:pPr>
+            <w:pStyle w:val="Obsah3"/>
+            <w:tabs>
+              <w:tab w:val="right" w:leader="dot" w:pos="9062"/>
+            </w:tabs>
+            <w:rPr>
+              <w:rFonts w:eastAsiaTheme="minorEastAsia"/>
+              <w:noProof/>
+              <w:lang w:eastAsia="cs-CZ"/>
+            </w:rPr>
+          </w:pPr>
+          <w:hyperlink w:anchor="_Toc241425321" w:history="1">
+            <w:r>
+              <w:rPr>
+                <w:rStyle w:val="Hypertextovodkaz"/>
+                <w:noProof/>
+              </w:rPr>
+              <w:t>Level 5</w:t>
+            </w:r>
+            <w:r>
+              <w:rPr>
+                <w:noProof/>
+                <w:webHidden/>
+              </w:rPr>
+              <w:tab/>
+            </w:r>
+            <w:r>
+              <w:rPr>
+                <w:noProof/>
+                <w:webHidden/>
+              </w:rPr>
+              <w:fldChar w:fldCharType="begin"/>
+            </w:r>
+            <w:r>
+              <w:rPr>
+                <w:noProof/>
+                <w:webHidden/>
+              </w:rPr>
+              <w:instrText xml:space="preserve"> PAGEREF _Toc241425321 \h </w:instrText>
+            </w:r>
+            <w:r>
+              <w:rPr>
+                <w:noProof/>
+                <w:webHidden/>
+              </w:rPr>
+            </w:r>
+            <w:r>
+              <w:rPr>
+                <w:noProof/>
+                <w:webHidden/>
+              </w:rPr>
+              <w:fldChar w:fldCharType="separate"/>
+            </w:r>
+            <w:r>
+              <w:rPr>
+                <w:noProof/>
+                <w:webHidden/>
+              </w:rPr>
+              <w:t>31</w:t>
             </w:r>
             <w:r>
               <w:rPr>

</xml_diff>